<commit_message>
fix consent crafter v2: COI duplication, prompt guidance, integration tests
- Fix COI text duplication in template-v14-final.docx (dual {{IF}} in same
  paragraph replaced with {{= }} inline expressions)
- Update prompt-v3.txt: add guidance for study purpose fields (lead with
  patient-relevant motivation and honest uncertainty), is_investigational
  not mutually exclusive with is_fda_approved_off_label, death disclosure
  required in risks_intro, accrual_ceiling must be NIH-specific
- Update consent-schema.json descriptions for key_info_purpose,
  study_purpose, is_investigational, and risks_intro
- Enable and restructure integration tests: DOCX generation before
  assertions, add COI duplication check, pregnancy/radiation rendering
  check, risks_intro death assertion
</commit_message>
<xml_diff>
--- a/client/templates/nih-cc/template-v14-final.docx
+++ b/client/templates/nih-cc/template-v14-final.docx
@@ -4050,64 +4050,36 @@
         </w:rPr>
       </w:pPr>
       <w:r>
-        <w:t>{{</w:t>
+        <w:t>{{coi_company_name}} is providing {{coi_product_provision}} for this study to NIH without charge{{= coi_through_program ? ` through the ${coi_program_name}` : `` }}. No NIH employee involved in this study receives any payment or other benefits from {{coi_company_name}}{{= coi_through_program ? ` or ${coi_program_name}` : `` }}.</w:t>
       </w:r>
       <w:proofErr w:type="spellStart"/>
-      <w:r>
-        <w:t>coi_company_name</w:t>
-      </w:r>
+      <w:r/>
       <w:proofErr w:type="spellEnd"/>
-      <w:r>
-        <w:t>}} is providing {{</w:t>
-      </w:r>
+      <w:r/>
       <w:proofErr w:type="spellStart"/>
-      <w:r>
-        <w:t>coi_product_provision</w:t>
-      </w:r>
+      <w:r/>
       <w:proofErr w:type="spellEnd"/>
-      <w:r>
-        <w:t xml:space="preserve">}} for this study to NIH without charge{{IF </w:t>
-      </w:r>
+      <w:r/>
       <w:proofErr w:type="spellStart"/>
-      <w:r>
-        <w:t>coi_through_program</w:t>
-      </w:r>
+      <w:r/>
       <w:proofErr w:type="spellEnd"/>
-      <w:r>
-        <w:t>}} through the {{</w:t>
-      </w:r>
+      <w:r/>
       <w:proofErr w:type="spellStart"/>
-      <w:r>
-        <w:t>coi_program_name</w:t>
-      </w:r>
+      <w:r/>
       <w:proofErr w:type="spellEnd"/>
-      <w:r>
-        <w:t>}}{{END-IF}}. No NIH employee involved in this study receives any payment or other benefits from {{</w:t>
-      </w:r>
+      <w:r/>
       <w:proofErr w:type="spellStart"/>
-      <w:r>
-        <w:t>coi_company_name</w:t>
-      </w:r>
+      <w:r/>
       <w:proofErr w:type="spellEnd"/>
-      <w:r>
-        <w:t xml:space="preserve">}}{{IF </w:t>
-      </w:r>
+      <w:r/>
       <w:proofErr w:type="spellStart"/>
-      <w:r>
-        <w:t>coi_through_program</w:t>
-      </w:r>
+      <w:r/>
       <w:proofErr w:type="spellEnd"/>
-      <w:r>
-        <w:t>}} or {{</w:t>
-      </w:r>
+      <w:r/>
       <w:proofErr w:type="spellStart"/>
-      <w:r>
-        <w:t>coi_program_name</w:t>
-      </w:r>
+      <w:r/>
       <w:proofErr w:type="spellEnd"/>
-      <w:r>
-        <w:t>}}{{END-IF}}.</w:t>
-      </w:r>
+      <w:r/>
     </w:p>
     <w:p>
       <w:pPr>

</xml_diff>

<commit_message>
fix LPA protocol injection, upgrade LPA prompts, restructure procedure_risks
</commit_message>
<xml_diff>
--- a/client/templates/nih-cc/template-v14-final.docx
+++ b/client/templates/nih-cc/template-v14-final.docx
@@ -27,53 +27,39 @@
           <w:sz w:val="32"/>
           <w:szCs w:val="24"/>
         </w:rPr>
-        <w:t xml:space="preserve">This document represents a computational draft generated using artificial intelligence.  It is provided as an initial </w:t>
-      </w:r>
-      <w:proofErr w:type="gramStart"/>
-      <w:r>
+        <w:t xml:space="preserve">This document represents a computational draft generated using artificial intelligence.  It is provided as an initial draft and the contents require comprehensive human review, validation, and refinement by qualified research personnel. </w:t>
+      </w:r>
+    </w:p>
+    <w:p>
+      <w:pPr>
+        <w:jc w:val="left"/>
         <w:rPr>
           <w:sz w:val="32"/>
           <w:szCs w:val="24"/>
         </w:rPr>
-        <w:t>draft</w:t>
-      </w:r>
-      <w:proofErr w:type="gramEnd"/>
-      <w:r>
+      </w:pPr>
+    </w:p>
+    <w:p>
+      <w:pPr>
+        <w:jc w:val="left"/>
         <w:rPr>
           <w:sz w:val="32"/>
           <w:szCs w:val="24"/>
         </w:rPr>
-        <w:t xml:space="preserve"> and the contents require comprehensive human review, validation, and refinement by qualified research personnel. </w:t>
-      </w:r>
-    </w:p>
-    <w:p>
-      <w:pPr>
-        <w:jc w:val="left"/>
+      </w:pPr>
+      <w:r>
         <w:rPr>
           <w:sz w:val="32"/>
           <w:szCs w:val="24"/>
         </w:rPr>
-      </w:pPr>
-    </w:p>
-    <w:p>
-      <w:pPr>
-        <w:jc w:val="left"/>
-        <w:rPr>
+        <w:t>All stakeholders are advised to conduct thorough verification of scientific accuracy, regulatory compliance, and institutional requirements before proceeding with formal Institutional Review Board (IRB) submission or other regulatory processes.</w:t>
+      </w:r>
+      <w:commentRangeEnd w:id="0"/>
+      <w:r>
+        <w:rPr>
+          <w:rStyle w:val="CommentReference"/>
           <w:sz w:val="32"/>
           <w:szCs w:val="24"/>
-        </w:rPr>
-      </w:pPr>
-      <w:r>
-        <w:rPr>
-          <w:sz w:val="32"/>
-          <w:szCs w:val="24"/>
-        </w:rPr>
-        <w:t>All stakeholders are advised to conduct thorough verification of scientific accuracy, regulatory compliance, and institutional requirements before proceeding with formal Institutional Review Board (IRB) submission or other regulatory processes.</w:t>
-      </w:r>
-      <w:commentRangeEnd w:id="0"/>
-      <w:r>
-        <w:rPr>
-          <w:rStyle w:val="CommentReference"/>
         </w:rPr>
         <w:commentReference w:id="0"/>
       </w:r>
@@ -149,108 +135,60 @@
           <w:bCs/>
           <w:szCs w:val="24"/>
         </w:rPr>
-        <w:t>{{</w:t>
-      </w:r>
-      <w:proofErr w:type="spellStart"/>
+        <w:t>{{pi_name}}</w:t>
+      </w:r>
+    </w:p>
+    <w:p>
+      <w:pPr>
+        <w:jc w:val="left"/>
+        <w:rPr>
+          <w:b/>
+          <w:szCs w:val="24"/>
+        </w:rPr>
+      </w:pPr>
+      <w:r>
+        <w:rPr>
+          <w:b/>
+          <w:szCs w:val="24"/>
+        </w:rPr>
+        <w:t>STUDY TITLE:</w:t>
+      </w:r>
+      <w:r>
+        <w:rPr>
+          <w:b/>
+          <w:szCs w:val="24"/>
+        </w:rPr>
+        <w:t xml:space="preserve"> </w:t>
+      </w:r>
       <w:r>
         <w:rPr>
           <w:bCs/>
           <w:szCs w:val="24"/>
         </w:rPr>
-        <w:t>pi_name</w:t>
-      </w:r>
-      <w:proofErr w:type="spellEnd"/>
+        <w:t>{{study_title}}</w:t>
+      </w:r>
+    </w:p>
+    <w:p>
+      <w:pPr>
+        <w:jc w:val="left"/>
+        <w:rPr>
+          <w:b/>
+          <w:szCs w:val="24"/>
+        </w:rPr>
+      </w:pPr>
+      <w:r>
+        <w:rPr>
+          <w:b/>
+          <w:szCs w:val="24"/>
+        </w:rPr>
+        <w:t xml:space="preserve">STUDY SITE: </w:t>
+      </w:r>
       <w:r>
         <w:rPr>
           <w:bCs/>
           <w:szCs w:val="24"/>
         </w:rPr>
-        <w:t>}}</w:t>
-      </w:r>
-    </w:p>
-    <w:p>
-      <w:pPr>
-        <w:jc w:val="left"/>
-        <w:rPr>
-          <w:b/>
-          <w:szCs w:val="24"/>
-        </w:rPr>
-      </w:pPr>
-      <w:r>
-        <w:rPr>
-          <w:b/>
-          <w:szCs w:val="24"/>
-        </w:rPr>
-        <w:t>STUDY TITLE:</w:t>
-      </w:r>
-      <w:r>
-        <w:rPr>
-          <w:b/>
-          <w:szCs w:val="24"/>
-        </w:rPr>
-        <w:t xml:space="preserve"> </w:t>
-      </w:r>
-      <w:r>
-        <w:rPr>
-          <w:bCs/>
-          <w:szCs w:val="24"/>
-        </w:rPr>
-        <w:t>{{</w:t>
-      </w:r>
-      <w:proofErr w:type="spellStart"/>
-      <w:r>
-        <w:rPr>
-          <w:bCs/>
-          <w:szCs w:val="24"/>
-        </w:rPr>
-        <w:t>study_title</w:t>
-      </w:r>
-      <w:proofErr w:type="spellEnd"/>
-      <w:r>
-        <w:rPr>
-          <w:bCs/>
-          <w:szCs w:val="24"/>
-        </w:rPr>
-        <w:t>}}</w:t>
-      </w:r>
-    </w:p>
-    <w:p>
-      <w:pPr>
-        <w:jc w:val="left"/>
-        <w:rPr>
-          <w:b/>
-          <w:szCs w:val="24"/>
-        </w:rPr>
-      </w:pPr>
-      <w:r>
-        <w:rPr>
-          <w:b/>
-          <w:szCs w:val="24"/>
-        </w:rPr>
-        <w:t xml:space="preserve">STUDY SITE: </w:t>
-      </w:r>
-      <w:r>
-        <w:rPr>
-          <w:bCs/>
-          <w:szCs w:val="24"/>
-        </w:rPr>
-        <w:t>{{</w:t>
-      </w:r>
-      <w:proofErr w:type="spellStart"/>
-      <w:r>
-        <w:rPr>
-          <w:bCs/>
-          <w:szCs w:val="24"/>
-        </w:rPr>
-        <w:t>study_site</w:t>
-      </w:r>
-      <w:proofErr w:type="spellEnd"/>
-      <w:r>
-        <w:rPr>
-          <w:bCs/>
-          <w:szCs w:val="24"/>
-        </w:rPr>
-        <w:t>}}</w:t>
+        <w:t>{{study_site}}</w:t>
       </w:r>
       <w:r>
         <w:rPr>
@@ -296,21 +234,7 @@
         <w:rPr>
           <w:szCs w:val="24"/>
         </w:rPr>
-        <w:t>Consent Version: {{</w:t>
-      </w:r>
-      <w:proofErr w:type="spellStart"/>
-      <w:r>
-        <w:rPr>
-          <w:szCs w:val="24"/>
-        </w:rPr>
-        <w:t>consent_version</w:t>
-      </w:r>
-      <w:proofErr w:type="spellEnd"/>
-      <w:r>
-        <w:rPr>
-          <w:szCs w:val="24"/>
-        </w:rPr>
-        <w:t>}}</w:t>
+        <w:t>Consent Version: {{consent_version}}</w:t>
       </w:r>
     </w:p>
     <w:bookmarkEnd w:id="1"/>
@@ -333,55 +257,7 @@
     </w:p>
     <w:p>
       <w:r>
-        <w:t>{{= [</w:t>
-      </w:r>
-      <w:proofErr w:type="spellStart"/>
-      <w:r>
-        <w:t>contact_name</w:t>
-      </w:r>
-      <w:proofErr w:type="spellEnd"/>
-      <w:r>
-        <w:t xml:space="preserve"> ? `Name: ${</w:t>
-      </w:r>
-      <w:proofErr w:type="spellStart"/>
-      <w:r>
-        <w:t>contact_name</w:t>
-      </w:r>
-      <w:proofErr w:type="spellEnd"/>
-      <w:r>
-        <w:t xml:space="preserve">}` : null, </w:t>
-      </w:r>
-      <w:proofErr w:type="spellStart"/>
-      <w:r>
-        <w:t>contact_phone</w:t>
-      </w:r>
-      <w:proofErr w:type="spellEnd"/>
-      <w:r>
-        <w:t xml:space="preserve"> ? `Phone: ${</w:t>
-      </w:r>
-      <w:proofErr w:type="spellStart"/>
-      <w:r>
-        <w:t>contact_phone</w:t>
-      </w:r>
-      <w:proofErr w:type="spellEnd"/>
-      <w:r>
-        <w:t xml:space="preserve">}` : null, </w:t>
-      </w:r>
-      <w:proofErr w:type="spellStart"/>
-      <w:r>
-        <w:t>contact_email</w:t>
-      </w:r>
-      <w:proofErr w:type="spellEnd"/>
-      <w:r>
-        <w:t xml:space="preserve"> ? `Email: ${</w:t>
-      </w:r>
-      <w:proofErr w:type="spellStart"/>
-      <w:r>
-        <w:t>contact_email</w:t>
-      </w:r>
-      <w:proofErr w:type="spellEnd"/>
-      <w:r>
-        <w:t>}` : null].filter(Boolean).join(", ") }}</w:t>
+        <w:t>{{= [contact_name ? `Name: ${contact_name}` : null, contact_phone ? `Phone: ${contact_phone}` : null, contact_email ? `Email: ${contact_email}` : null].filter(Boolean).join(", ") }}</w:t>
       </w:r>
     </w:p>
     <w:p>
@@ -399,10 +275,9 @@
       <w:r>
         <w:rPr>
           <w:rStyle w:val="CommentReference"/>
-          <w:rFonts w:ascii="Times New Roman" w:eastAsia="Times New Roman" w:hAnsi="Times New Roman"/>
-          <w:b w:val="0"/>
-          <w:caps w:val="0"/>
-          <w:spacing w:val="0"/>
+          <w:rFonts w:hint="eastAsia"/>
+          <w:sz w:val="24"/>
+          <w:szCs w:val="24"/>
         </w:rPr>
         <w:commentReference w:id="3"/>
       </w:r>
@@ -442,29 +317,13 @@
               <w:jc w:val="left"/>
             </w:pPr>
             <w:r>
-              <w:t>{{</w:t>
-            </w:r>
-            <w:proofErr w:type="spellStart"/>
-            <w:r>
-              <w:t>key_info_why_asked</w:t>
-            </w:r>
-            <w:proofErr w:type="spellEnd"/>
-            <w:r>
-              <w:t>}}</w:t>
+              <w:t>{{key_info_why_asked}}</w:t>
             </w:r>
             <w:r>
               <w:t xml:space="preserve"> </w:t>
             </w:r>
             <w:r>
-              <w:t>{{</w:t>
-            </w:r>
-            <w:proofErr w:type="spellStart"/>
-            <w:r>
-              <w:t>key_info_purpose</w:t>
-            </w:r>
-            <w:proofErr w:type="spellEnd"/>
-            <w:r>
-              <w:t>}}</w:t>
+              <w:t>{{key_info_purpose}}</w:t>
             </w:r>
           </w:p>
           <w:p>
@@ -475,23 +334,39 @@
               <w:t xml:space="preserve">This is a </w:t>
             </w:r>
             <w:r>
-              <w:t>{{</w:t>
+              <w:t>{{key_info_phase_explanation}} {{key_info_fda_status}}</w:t>
             </w:r>
-            <w:proofErr w:type="spellStart"/>
+          </w:p>
+          <w:p>
+            <w:pPr>
+              <w:jc w:val="left"/>
+            </w:pPr>
             <w:r>
-              <w:t>key_info_phase_explanation</w:t>
+              <w:t>{{key_info_happenings}}</w:t>
             </w:r>
-            <w:proofErr w:type="spellEnd"/>
+          </w:p>
+          <w:p>
+            <w:pPr>
+              <w:jc w:val="left"/>
+            </w:pPr>
             <w:r>
-              <w:t>}} {{</w:t>
+              <w:t>{{key_info_benefits}}</w:t>
             </w:r>
-            <w:proofErr w:type="spellStart"/>
+          </w:p>
+          <w:p>
+            <w:pPr>
+              <w:jc w:val="left"/>
+            </w:pPr>
             <w:r>
-              <w:t>key_info_fda_status</w:t>
+              <w:t>{{key_info_risks}}</w:t>
             </w:r>
-            <w:proofErr w:type="spellEnd"/>
+          </w:p>
+          <w:p>
+            <w:pPr>
+              <w:jc w:val="left"/>
+            </w:pPr>
             <w:r>
-              <w:t>}}</w:t>
+              <w:t>{{key_info_alternatives}}</w:t>
             </w:r>
           </w:p>
           <w:p>
@@ -499,79 +374,7 @@
               <w:jc w:val="left"/>
             </w:pPr>
             <w:r>
-              <w:t>{{</w:t>
-            </w:r>
-            <w:proofErr w:type="spellStart"/>
-            <w:r>
-              <w:t>key_info_happenings</w:t>
-            </w:r>
-            <w:proofErr w:type="spellEnd"/>
-            <w:r>
-              <w:t>}}</w:t>
-            </w:r>
-          </w:p>
-          <w:p>
-            <w:pPr>
-              <w:jc w:val="left"/>
-            </w:pPr>
-            <w:r>
-              <w:t>{{</w:t>
-            </w:r>
-            <w:proofErr w:type="spellStart"/>
-            <w:r>
-              <w:t>key_info_benefits</w:t>
-            </w:r>
-            <w:proofErr w:type="spellEnd"/>
-            <w:r>
-              <w:t>}}</w:t>
-            </w:r>
-          </w:p>
-          <w:p>
-            <w:pPr>
-              <w:jc w:val="left"/>
-            </w:pPr>
-            <w:r>
-              <w:t>{{</w:t>
-            </w:r>
-            <w:proofErr w:type="spellStart"/>
-            <w:r>
-              <w:t>key_info_risks</w:t>
-            </w:r>
-            <w:proofErr w:type="spellEnd"/>
-            <w:r>
-              <w:t>}}</w:t>
-            </w:r>
-          </w:p>
-          <w:p>
-            <w:pPr>
-              <w:jc w:val="left"/>
-            </w:pPr>
-            <w:r>
-              <w:t>{{</w:t>
-            </w:r>
-            <w:proofErr w:type="spellStart"/>
-            <w:r>
-              <w:t>key_info_alternatives</w:t>
-            </w:r>
-            <w:proofErr w:type="spellEnd"/>
-            <w:r>
-              <w:t>}}</w:t>
-            </w:r>
-          </w:p>
-          <w:p>
-            <w:pPr>
-              <w:jc w:val="left"/>
-            </w:pPr>
-            <w:r>
-              <w:t>{{</w:t>
-            </w:r>
-            <w:proofErr w:type="spellStart"/>
-            <w:r>
-              <w:t>key_info_voluntariness</w:t>
-            </w:r>
-            <w:proofErr w:type="spellEnd"/>
-            <w:r>
-              <w:t>}}</w:t>
+              <w:t>{{key_info_voluntariness}}</w:t>
             </w:r>
           </w:p>
         </w:tc>
@@ -626,40 +429,18 @@
         <w:rPr>
           <w:szCs w:val="24"/>
         </w:rPr>
-        <w:t xml:space="preserve">{{IF </w:t>
-      </w:r>
-      <w:proofErr w:type="spellStart"/>
-      <w:r>
-        <w:rPr>
-          <w:szCs w:val="24"/>
-        </w:rPr>
-        <w:t>parent_permission</w:t>
-      </w:r>
-      <w:proofErr w:type="spellEnd"/>
-      <w:r>
-        <w:rPr>
-          <w:szCs w:val="24"/>
-        </w:rPr>
-        <w:t>}}</w:t>
-      </w:r>
-    </w:p>
-    <w:p>
-      <w:pPr>
-        <w:jc w:val="left"/>
-        <w:rPr>
-          <w:szCs w:val="24"/>
-        </w:rPr>
-      </w:pPr>
-      <w:r>
-        <w:t xml:space="preserve">If the individual being </w:t>
-      </w:r>
-      <w:proofErr w:type="gramStart"/>
-      <w:r>
-        <w:t>enrolled</w:t>
-      </w:r>
-      <w:proofErr w:type="gramEnd"/>
-      <w:r>
-        <w:t xml:space="preserve"> is a minor then the term "you" refers to "you and/or your child" throughout the remainder of this document.</w:t>
+        <w:t>{{IF parent_permission}}</w:t>
+      </w:r>
+    </w:p>
+    <w:p>
+      <w:pPr>
+        <w:jc w:val="left"/>
+        <w:rPr>
+          <w:szCs w:val="24"/>
+        </w:rPr>
+      </w:pPr>
+      <w:r>
+        <w:t>If the individual being enrolled is a minor then the term "you" refers to "you and/or your child" throughout the remainder of this document.</w:t>
       </w:r>
       <w:r>
         <w:t xml:space="preserve"> </w:t>
@@ -680,21 +461,7 @@
         <w:rPr>
           <w:szCs w:val="24"/>
         </w:rPr>
-        <w:t xml:space="preserve">{{IF </w:t>
-      </w:r>
-      <w:proofErr w:type="spellStart"/>
-      <w:r>
-        <w:rPr>
-          <w:szCs w:val="24"/>
-        </w:rPr>
-        <w:t>impaired_adults</w:t>
-      </w:r>
-      <w:proofErr w:type="spellEnd"/>
-      <w:r>
-        <w:rPr>
-          <w:szCs w:val="24"/>
-        </w:rPr>
-        <w:t>}}</w:t>
+        <w:t>{{IF impaired_adults}}</w:t>
       </w:r>
     </w:p>
     <w:p>
@@ -707,15 +474,7 @@
       </w:pPr>
       <w:r>
         <w:lastRenderedPageBreak/>
-        <w:t xml:space="preserve">If the individual being asked to participate in this research study </w:t>
-      </w:r>
-      <w:proofErr w:type="gramStart"/>
-      <w:r>
-        <w:t>is not able to</w:t>
-      </w:r>
-      <w:proofErr w:type="gramEnd"/>
-      <w:r>
-        <w:t xml:space="preserve"> give consent for themselves, you, as the Legally Authorized Representative, will be their decision-maker and you are being asked to give permission for this person to be in this study. For the remainder of this document, the term "you" refers to you as the decision-maker and/or the individual being asked to participate in this research.</w:t>
+        <w:t>If the individual being asked to participate in this research study is not able to give consent for themselves, you, as the Legally Authorized Representative, will be their decision-maker and you are being asked to give permission for this person to be in this study. For the remainder of this document, the term "you" refers to you as the decision-maker and/or the individual being asked to participate in this research.</w:t>
       </w:r>
       <w:r>
         <w:t xml:space="preserve"> </w:t>
@@ -880,21 +639,7 @@
         <w:rPr>
           <w:szCs w:val="24"/>
         </w:rPr>
-        <w:t>The purpose of this research study is {{</w:t>
-      </w:r>
-      <w:proofErr w:type="spellStart"/>
-      <w:r>
-        <w:rPr>
-          <w:szCs w:val="24"/>
-        </w:rPr>
-        <w:t>study_purpose</w:t>
-      </w:r>
-      <w:proofErr w:type="spellEnd"/>
-      <w:r>
-        <w:rPr>
-          <w:szCs w:val="24"/>
-        </w:rPr>
-        <w:t>}}</w:t>
+        <w:t>The purpose of this research study is {{study_purpose}}</w:t>
       </w:r>
       <w:r>
         <w:rPr>
@@ -906,21 +651,7 @@
         <w:rPr>
           <w:szCs w:val="24"/>
         </w:rPr>
-        <w:t>We are asking you to join this research study because you {{</w:t>
-      </w:r>
-      <w:proofErr w:type="spellStart"/>
-      <w:r>
-        <w:rPr>
-          <w:szCs w:val="24"/>
-        </w:rPr>
-        <w:t>why_you_asked</w:t>
-      </w:r>
-      <w:proofErr w:type="spellEnd"/>
-      <w:r>
-        <w:rPr>
-          <w:szCs w:val="24"/>
-        </w:rPr>
-        <w:t>}}</w:t>
+        <w:t>We are asking you to join this research study because you {{why_you_asked}}</w:t>
       </w:r>
     </w:p>
     <w:p>
@@ -936,21 +667,7 @@
         <w:rPr>
           <w:szCs w:val="24"/>
         </w:rPr>
-        <w:t xml:space="preserve">{{IF </w:t>
-      </w:r>
-      <w:proofErr w:type="spellStart"/>
-      <w:r>
-        <w:rPr>
-          <w:szCs w:val="24"/>
-        </w:rPr>
-        <w:t>is_investigational</w:t>
-      </w:r>
-      <w:proofErr w:type="spellEnd"/>
-      <w:r>
-        <w:rPr>
-          <w:szCs w:val="24"/>
-        </w:rPr>
-        <w:t>}}</w:t>
+        <w:t>{{IF is_investigational}}</w:t>
       </w:r>
     </w:p>
     <w:p>
@@ -965,27 +682,15 @@
       <w:r>
         <w:t>{{</w:t>
       </w:r>
-      <w:proofErr w:type="spellStart"/>
       <w:r>
         <w:t>approach_investigational_drug_name</w:t>
       </w:r>
-      <w:proofErr w:type="spellEnd"/>
-      <w:r>
-        <w:t>}} is considered investigational, which means that it has not been approved by the U.S. Food and Drug Administration (FDA) to treat {{</w:t>
-      </w:r>
-      <w:proofErr w:type="spellStart"/>
-      <w:r>
-        <w:t>investigational_condition</w:t>
-      </w:r>
-      <w:proofErr w:type="spellEnd"/>
-      <w:r>
-        <w:t>}}. However, the FDA has given us permission to use {{</w:t>
-      </w:r>
-      <w:proofErr w:type="spellStart"/>
+      <w:r>
+        <w:t>}} is considered investigational, which means that it has not been approved by the U.S. Food and Drug Administration (FDA) to treat {{investigational_condition}}. However, the FDA has given us permission to use {{</w:t>
+      </w:r>
       <w:r>
         <w:t>approach_investigational_drug_name</w:t>
       </w:r>
-      <w:proofErr w:type="spellEnd"/>
       <w:r>
         <w:t>}} in this study.</w:t>
       </w:r>
@@ -1006,15 +711,7 @@
         </w:rPr>
       </w:pPr>
       <w:r>
-        <w:t xml:space="preserve">{{IF </w:t>
-      </w:r>
-      <w:proofErr w:type="spellStart"/>
-      <w:r>
-        <w:t>is_fda_approved_off_label</w:t>
-      </w:r>
-      <w:proofErr w:type="spellEnd"/>
-      <w:r>
-        <w:t>}}</w:t>
+        <w:t>{{IF is_fda_approved_off_label}}</w:t>
       </w:r>
     </w:p>
     <w:p>
@@ -1029,29 +726,11 @@
       <w:r>
         <w:t>The use of {{</w:t>
       </w:r>
-      <w:proofErr w:type="spellStart"/>
       <w:r>
         <w:t>approach_investigational_drug_name</w:t>
       </w:r>
-      <w:proofErr w:type="spellEnd"/>
-      <w:r>
-        <w:t>}} is approved to treat {{</w:t>
-      </w:r>
-      <w:proofErr w:type="spellStart"/>
-      <w:r>
-        <w:t>fda_approved_indication</w:t>
-      </w:r>
-      <w:proofErr w:type="spellEnd"/>
-      <w:r>
-        <w:t>}}. We are testing it in this research study to see {{</w:t>
-      </w:r>
-      <w:proofErr w:type="spellStart"/>
-      <w:r>
-        <w:t>research_testing_reason</w:t>
-      </w:r>
-      <w:proofErr w:type="spellEnd"/>
-      <w:r>
-        <w:t>}}</w:t>
+      <w:r>
+        <w:t>}} is approved to treat {{fda_approved_indication}}. We are testing it in this research study to see {{research_testing_reason}}</w:t>
       </w:r>
       <w:r>
         <w:t xml:space="preserve"> </w:t>
@@ -1087,23 +766,7 @@
           <w:bCs/>
           <w:szCs w:val="24"/>
         </w:rPr>
-        <w:t>{{</w:t>
-      </w:r>
-      <w:proofErr w:type="spellStart"/>
-      <w:r>
-        <w:rPr>
-          <w:bCs/>
-          <w:szCs w:val="24"/>
-        </w:rPr>
-        <w:t>study_procedures_intro</w:t>
-      </w:r>
-      <w:proofErr w:type="spellEnd"/>
-      <w:r>
-        <w:rPr>
-          <w:bCs/>
-          <w:szCs w:val="24"/>
-        </w:rPr>
-        <w:t>}}</w:t>
+        <w:t>{{study_procedures_intro}}</w:t>
       </w:r>
     </w:p>
     <w:tbl>
@@ -1195,15 +858,7 @@
               </w:rPr>
             </w:pPr>
             <w:r>
-              <w:t xml:space="preserve">{{FOR procedure IN </w:t>
-            </w:r>
-            <w:proofErr w:type="spellStart"/>
-            <w:r>
-              <w:t>study_procedures</w:t>
-            </w:r>
-            <w:proofErr w:type="spellEnd"/>
-            <w:r>
-              <w:t>}}</w:t>
+              <w:t>{{FOR procedure IN study_procedures}}</w:t>
             </w:r>
           </w:p>
         </w:tc>
@@ -1247,23 +902,7 @@
                 <w:b/>
                 <w:bCs/>
               </w:rPr>
-              <w:t>{{$</w:t>
-            </w:r>
-            <w:proofErr w:type="spellStart"/>
-            <w:r>
-              <w:rPr>
-                <w:b/>
-                <w:bCs/>
-              </w:rPr>
-              <w:t>procedure.title</w:t>
-            </w:r>
-            <w:proofErr w:type="spellEnd"/>
-            <w:r>
-              <w:rPr>
-                <w:b/>
-                <w:bCs/>
-              </w:rPr>
-              <w:t>}}</w:t>
+              <w:t>{{$procedure.title}}</w:t>
             </w:r>
           </w:p>
         </w:tc>
@@ -1283,15 +922,7 @@
               </w:rPr>
             </w:pPr>
             <w:r>
-              <w:t>{{$</w:t>
-            </w:r>
-            <w:proofErr w:type="spellStart"/>
-            <w:r>
-              <w:t>procedure.description</w:t>
-            </w:r>
-            <w:proofErr w:type="spellEnd"/>
-            <w:r>
-              <w:t>}}</w:t>
+              <w:t>{{$procedure.description}}</w:t>
             </w:r>
           </w:p>
         </w:tc>
@@ -1374,23 +1005,7 @@
           <w:bCs/>
           <w:szCs w:val="24"/>
         </w:rPr>
-        <w:t>If you agree to take part in this study, you will be in it for about {{</w:t>
-      </w:r>
-      <w:proofErr w:type="spellStart"/>
-      <w:r>
-        <w:rPr>
-          <w:bCs/>
-          <w:szCs w:val="24"/>
-        </w:rPr>
-        <w:t>study_duration</w:t>
-      </w:r>
-      <w:proofErr w:type="spellEnd"/>
-      <w:r>
-        <w:rPr>
-          <w:bCs/>
-          <w:szCs w:val="24"/>
-        </w:rPr>
-        <w:t>}}.</w:t>
+        <w:t>If you agree to take part in this study, you will be in it for about {{study_duration}}.</w:t>
       </w:r>
     </w:p>
     <w:p>
@@ -1427,21 +1042,7 @@
         <w:rPr>
           <w:szCs w:val="24"/>
         </w:rPr>
-        <w:t xml:space="preserve"> {{</w:t>
-      </w:r>
-      <w:proofErr w:type="spellStart"/>
-      <w:r>
-        <w:rPr>
-          <w:szCs w:val="24"/>
-        </w:rPr>
-        <w:t>accrual_ceiling</w:t>
-      </w:r>
-      <w:proofErr w:type="spellEnd"/>
-      <w:r>
-        <w:rPr>
-          <w:szCs w:val="24"/>
-        </w:rPr>
-        <w:t xml:space="preserve">}} people </w:t>
+        <w:t xml:space="preserve"> {{accrual_ceiling}} people </w:t>
       </w:r>
       <w:r>
         <w:rPr>
@@ -1464,34 +1065,18 @@
         </w:rPr>
       </w:pPr>
       <w:r>
-        <w:t xml:space="preserve">{{IF </w:t>
-      </w:r>
-      <w:proofErr w:type="spellStart"/>
-      <w:r>
-        <w:t>multisite_count</w:t>
-      </w:r>
-      <w:proofErr w:type="spellEnd"/>
-      <w:r>
-        <w:t>}}</w:t>
-      </w:r>
-    </w:p>
-    <w:p>
-      <w:pPr>
-        <w:jc w:val="left"/>
-        <w:rPr>
-          <w:szCs w:val="24"/>
-        </w:rPr>
-      </w:pPr>
-      <w:r>
-        <w:t>Up to {{</w:t>
-      </w:r>
-      <w:proofErr w:type="spellStart"/>
-      <w:r>
-        <w:t>multisite_count</w:t>
-      </w:r>
-      <w:proofErr w:type="spellEnd"/>
-      <w:r>
-        <w:t xml:space="preserve">}} people might also </w:t>
+        <w:t>{{IF multisite_count}}</w:t>
+      </w:r>
+    </w:p>
+    <w:p>
+      <w:pPr>
+        <w:jc w:val="left"/>
+        <w:rPr>
+          <w:szCs w:val="24"/>
+        </w:rPr>
+      </w:pPr>
+      <w:r>
+        <w:t xml:space="preserve">Up to {{multisite_count}} people might also </w:t>
       </w:r>
       <w:r>
         <w:t>take part</w:t>
@@ -1541,21 +1126,7 @@
         <w:rPr>
           <w:szCs w:val="24"/>
         </w:rPr>
-        <w:t>{{</w:t>
-      </w:r>
-      <w:proofErr w:type="spellStart"/>
-      <w:r>
-        <w:rPr>
-          <w:szCs w:val="24"/>
-        </w:rPr>
-        <w:t>risks_intro</w:t>
-      </w:r>
-      <w:proofErr w:type="spellEnd"/>
-      <w:r>
-        <w:rPr>
-          <w:szCs w:val="24"/>
-        </w:rPr>
-        <w:t>}}</w:t>
+        <w:t>{{risks_intro}}</w:t>
       </w:r>
     </w:p>
     <w:p>
@@ -1567,15 +1138,7 @@
         </w:rPr>
       </w:pPr>
       <w:r>
-        <w:t xml:space="preserve">{{FOR drug IN </w:t>
-      </w:r>
-      <w:proofErr w:type="spellStart"/>
-      <w:r>
-        <w:t>drug_risks</w:t>
-      </w:r>
-      <w:proofErr w:type="spellEnd"/>
-      <w:r>
-        <w:t>}}</w:t>
+        <w:t>{{FOR drug IN drug_risks}}</w:t>
       </w:r>
     </w:p>
     <w:p>
@@ -1593,23 +1156,7 @@
           <w:b/>
           <w:bCs/>
         </w:rPr>
-        <w:t>Possible Side Effects of {{$</w:t>
-      </w:r>
-      <w:proofErr w:type="spellStart"/>
-      <w:r>
-        <w:rPr>
-          <w:b/>
-          <w:bCs/>
-        </w:rPr>
-        <w:t>drug.drug_name</w:t>
-      </w:r>
-      <w:proofErr w:type="spellEnd"/>
-      <w:r>
-        <w:rPr>
-          <w:b/>
-          <w:bCs/>
-        </w:rPr>
-        <w:t>}}</w:t>
+        <w:t>Possible Side Effects of {{$drug.drug_name}}</w:t>
       </w:r>
     </w:p>
     <w:tbl>
@@ -1658,15 +1205,7 @@
               </w:rPr>
             </w:pPr>
             <w:r>
-              <w:t>{{$</w:t>
-            </w:r>
-            <w:proofErr w:type="spellStart"/>
-            <w:r>
-              <w:t>drug.common_definition</w:t>
-            </w:r>
-            <w:proofErr w:type="spellEnd"/>
-            <w:r>
-              <w:t>}}</w:t>
+              <w:t>{{$drug.common_definition}}</w:t>
             </w:r>
           </w:p>
         </w:tc>
@@ -1685,15 +1224,7 @@
               </w:rPr>
             </w:pPr>
             <w:r>
-              <w:t>{{FOR risk IN $</w:t>
-            </w:r>
-            <w:proofErr w:type="spellStart"/>
-            <w:r>
-              <w:t>drug.common_risks</w:t>
-            </w:r>
-            <w:proofErr w:type="spellEnd"/>
-            <w:r>
-              <w:t>}}</w:t>
+              <w:t>{{FOR risk IN $drug.common_risks}}</w:t>
             </w:r>
           </w:p>
           <w:p>
@@ -1769,15 +1300,7 @@
               </w:rPr>
             </w:pPr>
             <w:r>
-              <w:t>{{$</w:t>
-            </w:r>
-            <w:proofErr w:type="spellStart"/>
-            <w:r>
-              <w:t>drug.occasional_definition</w:t>
-            </w:r>
-            <w:proofErr w:type="spellEnd"/>
-            <w:r>
-              <w:t>}}</w:t>
+              <w:t>{{$drug.occasional_definition}}</w:t>
             </w:r>
           </w:p>
         </w:tc>
@@ -1800,15 +1323,7 @@
               </w:rPr>
             </w:pPr>
             <w:r>
-              <w:t>{{FOR risk IN $</w:t>
-            </w:r>
-            <w:proofErr w:type="spellStart"/>
-            <w:r>
-              <w:t>drug.occasional_risks</w:t>
-            </w:r>
-            <w:proofErr w:type="spellEnd"/>
-            <w:r>
-              <w:t>}}</w:t>
+              <w:t>{{FOR risk IN $drug.occasional_risks}}</w:t>
             </w:r>
           </w:p>
           <w:p>
@@ -1883,15 +1398,7 @@
               </w:rPr>
             </w:pPr>
             <w:r>
-              <w:t>{{$</w:t>
-            </w:r>
-            <w:proofErr w:type="spellStart"/>
-            <w:r>
-              <w:t>drug.rare_definition</w:t>
-            </w:r>
-            <w:proofErr w:type="spellEnd"/>
-            <w:r>
-              <w:t>}}</w:t>
+              <w:t>{{$drug.rare_definition}}</w:t>
             </w:r>
           </w:p>
         </w:tc>
@@ -1910,15 +1417,7 @@
               </w:rPr>
             </w:pPr>
             <w:r>
-              <w:t>{{FOR risk IN $</w:t>
-            </w:r>
-            <w:proofErr w:type="spellStart"/>
-            <w:r>
-              <w:t>drug.rare_risks</w:t>
-            </w:r>
-            <w:proofErr w:type="spellEnd"/>
-            <w:r>
-              <w:t>}}</w:t>
+              <w:t>{{FOR risk IN $drug.rare_risks}}</w:t>
             </w:r>
           </w:p>
           <w:p>
@@ -1957,7 +1456,6 @@
         <w:rPr>
           <w:b/>
           <w:bCs/>
-          <w:szCs w:val="24"/>
         </w:rPr>
       </w:pPr>
       <w:r>
@@ -1970,6 +1468,259 @@
     </w:p>
     <w:p>
       <w:pPr>
+        <w:jc w:val="left"/>
+        <w:rPr>
+          <w:bCs/>
+          <w:szCs w:val="24"/>
+        </w:rPr>
+      </w:pPr>
+      <w:r>
+        <w:rPr>
+          <w:bCs/>
+          <w:szCs w:val="24"/>
+        </w:rPr>
+        <w:t>{{procedures_risks_intro}}</w:t>
+      </w:r>
+    </w:p>
+    <w:tbl>
+      <w:tblPr>
+        <w:tblStyle w:val="TableGridLight"/>
+        <w:tblW w:w="0" w:type="auto"/>
+        <w:tblBorders>
+          <w:left w:val="none" w:sz="0" w:space="0" w:color="auto"/>
+          <w:right w:val="none" w:sz="0" w:space="0" w:color="auto"/>
+        </w:tblBorders>
+        <w:tblLook w:val="04A0" w:firstRow="1" w:lastRow="0" w:firstColumn="1" w:lastColumn="0" w:noHBand="0" w:noVBand="1"/>
+      </w:tblPr>
+      <w:tblGrid>
+        <w:gridCol w:w="2160"/>
+        <w:gridCol w:w="7200"/>
+      </w:tblGrid>
+      <w:tr>
+        <w:tc>
+          <w:tcPr>
+            <w:tcW w:w="2065" w:type="dxa"/>
+            <w:tcBorders>
+              <w:top w:val="nil"/>
+              <w:bottom w:val="single" w:sz="4" w:space="0" w:color="auto"/>
+            </w:tcBorders>
+            <w:shd w:val="clear" w:color="auto" w:fill="F2F2F2" w:themeFill="background1" w:themeFillShade="F2"/>
+          </w:tcPr>
+          <w:p>
+            <w:pPr>
+              <w:jc w:val="left"/>
+              <w:rPr>
+                <w:b/>
+                <w:bCs/>
+                <w:szCs w:val="24"/>
+              </w:rPr>
+            </w:pPr>
+            <w:r>
+              <w:rPr>
+                <w:b/>
+                <w:bCs/>
+                <w:szCs w:val="24"/>
+              </w:rPr>
+              <w:lastRenderedPageBreak/>
+              <w:t>Procedure Name</w:t>
+            </w:r>
+          </w:p>
+        </w:tc>
+        <w:tc>
+          <w:tcPr>
+            <w:tcW w:w="7285" w:type="dxa"/>
+            <w:tcBorders>
+              <w:top w:val="nil"/>
+              <w:bottom w:val="single" w:sz="4" w:space="0" w:color="auto"/>
+            </w:tcBorders>
+            <w:shd w:val="clear" w:color="auto" w:fill="F2F2F2" w:themeFill="background1" w:themeFillShade="F2"/>
+          </w:tcPr>
+          <w:p>
+            <w:pPr>
+              <w:jc w:val="left"/>
+              <w:rPr>
+                <w:b/>
+                <w:bCs/>
+                <w:szCs w:val="24"/>
+              </w:rPr>
+            </w:pPr>
+            <w:r>
+              <w:rPr>
+                <w:b/>
+                <w:bCs/>
+                <w:szCs w:val="24"/>
+              </w:rPr>
+              <w:t xml:space="preserve">Procedure </w:t>
+            </w:r>
+            <w:r>
+              <w:rPr>
+                <w:b/>
+                <w:bCs/>
+                <w:szCs w:val="24"/>
+              </w:rPr>
+              <w:t>Risk</w:t>
+            </w:r>
+          </w:p>
+        </w:tc>
+      </w:tr>
+      <w:tr>
+        <w:tc>
+          <w:tcPr>
+            <w:tcW w:w="2065" w:type="dxa"/>
+            <w:tcBorders>
+              <w:top w:val="single" w:sz="4" w:space="0" w:color="auto"/>
+            </w:tcBorders>
+          </w:tcPr>
+          <w:p>
+            <w:pPr>
+              <w:ind w:right="180"/>
+              <w:jc w:val="left"/>
+              <w:rPr>
+                <w:b/>
+              </w:rPr>
+            </w:pPr>
+            <w:r>
+              <w:t xml:space="preserve">{{FOR </w:t>
+            </w:r>
+            <w:r>
+              <w:t xml:space="preserve">proc </w:t>
+            </w:r>
+            <w:r>
+              <w:t xml:space="preserve">IN </w:t>
+            </w:r>
+            <w:r>
+              <w:t>procedure_risks</w:t>
+            </w:r>
+            <w:r>
+              <w:t>}}</w:t>
+            </w:r>
+          </w:p>
+        </w:tc>
+        <w:tc>
+          <w:tcPr>
+            <w:tcW w:w="7285" w:type="dxa"/>
+            <w:tcBorders>
+              <w:top w:val="single" w:sz="4" w:space="0" w:color="auto"/>
+            </w:tcBorders>
+          </w:tcPr>
+          <w:p>
+            <w:pPr>
+              <w:jc w:val="left"/>
+              <w:rPr>
+                <w:bCs/>
+                <w:szCs w:val="24"/>
+              </w:rPr>
+            </w:pPr>
+          </w:p>
+        </w:tc>
+      </w:tr>
+      <w:tr>
+        <w:tc>
+          <w:tcPr>
+            <w:tcW w:w="2065" w:type="dxa"/>
+            <w:tcBorders>
+              <w:bottom w:val="single" w:sz="4" w:space="0" w:color="BFBFBF" w:themeColor="background1" w:themeShade="BF"/>
+            </w:tcBorders>
+          </w:tcPr>
+          <w:p>
+            <w:pPr>
+              <w:ind w:right="180"/>
+              <w:jc w:val="left"/>
+              <w:rPr>
+                <w:b/>
+                <w:bCs/>
+              </w:rPr>
+            </w:pPr>
+            <w:r>
+              <w:rPr>
+                <w:b/>
+                <w:bCs/>
+              </w:rPr>
+              <w:t>{{$</w:t>
+            </w:r>
+            <w:r>
+              <w:t>proc</w:t>
+            </w:r>
+            <w:r>
+              <w:rPr>
+                <w:b/>
+                <w:bCs/>
+              </w:rPr>
+              <w:t>.title}}</w:t>
+            </w:r>
+          </w:p>
+        </w:tc>
+        <w:tc>
+          <w:tcPr>
+            <w:tcW w:w="7285" w:type="dxa"/>
+            <w:tcBorders>
+              <w:bottom w:val="single" w:sz="4" w:space="0" w:color="BFBFBF" w:themeColor="background1" w:themeShade="BF"/>
+            </w:tcBorders>
+          </w:tcPr>
+          <w:p>
+            <w:pPr>
+              <w:jc w:val="left"/>
+              <w:rPr>
+                <w:bCs/>
+                <w:szCs w:val="24"/>
+              </w:rPr>
+            </w:pPr>
+            <w:r>
+              <w:t>{{$</w:t>
+            </w:r>
+            <w:r>
+              <w:t>proc</w:t>
+            </w:r>
+            <w:r>
+              <w:t>.description}}</w:t>
+            </w:r>
+          </w:p>
+        </w:tc>
+      </w:tr>
+      <w:tr>
+        <w:tc>
+          <w:tcPr>
+            <w:tcW w:w="2065" w:type="dxa"/>
+            <w:tcBorders>
+              <w:bottom w:val="single" w:sz="4" w:space="0" w:color="auto"/>
+            </w:tcBorders>
+          </w:tcPr>
+          <w:p>
+            <w:pPr>
+              <w:jc w:val="left"/>
+              <w:rPr>
+                <w:b/>
+                <w:szCs w:val="24"/>
+              </w:rPr>
+            </w:pPr>
+            <w:r>
+              <w:t xml:space="preserve">{{END-FOR </w:t>
+            </w:r>
+            <w:r>
+              <w:t xml:space="preserve">proc </w:t>
+            </w:r>
+            <w:r>
+              <w:t>}}</w:t>
+            </w:r>
+          </w:p>
+        </w:tc>
+        <w:tc>
+          <w:tcPr>
+            <w:tcW w:w="7285" w:type="dxa"/>
+            <w:tcBorders>
+              <w:bottom w:val="single" w:sz="4" w:space="0" w:color="auto"/>
+            </w:tcBorders>
+          </w:tcPr>
+          <w:p>
+            <w:pPr>
+              <w:jc w:val="left"/>
+            </w:pPr>
+          </w:p>
+        </w:tc>
+      </w:tr>
+    </w:tbl>
+    <w:p>
+      <w:pPr>
         <w:ind w:right="180"/>
         <w:jc w:val="left"/>
         <w:rPr>
@@ -1977,29 +1728,213 @@
         </w:rPr>
       </w:pPr>
       <w:r>
-        <w:t xml:space="preserve">{{FOR proc IN </w:t>
-      </w:r>
-      <w:proofErr w:type="spellStart"/>
-      <w:r>
-        <w:t>procedure_risks</w:t>
-      </w:r>
-      <w:proofErr w:type="spellEnd"/>
+        <w:t>{{IF pregnancy_risks}}</w:t>
+      </w:r>
+    </w:p>
+    <w:p>
+      <w:pPr>
+        <w:pStyle w:val="Heading2"/>
+        <w:rPr>
+          <w:rFonts w:hint="eastAsia"/>
+        </w:rPr>
+      </w:pPr>
+      <w:r>
+        <w:t>What are the risks related to pregnancy?</w:t>
+      </w:r>
+    </w:p>
+    <w:p>
+      <w:pPr>
+        <w:jc w:val="left"/>
+        <w:rPr>
+          <w:szCs w:val="24"/>
+        </w:rPr>
+      </w:pPr>
+      <w:r>
+        <w:rPr>
+          <w:szCs w:val="24"/>
+        </w:rPr>
+        <w:t>{{pregnancy_risks}}</w:t>
+      </w:r>
+      <w:r>
+        <w:rPr>
+          <w:szCs w:val="24"/>
+        </w:rPr>
+        <w:t>{{END-IF}}</w:t>
+      </w:r>
+    </w:p>
+    <w:p>
+      <w:pPr>
+        <w:jc w:val="left"/>
+      </w:pPr>
+      <w:r>
+        <w:rPr>
+          <w:szCs w:val="24"/>
+        </w:rPr>
+        <w:t xml:space="preserve">{{IF </w:t>
+      </w:r>
+      <w:r>
+        <w:t>radiation_risks</w:t>
+      </w:r>
       <w:r>
         <w:t>}}</w:t>
       </w:r>
     </w:p>
     <w:p>
       <w:pPr>
-        <w:pStyle w:val="ListParagraph"/>
-        <w:numPr>
-          <w:ilvl w:val="0"/>
-          <w:numId w:val="8"/>
-        </w:numPr>
+        <w:pStyle w:val="Heading2"/>
+        <w:rPr>
+          <w:rFonts w:hint="eastAsia"/>
+        </w:rPr>
+      </w:pPr>
+      <w:bookmarkStart w:id="4" w:name="_Hlk535331221"/>
+      <w:r>
+        <w:t>What are the risks of radiation from being in the study:</w:t>
+      </w:r>
+      <w:bookmarkEnd w:id="4"/>
+    </w:p>
+    <w:p>
+      <w:pPr>
+        <w:jc w:val="left"/>
+      </w:pPr>
+      <w:r>
+        <w:t>{{radiation_risks}}</w:t>
+      </w:r>
+      <w:r>
+        <w:t>{{END-IF}}</w:t>
+      </w:r>
+    </w:p>
+    <w:p>
+      <w:pPr>
+        <w:pStyle w:val="Heading1"/>
+        <w:rPr>
+          <w:rFonts w:hint="eastAsia"/>
+        </w:rPr>
+      </w:pPr>
+      <w:r>
+        <w:t xml:space="preserve">WHAT ARE </w:t>
+      </w:r>
+      <w:r>
+        <w:t>THE BENEFITS OF BEING IN THE STUDY</w:t>
+      </w:r>
+      <w:r>
+        <w:t>?</w:t>
+      </w:r>
+    </w:p>
+    <w:p>
+      <w:pPr>
+        <w:jc w:val="left"/>
+        <w:rPr>
+          <w:szCs w:val="24"/>
+        </w:rPr>
+      </w:pPr>
+      <w:r>
+        <w:rPr>
+          <w:szCs w:val="24"/>
+        </w:rPr>
+        <w:t>{{IF has_potential_benefits}}</w:t>
+      </w:r>
+    </w:p>
+    <w:p>
+      <w:pPr>
+        <w:jc w:val="left"/>
+        <w:rPr>
+          <w:szCs w:val="24"/>
+        </w:rPr>
+      </w:pPr>
+      <w:r>
+        <w:t>You might not benefit from being in this study. However, the potential benefit to you might be {{benefits_description}}{{END-IF}}</w:t>
+      </w:r>
+    </w:p>
+    <w:p>
+      <w:pPr>
+        <w:jc w:val="left"/>
+        <w:rPr>
+          <w:szCs w:val="24"/>
+        </w:rPr>
+      </w:pPr>
+      <w:r>
+        <w:t>{{IF no_potential_benefits}}</w:t>
+      </w:r>
+    </w:p>
+    <w:p>
+      <w:pPr>
+        <w:jc w:val="left"/>
+        <w:rPr>
+          <w:szCs w:val="24"/>
+        </w:rPr>
+      </w:pPr>
+      <w:r>
+        <w:t>You will not benefit from being in this study.{{END-IF}}</w:t>
+      </w:r>
+    </w:p>
+    <w:p>
+      <w:pPr>
+        <w:pStyle w:val="Heading2"/>
+        <w:rPr>
+          <w:rFonts w:hint="eastAsia"/>
+        </w:rPr>
+      </w:pPr>
+      <w:r>
+        <w:t xml:space="preserve">Are there any potential benefits to others that might result from </w:t>
+      </w:r>
+      <w:r>
+        <w:t>the study</w:t>
+      </w:r>
+      <w:r>
+        <w:t>?</w:t>
+      </w:r>
+    </w:p>
+    <w:p>
+      <w:pPr>
+        <w:jc w:val="left"/>
+        <w:rPr>
+          <w:bCs/>
+          <w:szCs w:val="24"/>
+        </w:rPr>
+      </w:pPr>
+      <w:r>
+        <w:rPr>
+          <w:szCs w:val="24"/>
+        </w:rPr>
+        <w:t>In the future, other people might benefit from this study because {{benefits_others_reason}}.</w:t>
+      </w:r>
+    </w:p>
+    <w:p>
+      <w:pPr>
+        <w:pStyle w:val="Heading1"/>
+        <w:rPr>
+          <w:rFonts w:hint="eastAsia"/>
+        </w:rPr>
+      </w:pPr>
+      <w:r>
+        <w:t xml:space="preserve">WHAT OTHER OPTIONS </w:t>
+      </w:r>
+      <w:r>
+        <w:t xml:space="preserve">ARE THERE </w:t>
+      </w:r>
+      <w:r>
+        <w:t xml:space="preserve">FOR </w:t>
+      </w:r>
+      <w:r>
+        <w:t>YOU</w:t>
+      </w:r>
+      <w:r>
+        <w:t>?</w:t>
+      </w:r>
+    </w:p>
+    <w:p>
+      <w:pPr>
         <w:ind w:right="180"/>
         <w:jc w:val="left"/>
-      </w:pPr>
-      <w:r>
-        <w:t>{{$proc}}{{END-FOR proc}}</w:t>
+        <w:rPr>
+          <w:szCs w:val="24"/>
+        </w:rPr>
+      </w:pPr>
+      <w:r>
+        <w:rPr>
+          <w:szCs w:val="24"/>
+        </w:rPr>
+        <w:t>Before you decide whether or not to be in this study, we will discuss other options that are available to you. Instead of being in this study, you could:</w:t>
       </w:r>
     </w:p>
     <w:p>
@@ -2011,324 +1946,7 @@
         </w:rPr>
       </w:pPr>
       <w:r>
-        <w:lastRenderedPageBreak/>
-        <w:t xml:space="preserve">{{IF </w:t>
-      </w:r>
-      <w:proofErr w:type="spellStart"/>
-      <w:r>
-        <w:t>pregnancy_risks</w:t>
-      </w:r>
-      <w:proofErr w:type="spellEnd"/>
-      <w:r>
-        <w:t>}}</w:t>
-      </w:r>
-    </w:p>
-    <w:p>
-      <w:pPr>
-        <w:pStyle w:val="Heading2"/>
-        <w:rPr>
-          <w:rFonts w:hint="eastAsia"/>
-        </w:rPr>
-      </w:pPr>
-      <w:r>
-        <w:t>What are the risks related to pregnancy?</w:t>
-      </w:r>
-    </w:p>
-    <w:p>
-      <w:pPr>
-        <w:jc w:val="left"/>
-        <w:rPr>
-          <w:szCs w:val="24"/>
-        </w:rPr>
-      </w:pPr>
-      <w:r>
-        <w:rPr>
-          <w:szCs w:val="24"/>
-        </w:rPr>
-        <w:t>{{</w:t>
-      </w:r>
-      <w:proofErr w:type="spellStart"/>
-      <w:r>
-        <w:rPr>
-          <w:szCs w:val="24"/>
-        </w:rPr>
-        <w:t>pregnancy_risks</w:t>
-      </w:r>
-      <w:proofErr w:type="spellEnd"/>
-      <w:r>
-        <w:rPr>
-          <w:szCs w:val="24"/>
-        </w:rPr>
-        <w:t>}}</w:t>
-      </w:r>
-      <w:r>
-        <w:rPr>
-          <w:szCs w:val="24"/>
-        </w:rPr>
-        <w:t>{{END-IF}}</w:t>
-      </w:r>
-    </w:p>
-    <w:p>
-      <w:pPr>
-        <w:jc w:val="left"/>
-      </w:pPr>
-      <w:r>
-        <w:rPr>
-          <w:szCs w:val="24"/>
-        </w:rPr>
-        <w:t xml:space="preserve">{{IF </w:t>
-      </w:r>
-      <w:proofErr w:type="spellStart"/>
-      <w:r>
-        <w:t>radiation_risks</w:t>
-      </w:r>
-      <w:proofErr w:type="spellEnd"/>
-      <w:r>
-        <w:t>}}</w:t>
-      </w:r>
-    </w:p>
-    <w:p>
-      <w:pPr>
-        <w:pStyle w:val="Heading2"/>
-        <w:rPr>
-          <w:rFonts w:hint="eastAsia"/>
-        </w:rPr>
-      </w:pPr>
-      <w:bookmarkStart w:id="4" w:name="_Hlk535331221"/>
-      <w:r>
-        <w:t>What are the risks of radiation from being in the study:</w:t>
-      </w:r>
-      <w:bookmarkEnd w:id="4"/>
-    </w:p>
-    <w:p>
-      <w:pPr>
-        <w:jc w:val="left"/>
-      </w:pPr>
-      <w:r>
-        <w:t>{{</w:t>
-      </w:r>
-      <w:proofErr w:type="spellStart"/>
-      <w:r>
-        <w:t>radiation_risks</w:t>
-      </w:r>
-      <w:proofErr w:type="spellEnd"/>
-      <w:r>
-        <w:t>}}</w:t>
-      </w:r>
-      <w:r>
-        <w:t>{{END-IF}}</w:t>
-      </w:r>
-    </w:p>
-    <w:p>
-      <w:pPr>
-        <w:pStyle w:val="Heading1"/>
-        <w:rPr>
-          <w:rFonts w:hint="eastAsia"/>
-        </w:rPr>
-      </w:pPr>
-      <w:r>
-        <w:t xml:space="preserve">WHAT ARE </w:t>
-      </w:r>
-      <w:r>
-        <w:t>THE BENEFITS OF BEING IN THE STUDY</w:t>
-      </w:r>
-      <w:r>
-        <w:t>?</w:t>
-      </w:r>
-    </w:p>
-    <w:p>
-      <w:pPr>
-        <w:jc w:val="left"/>
-        <w:rPr>
-          <w:szCs w:val="24"/>
-        </w:rPr>
-      </w:pPr>
-      <w:r>
-        <w:rPr>
-          <w:szCs w:val="24"/>
-        </w:rPr>
-        <w:t xml:space="preserve">{{IF </w:t>
-      </w:r>
-      <w:proofErr w:type="spellStart"/>
-      <w:r>
-        <w:rPr>
-          <w:szCs w:val="24"/>
-        </w:rPr>
-        <w:t>has_potential_benefits</w:t>
-      </w:r>
-      <w:proofErr w:type="spellEnd"/>
-      <w:r>
-        <w:rPr>
-          <w:szCs w:val="24"/>
-        </w:rPr>
-        <w:t>}}</w:t>
-      </w:r>
-    </w:p>
-    <w:p>
-      <w:pPr>
-        <w:jc w:val="left"/>
-        <w:rPr>
-          <w:szCs w:val="24"/>
-        </w:rPr>
-      </w:pPr>
-      <w:r>
-        <w:t>You might not benefit from being in this study. However, the potential benefit to you might be {{</w:t>
-      </w:r>
-      <w:proofErr w:type="spellStart"/>
-      <w:r>
-        <w:t>benefits_description</w:t>
-      </w:r>
-      <w:proofErr w:type="spellEnd"/>
-      <w:r>
-        <w:t>}}{{END-IF}}</w:t>
-      </w:r>
-    </w:p>
-    <w:p>
-      <w:pPr>
-        <w:jc w:val="left"/>
-        <w:rPr>
-          <w:szCs w:val="24"/>
-        </w:rPr>
-      </w:pPr>
-      <w:r>
-        <w:t xml:space="preserve">{{IF </w:t>
-      </w:r>
-      <w:proofErr w:type="spellStart"/>
-      <w:r>
-        <w:t>no_potential_benefits</w:t>
-      </w:r>
-      <w:proofErr w:type="spellEnd"/>
-      <w:r>
-        <w:t>}}</w:t>
-      </w:r>
-    </w:p>
-    <w:p>
-      <w:pPr>
-        <w:jc w:val="left"/>
-        <w:rPr>
-          <w:szCs w:val="24"/>
-        </w:rPr>
-      </w:pPr>
-      <w:r>
-        <w:t>You will not benefit from being in this study.{{END-IF}}</w:t>
-      </w:r>
-    </w:p>
-    <w:p>
-      <w:pPr>
-        <w:pStyle w:val="Heading2"/>
-        <w:rPr>
-          <w:rFonts w:hint="eastAsia"/>
-        </w:rPr>
-      </w:pPr>
-      <w:r>
-        <w:t xml:space="preserve">Are there any potential benefits to others that might result from </w:t>
-      </w:r>
-      <w:r>
-        <w:t>the study</w:t>
-      </w:r>
-      <w:r>
-        <w:t>?</w:t>
-      </w:r>
-    </w:p>
-    <w:p>
-      <w:pPr>
-        <w:jc w:val="left"/>
-        <w:rPr>
-          <w:bCs/>
-          <w:szCs w:val="24"/>
-        </w:rPr>
-      </w:pPr>
-      <w:r>
-        <w:rPr>
-          <w:szCs w:val="24"/>
-        </w:rPr>
-        <w:t>In the future, other people might benefit from this study because {{</w:t>
-      </w:r>
-      <w:proofErr w:type="spellStart"/>
-      <w:r>
-        <w:rPr>
-          <w:szCs w:val="24"/>
-        </w:rPr>
-        <w:t>benefits_others_reason</w:t>
-      </w:r>
-      <w:proofErr w:type="spellEnd"/>
-      <w:r>
-        <w:rPr>
-          <w:szCs w:val="24"/>
-        </w:rPr>
-        <w:t>}}.</w:t>
-      </w:r>
-    </w:p>
-    <w:p>
-      <w:pPr>
-        <w:pStyle w:val="Heading1"/>
-        <w:rPr>
-          <w:rFonts w:hint="eastAsia"/>
-        </w:rPr>
-      </w:pPr>
-      <w:r>
-        <w:t xml:space="preserve">WHAT OTHER OPTIONS </w:t>
-      </w:r>
-      <w:r>
-        <w:t xml:space="preserve">ARE THERE </w:t>
-      </w:r>
-      <w:r>
-        <w:t xml:space="preserve">FOR </w:t>
-      </w:r>
-      <w:r>
-        <w:t>YOU</w:t>
-      </w:r>
-      <w:r>
-        <w:t>?</w:t>
-      </w:r>
-    </w:p>
-    <w:p>
-      <w:pPr>
-        <w:ind w:right="180"/>
-        <w:jc w:val="left"/>
-        <w:rPr>
-          <w:szCs w:val="24"/>
-        </w:rPr>
-      </w:pPr>
-      <w:r>
-        <w:rPr>
-          <w:szCs w:val="24"/>
-        </w:rPr>
-        <w:t xml:space="preserve">Before you decide </w:t>
-      </w:r>
-      <w:proofErr w:type="gramStart"/>
-      <w:r>
-        <w:rPr>
-          <w:szCs w:val="24"/>
-        </w:rPr>
-        <w:t>whether or not</w:t>
-      </w:r>
-      <w:proofErr w:type="gramEnd"/>
-      <w:r>
-        <w:rPr>
-          <w:szCs w:val="24"/>
-        </w:rPr>
-        <w:t xml:space="preserve"> to be in this study, we will discuss other options that are available to you. Instead of being in this study, you could:</w:t>
-      </w:r>
-    </w:p>
-    <w:p>
-      <w:pPr>
-        <w:ind w:right="180"/>
-        <w:jc w:val="left"/>
-        <w:rPr>
-          <w:szCs w:val="24"/>
-        </w:rPr>
-      </w:pPr>
-      <w:r>
-        <w:t xml:space="preserve">{{FOR alt IN </w:t>
-      </w:r>
-      <w:proofErr w:type="spellStart"/>
-      <w:r>
-        <w:t>alternatives_list</w:t>
-      </w:r>
-      <w:proofErr w:type="spellEnd"/>
-      <w:r>
-        <w:t>}}</w:t>
+        <w:t>{{FOR alt IN alternatives_list}}</w:t>
       </w:r>
     </w:p>
     <w:p>
@@ -2357,15 +1975,7 @@
         </w:rPr>
       </w:pPr>
       <w:r>
-        <w:t xml:space="preserve">{{IF </w:t>
-      </w:r>
-      <w:proofErr w:type="spellStart"/>
-      <w:r>
-        <w:t>alternatives_advice</w:t>
-      </w:r>
-      <w:proofErr w:type="spellEnd"/>
-      <w:r>
-        <w:t>}}</w:t>
+        <w:t>{{IF alternatives_advice}}</w:t>
       </w:r>
     </w:p>
     <w:p>
@@ -2377,15 +1987,7 @@
         </w:rPr>
       </w:pPr>
       <w:r>
-        <w:t>{{</w:t>
-      </w:r>
-      <w:proofErr w:type="spellStart"/>
-      <w:r>
-        <w:t>alternatives_advice</w:t>
-      </w:r>
-      <w:proofErr w:type="spellEnd"/>
-      <w:r>
-        <w:t>}}{{END-IF}}</w:t>
+        <w:t>{{alternatives_advice}}{{END-IF}}</w:t>
       </w:r>
     </w:p>
     <w:p>
@@ -2396,6 +1998,7 @@
         </w:rPr>
       </w:pPr>
       <w:r>
+        <w:lastRenderedPageBreak/>
         <w:t xml:space="preserve">DISCUSSION </w:t>
       </w:r>
       <w:r>
@@ -2462,15 +2065,7 @@
         <w:jc w:val="left"/>
       </w:pPr>
       <w:r>
-        <w:t>{{</w:t>
-      </w:r>
-      <w:proofErr w:type="spellStart"/>
-      <w:r>
-        <w:t>return_of_results</w:t>
-      </w:r>
-      <w:proofErr w:type="spellEnd"/>
-      <w:r>
-        <w:t>}}</w:t>
+        <w:t>{{return_of_results}}</w:t>
       </w:r>
     </w:p>
     <w:p>
@@ -2481,7 +2076,6 @@
         </w:rPr>
       </w:pPr>
       <w:r>
-        <w:lastRenderedPageBreak/>
         <w:t xml:space="preserve">EARLY </w:t>
       </w:r>
       <w:r>
@@ -2496,15 +2090,7 @@
         <w:jc w:val="left"/>
       </w:pPr>
       <w:r>
-        <w:t>{{</w:t>
-      </w:r>
-      <w:proofErr w:type="spellStart"/>
-      <w:r>
-        <w:t>early_withdrawal</w:t>
-      </w:r>
-      <w:proofErr w:type="spellEnd"/>
-      <w:r>
-        <w:t>}}</w:t>
+        <w:t>{{early_withdrawal}}</w:t>
       </w:r>
     </w:p>
     <w:p>
@@ -2522,10 +2108,9 @@
       <w:r>
         <w:rPr>
           <w:rStyle w:val="CommentReference"/>
-          <w:rFonts w:ascii="Times New Roman" w:eastAsia="Times New Roman" w:hAnsi="Times New Roman"/>
-          <w:b w:val="0"/>
-          <w:caps w:val="0"/>
-          <w:spacing w:val="0"/>
+          <w:rFonts w:hint="eastAsia"/>
+          <w:sz w:val="24"/>
+          <w:szCs w:val="24"/>
         </w:rPr>
         <w:commentReference w:id="5"/>
       </w:r>
@@ -2557,9 +2142,9 @@
       <w:r>
         <w:rPr>
           <w:rStyle w:val="CommentReference"/>
-          <w:rFonts w:ascii="Times New Roman" w:eastAsia="Times New Roman" w:hAnsi="Times New Roman"/>
-          <w:b w:val="0"/>
-          <w:spacing w:val="0"/>
+          <w:rFonts w:hint="eastAsia"/>
+          <w:sz w:val="24"/>
+          <w:szCs w:val="24"/>
         </w:rPr>
         <w:commentReference w:id="6"/>
       </w:r>
@@ -2570,23 +2155,7 @@
         <w:jc w:val="left"/>
       </w:pPr>
       <w:r>
-        <w:t>As part of this study, we are obtaining specimens and data from you. We plan to store and use these specimens and data for studies other than the one described in this consent form that are going on right now, as well as studies that may be conducted in the future. The specimens and data will be kept in a way that we will still know that they came from you (i.e., they will be identifiable to us). If we use your identifiable specimens or data for future research, our study will be reviewed and approved by an Institutional Review Board who will make sure that we are protecting your confidentiality. These future studies might help us better understand {{</w:t>
-      </w:r>
-      <w:proofErr w:type="spellStart"/>
-      <w:r>
-        <w:t>disease_condition</w:t>
-      </w:r>
-      <w:proofErr w:type="spellEnd"/>
-      <w:r>
-        <w:t xml:space="preserve">}} or other diseases or conditions. This could include studies to develop other research tests, treatments, drugs, or devices, that may lead to the development of a commercial product by the NIH and/or its research or commercial partners. There are no plans to provide financial compensation </w:t>
-      </w:r>
-      <w:proofErr w:type="gramStart"/>
-      <w:r>
-        <w:t>to</w:t>
-      </w:r>
-      <w:proofErr w:type="gramEnd"/>
-      <w:r>
-        <w:t xml:space="preserve"> you if this happens. Also, it is unlikely that we will learn anything from these studies that may directly benefit you.</w:t>
+        <w:t>As part of this study, we are obtaining specimens and data from you. We plan to store and use these specimens and data for studies other than the one described in this consent form that are going on right now, as well as studies that may be conducted in the future. The specimens and data will be kept in a way that we will still know that they came from you (i.e., they will be identifiable to us). If we use your identifiable specimens or data for future research, our study will be reviewed and approved by an Institutional Review Board who will make sure that we are protecting your confidentiality. These future studies might help us better understand {{disease_condition}} or other diseases or conditions. This could include studies to develop other research tests, treatments, drugs, or devices, that may lead to the development of a commercial product by the NIH and/or its research or commercial partners. There are no plans to provide financial compensation to you if this happens. Also, it is unlikely that we will learn anything from these studies that may directly benefit you.</w:t>
       </w:r>
     </w:p>
     <w:p>
@@ -2695,12 +2264,8 @@
       </w:r>
       <w:r>
         <w:tab/>
-      </w:r>
-      <w:proofErr w:type="spellStart"/>
-      <w:r>
         <w:t>Initial</w:t>
       </w:r>
-      <w:proofErr w:type="spellEnd"/>
     </w:p>
     <w:p>
       <w:pPr>
@@ -2724,9 +2289,9 @@
       <w:r>
         <w:rPr>
           <w:rStyle w:val="CommentReference"/>
-          <w:rFonts w:ascii="Times New Roman" w:eastAsia="Times New Roman" w:hAnsi="Times New Roman"/>
-          <w:b w:val="0"/>
-          <w:spacing w:val="0"/>
+          <w:rFonts w:hint="eastAsia"/>
+          <w:sz w:val="24"/>
+          <w:szCs w:val="24"/>
         </w:rPr>
         <w:commentReference w:id="8"/>
       </w:r>
@@ -2737,15 +2302,7 @@
         <w:jc w:val="left"/>
       </w:pPr>
       <w:r>
-        <w:t xml:space="preserve">We may share your specimens and data with other researchers. </w:t>
-      </w:r>
-      <w:proofErr w:type="gramStart"/>
-      <w:r>
-        <w:t>The other</w:t>
-      </w:r>
-      <w:proofErr w:type="gramEnd"/>
-      <w:r>
-        <w:t xml:space="preserve"> researchers may be doing studies in similar areas to this study or in other unrelated areas. These researchers may be at NIH, other research centers and institutions, or at commercial entities.</w:t>
+        <w:t>We may share your specimens and data with other researchers. The other researchers may be doing studies in similar areas to this study or in other unrelated areas. These researchers may be at NIH, other research centers and institutions, or at commercial entities.</w:t>
       </w:r>
     </w:p>
     <w:p>
@@ -2758,15 +2315,8 @@
         </w:rPr>
       </w:pPr>
       <w:r>
-        <w:t>One way that we may share your data is by putting it into a large database called a repository, which is a way to make it widely available to the research community. If we do place your data in a repository, it will be labeled with a code, (not with your name or other information that could be used to easily identify you). Even though it will only be labeled with a code, some types of data</w:t>
-      </w:r>
-      <w:proofErr w:type="gramStart"/>
-      <w:r>
-        <w:t>, in</w:t>
-      </w:r>
-      <w:proofErr w:type="gramEnd"/>
-      <w:r>
-        <w:t xml:space="preserve"> particular data about your genes (called genetic or genomic data), can be used to figure out who you are, although this is difficult to do, and we think it is unlikely to happen.</w:t>
+        <w:lastRenderedPageBreak/>
+        <w:t>One way that we may share your data is by putting it into a large database called a repository, which is a way to make it widely available to the research community. If we do place your data in a repository, it will be labeled with a code, (not with your name or other information that could be used to easily identify you). Even though it will only be labeled with a code, some types of data, in particular data about your genes (called genetic or genomic data), can be used to figure out who you are, although this is difficult to do, and we think it is unlikely to happen.</w:t>
       </w:r>
     </w:p>
     <w:p>
@@ -2784,25 +2334,7 @@
           <w:i w:val="0"/>
           <w:iCs w:val="0"/>
         </w:rPr>
-        <w:t xml:space="preserve">{{IF </w:t>
-      </w:r>
-      <w:proofErr w:type="spellStart"/>
-      <w:r>
-        <w:rPr>
-          <w:rStyle w:val="Emphasis"/>
-          <w:i w:val="0"/>
-          <w:iCs w:val="0"/>
-        </w:rPr>
-        <w:t>is_open_repository</w:t>
-      </w:r>
-      <w:proofErr w:type="spellEnd"/>
-      <w:r>
-        <w:rPr>
-          <w:rStyle w:val="Emphasis"/>
-          <w:i w:val="0"/>
-          <w:iCs w:val="0"/>
-        </w:rPr>
-        <w:t>}}</w:t>
+        <w:t>{{IF is_open_repository}}</w:t>
       </w:r>
     </w:p>
     <w:p>
@@ -2830,15 +2362,7 @@
         </w:rPr>
       </w:pPr>
       <w:r>
-        <w:t xml:space="preserve">{{IF </w:t>
-      </w:r>
-      <w:proofErr w:type="spellStart"/>
-      <w:r>
-        <w:t>is_closed_repository</w:t>
-      </w:r>
-      <w:proofErr w:type="spellEnd"/>
-      <w:r>
-        <w:t>}}</w:t>
+        <w:t>{{IF is_closed_repository}}</w:t>
       </w:r>
     </w:p>
     <w:p>
@@ -2852,7 +2376,6 @@
         </w:rPr>
       </w:pPr>
       <w:r>
-        <w:lastRenderedPageBreak/>
         <w:t>The data in the repository will only be available to qualified researchers. These researchers must receive permission before they are allowed to access the data. Before receiving the data, the researchers must promise that they will not try to figure out the identity of the research participants.{{END-IF}}</w:t>
       </w:r>
     </w:p>
@@ -2940,15 +2463,8 @@
           <w:szCs w:val="24"/>
         </w:rPr>
         <w:tab/>
-      </w:r>
-      <w:proofErr w:type="spellStart"/>
-      <w:r>
-        <w:rPr>
-          <w:szCs w:val="24"/>
-        </w:rPr>
         <w:t>Initial</w:t>
       </w:r>
-      <w:proofErr w:type="spellEnd"/>
     </w:p>
     <w:p>
       <w:pPr>
@@ -3049,6 +2565,8 @@
       <w:r>
         <w:rPr>
           <w:rStyle w:val="CommentReference"/>
+          <w:sz w:val="24"/>
+          <w:szCs w:val="24"/>
         </w:rPr>
         <w:commentReference w:id="9"/>
       </w:r>
@@ -3069,15 +2587,7 @@
         </w:rPr>
       </w:pPr>
       <w:r>
-        <w:t xml:space="preserve">{{IF </w:t>
-      </w:r>
-      <w:proofErr w:type="spellStart"/>
-      <w:r>
-        <w:t>genomic_non_sensitive</w:t>
-      </w:r>
-      <w:proofErr w:type="spellEnd"/>
-      <w:r>
-        <w:t>}}</w:t>
+        <w:t>{{IF genomic_non_sensitive}}</w:t>
       </w:r>
     </w:p>
     <w:p>
@@ -3107,15 +2617,8 @@
         </w:rPr>
       </w:pPr>
       <w:r>
-        <w:t xml:space="preserve">{{IF </w:t>
-      </w:r>
-      <w:proofErr w:type="spellStart"/>
-      <w:r>
-        <w:t>genomic_sensitive</w:t>
-      </w:r>
-      <w:proofErr w:type="spellEnd"/>
-      <w:r>
-        <w:t>}}</w:t>
+        <w:lastRenderedPageBreak/>
+        <w:t>{{IF genomic_sensitive}}</w:t>
       </w:r>
     </w:p>
     <w:p>
@@ -3130,15 +2633,7 @@
         </w:rPr>
       </w:pPr>
       <w:r>
-        <w:t xml:space="preserve">Information about all the people (including you) in this study may be combined to create what is called summary information. The summary information may be placed in a database and will be made available to researchers only if they are granted permission. However, the summary information may still be shared in scientific publications without </w:t>
-      </w:r>
-      <w:proofErr w:type="gramStart"/>
-      <w:r>
-        <w:t>permissions</w:t>
-      </w:r>
-      <w:proofErr w:type="gramEnd"/>
-      <w:r>
-        <w:t>. This information will help the researchers understand if some patterns are more common than others among everyone who was a part of this study. The risk of anyone identifying you based on this information is very low.{{END-IF}}</w:t>
+        <w:t>Information about all the people (including you) in this study may be combined to create what is called summary information. The summary information may be placed in a database and will be made available to researchers only if they are granted permission. However, the summary information may still be shared in scientific publications without permissions. This information will help the researchers understand if some patterns are more common than others among everyone who was a part of this study. The risk of anyone identifying you based on this information is very low.{{END-IF}}</w:t>
       </w:r>
     </w:p>
     <w:p>
@@ -3153,16 +2648,266 @@
         <w:rPr>
           <w:szCs w:val="24"/>
         </w:rPr>
+        <w:t>{{IF may_anonymize}}</w:t>
+      </w:r>
+    </w:p>
+    <w:p>
+      <w:pPr>
+        <w:ind w:right="180"/>
+        <w:jc w:val="left"/>
+        <w:rPr>
+          <w:color w:val="0070C0"/>
+          <w:szCs w:val="24"/>
+        </w:rPr>
+      </w:pPr>
+      <w:r>
+        <w:t>In addition to the planned use and sharing described above, we might remove any labels from your specimens and data that might identify you (i.e., anonymize them), and use them or share them with other researchers for future studies at the NIH or other places. When we or the other researchers use your anonymized specimens and data for these projects, there will be no way to know that they came from you. We want to make sure that you understand that this is a possibility if you participate in this study. Once we do this, we would not be able to remove your specimens or data from these studies or prevent their use in future studies because we would not be able to tell which specimens or data belong to you.{{END-IF}}</w:t>
+      </w:r>
+    </w:p>
+    <w:p>
+      <w:pPr>
+        <w:ind w:right="180"/>
+        <w:jc w:val="left"/>
+        <w:rPr>
+          <w:color w:val="0070C0"/>
+          <w:szCs w:val="24"/>
+        </w:rPr>
+      </w:pPr>
+      <w:r>
+        <w:t>{{IF will_not_anonymize}}</w:t>
+      </w:r>
+    </w:p>
+    <w:p>
+      <w:pPr>
+        <w:ind w:right="180"/>
+        <w:jc w:val="left"/>
+        <w:rPr>
+          <w:color w:val="0070C0"/>
+          <w:szCs w:val="24"/>
+        </w:rPr>
+      </w:pPr>
+      <w:r>
+        <w:t>We will not remove any labels that might identify you (anonymize) from your specimens and data and use or share them with other researchers for future studies at the NIH or other places.{{END-IF}}</w:t>
+      </w:r>
+    </w:p>
+    <w:p>
+      <w:pPr>
+        <w:pStyle w:val="Heading2"/>
+        <w:rPr>
+          <w:rFonts w:hint="eastAsia"/>
+        </w:rPr>
+      </w:pPr>
+      <w:r>
+        <w:t>Risks of storage and sharing of specimens and data</w:t>
+      </w:r>
+    </w:p>
+    <w:p>
+      <w:pPr>
+        <w:jc w:val="left"/>
+        <w:rPr>
+          <w:b/>
+          <w:szCs w:val="24"/>
+        </w:rPr>
+      </w:pPr>
+      <w:r>
+        <w:rPr>
+          <w:szCs w:val="24"/>
+        </w:rPr>
+        <w:t xml:space="preserve">When we store your specimens and data, we take precautions to protect your information from others </w:t>
+      </w:r>
+      <w:r>
+        <w:rPr>
+          <w:szCs w:val="24"/>
+        </w:rPr>
+        <w:t>who</w:t>
+      </w:r>
+      <w:r>
+        <w:rPr>
+          <w:szCs w:val="24"/>
+        </w:rPr>
+        <w:t xml:space="preserve"> should not have access to it. When we share your specimens and data, we will do everything we can to protect your identity, for example, when appropriate, we remove information that can identify you. Even with the safeguards we put in place, we cannot guarantee that your identity will never become known, or that no one will gain unauthorized access to your information. New methods may be created in the future that could make it possible to re-identify your specimens and data.</w:t>
+      </w:r>
+    </w:p>
+    <w:p>
+      <w:pPr>
+        <w:pStyle w:val="Heading2"/>
+        <w:rPr>
+          <w:rFonts w:hint="eastAsia"/>
+        </w:rPr>
+      </w:pPr>
+      <w:r>
+        <w:t>Can you change your mind about use and sharing for future research?</w:t>
+      </w:r>
+    </w:p>
+    <w:p>
+      <w:pPr>
+        <w:ind w:right="180"/>
+        <w:jc w:val="left"/>
+        <w:rPr>
+          <w:szCs w:val="24"/>
+        </w:rPr>
+      </w:pPr>
+      <w:r>
+        <w:rPr>
+          <w:szCs w:val="24"/>
+        </w:rPr>
+        <w:t xml:space="preserve">If you change your mind and do not want us to store and use your specimens and data for future studies, you should contact the study team. We will do our best to comply with your request but cannot guarantee that we will always be able to destroy your specimens and data. For example, if some research with your specimens and data is already complete, the information from that research may still be used. Also, if the specimens and data have been shared already, it might not be possible to withdraw them. </w:t>
+      </w:r>
+    </w:p>
+    <w:p>
+      <w:pPr>
+        <w:pStyle w:val="Heading2"/>
+        <w:rPr>
+          <w:rFonts w:hint="eastAsia"/>
+        </w:rPr>
+      </w:pPr>
+      <w:r>
+        <w:t>How long will your specimens and data be stored by the NIH?</w:t>
+      </w:r>
+    </w:p>
+    <w:p>
+      <w:pPr>
+        <w:ind w:right="180"/>
+        <w:jc w:val="left"/>
+        <w:rPr>
+          <w:szCs w:val="24"/>
+        </w:rPr>
+      </w:pPr>
+      <w:r>
+        <w:rPr>
+          <w:szCs w:val="24"/>
+        </w:rPr>
+        <w:t>Your specimens and data may be stored by the NIH {{specimen_storage_duration}}.</w:t>
+      </w:r>
+    </w:p>
+    <w:p>
+      <w:pPr>
+        <w:pStyle w:val="Heading1"/>
+        <w:rPr>
+          <w:rFonts w:hint="eastAsia"/>
+        </w:rPr>
+      </w:pPr>
+      <w:bookmarkStart w:id="10" w:name="_Hlk57730381"/>
+      <w:r>
+        <w:lastRenderedPageBreak/>
+        <w:t>PAYMENT</w:t>
+      </w:r>
+    </w:p>
+    <w:p>
+      <w:pPr>
+        <w:pStyle w:val="Heading2"/>
+        <w:rPr>
+          <w:rFonts w:hint="eastAsia"/>
+        </w:rPr>
+      </w:pPr>
+      <w:r>
+        <w:t xml:space="preserve">Will </w:t>
+      </w:r>
+      <w:r>
+        <w:t>you</w:t>
+      </w:r>
+      <w:r>
+        <w:t xml:space="preserve"> </w:t>
+      </w:r>
+      <w:r>
+        <w:t>receive any type of payment</w:t>
+      </w:r>
+      <w:r>
+        <w:t xml:space="preserve"> for taking part</w:t>
+      </w:r>
+      <w:r>
+        <w:t xml:space="preserve"> in </w:t>
+      </w:r>
+      <w:r>
+        <w:t xml:space="preserve">this </w:t>
+      </w:r>
+      <w:r>
+        <w:t>study?</w:t>
+      </w:r>
+    </w:p>
+    <w:p>
+      <w:pPr>
+        <w:ind w:right="180"/>
+        <w:jc w:val="left"/>
+        <w:rPr>
+          <w:szCs w:val="24"/>
+        </w:rPr>
+      </w:pPr>
+      <w:r>
+        <w:rPr>
+          <w:szCs w:val="24"/>
+        </w:rPr>
+        <w:t>{{IF no_payment}}</w:t>
+      </w:r>
+    </w:p>
+    <w:p>
+      <w:pPr>
+        <w:ind w:right="180"/>
+        <w:jc w:val="left"/>
+        <w:rPr>
+          <w:color w:val="0070C0"/>
+          <w:szCs w:val="24"/>
+        </w:rPr>
+      </w:pPr>
+      <w:r>
+        <w:t>You will not receive any payment for taking part in this study.{{END-IF}}</w:t>
+      </w:r>
+    </w:p>
+    <w:p>
+      <w:pPr>
+        <w:ind w:right="180"/>
+        <w:jc w:val="left"/>
+        <w:rPr>
+          <w:color w:val="0070C0"/>
+          <w:szCs w:val="24"/>
+        </w:rPr>
+      </w:pPr>
+      <w:r>
+        <w:t>{{IF has_payment}}</w:t>
+      </w:r>
+    </w:p>
+    <w:p>
+      <w:pPr>
+        <w:ind w:right="180"/>
+        <w:jc w:val="left"/>
+        <w:rPr>
+          <w:color w:val="0070C0"/>
+          <w:szCs w:val="24"/>
+        </w:rPr>
+      </w:pPr>
+      <w:r>
+        <w:t>{{payment_details}}</w:t>
+      </w:r>
+    </w:p>
+    <w:p>
+      <w:pPr>
+        <w:ind w:right="180"/>
+        <w:jc w:val="left"/>
+      </w:pPr>
+      <w:r>
+        <w:t>If you are unable to finish the study, you will receive {{partial_payment_details}} for the parts you completed. If you have unpaid debt to the federal government, please be aware that some or all of your compensation may be automatically reduced to repay that debt on your behalf.{{END-IF}}</w:t>
+      </w:r>
+    </w:p>
+    <w:p>
+      <w:pPr>
+        <w:ind w:right="180"/>
+        <w:jc w:val="left"/>
+        <w:rPr>
+          <w:szCs w:val="24"/>
+        </w:rPr>
+      </w:pPr>
+      <w:r>
+        <w:rPr>
+          <w:szCs w:val="24"/>
+        </w:rPr>
         <w:t xml:space="preserve">{{IF </w:t>
       </w:r>
-      <w:proofErr w:type="spellStart"/>
-      <w:r>
-        <w:rPr>
-          <w:szCs w:val="24"/>
-        </w:rPr>
-        <w:t>may_anonymize</w:t>
-      </w:r>
-      <w:proofErr w:type="spellEnd"/>
+      <w:r>
+        <w:rPr>
+          <w:szCs w:val="24"/>
+        </w:rPr>
+        <w:t>payment_exceeds</w:t>
+      </w:r>
       <w:r>
         <w:rPr>
           <w:szCs w:val="24"/>
@@ -3180,452 +2925,99 @@
         </w:rPr>
       </w:pPr>
       <w:r>
-        <w:lastRenderedPageBreak/>
-        <w:t>In addition to the planned use and sharing described above, we might remove any labels from your specimens and data that might identify you (i.e., anonymize them), and use them or share them with other researchers for future studies at the NIH or other places. When we or the other researchers use your anonymized specimens and data for these projects, there will be no way to know that they came from you. We want to make sure that you understand that this is a possibility if you participate in this study. Once we do this, we would not be able to remove your specimens or data from these studies or prevent their use in future studies because we would not be able to tell which specimens or data belong to you.{{END-IF}}</w:t>
-      </w:r>
-    </w:p>
-    <w:p>
-      <w:pPr>
-        <w:ind w:right="180"/>
-        <w:jc w:val="left"/>
-        <w:rPr>
-          <w:color w:val="0070C0"/>
-          <w:szCs w:val="24"/>
-        </w:rPr>
-      </w:pPr>
-      <w:r>
-        <w:t xml:space="preserve">{{IF </w:t>
-      </w:r>
-      <w:proofErr w:type="spellStart"/>
-      <w:r>
-        <w:t>will_not_anonymize</w:t>
-      </w:r>
-      <w:proofErr w:type="spellEnd"/>
+        <w:t xml:space="preserve">Study compensation may be considered taxable income that is reportable to the Internal Revenue Service (IRS).  A “Form 1099-Other Income” will be sent to you if your total payments for research participation exceeds the threshold to be reported as taxable income in the calendar year of your participation. Please contact the Clinical Research Volunteer Program at CC-PRPLRVSSupport@cc.nih.gov if you have any questions. </w:t>
+      </w:r>
+      <w:r>
+        <w:t>{{END-IF}}</w:t>
+      </w:r>
+    </w:p>
+    <w:p>
+      <w:pPr>
+        <w:pStyle w:val="Heading1"/>
+        <w:rPr>
+          <w:rFonts w:hint="eastAsia"/>
+        </w:rPr>
+      </w:pPr>
+      <w:r>
+        <w:t>REIMBURSEMENT</w:t>
+      </w:r>
+    </w:p>
+    <w:p>
+      <w:pPr>
+        <w:pStyle w:val="Heading2"/>
+        <w:rPr>
+          <w:rFonts w:hint="eastAsia"/>
+        </w:rPr>
+      </w:pPr>
+      <w:r>
+        <w:t xml:space="preserve">Will </w:t>
+      </w:r>
+      <w:r>
+        <w:t>you</w:t>
+      </w:r>
+      <w:r>
+        <w:t xml:space="preserve"> receive r</w:t>
+      </w:r>
+      <w:r>
+        <w:t xml:space="preserve">eimbursement by NIH </w:t>
+      </w:r>
+      <w:r>
+        <w:t xml:space="preserve">as </w:t>
+      </w:r>
+      <w:r>
+        <w:t>p</w:t>
+      </w:r>
+      <w:r>
+        <w:t xml:space="preserve">art </w:t>
+      </w:r>
+      <w:r>
+        <w:t xml:space="preserve">of </w:t>
+      </w:r>
+      <w:r>
+        <w:t>your</w:t>
+      </w:r>
+      <w:r>
+        <w:t xml:space="preserve"> </w:t>
+      </w:r>
+      <w:r>
+        <w:t>p</w:t>
+      </w:r>
+      <w:r>
+        <w:t>articipation</w:t>
+      </w:r>
+      <w:r>
+        <w:t>?</w:t>
+      </w:r>
+    </w:p>
+    <w:p>
+      <w:pPr>
+        <w:jc w:val="left"/>
+      </w:pPr>
+      <w:r>
+        <w:t>{{</w:t>
+      </w:r>
+      <w:r>
+        <w:t xml:space="preserve">IF </w:t>
+      </w:r>
+      <w:r>
+        <w:t>reimbursement_</w:t>
+      </w:r>
+      <w:r>
+        <w:t>true</w:t>
+      </w:r>
       <w:r>
         <w:t>}}</w:t>
       </w:r>
-    </w:p>
-    <w:p>
-      <w:pPr>
-        <w:ind w:right="180"/>
-        <w:jc w:val="left"/>
-        <w:rPr>
-          <w:color w:val="0070C0"/>
-          <w:szCs w:val="24"/>
-        </w:rPr>
-      </w:pPr>
-      <w:r>
-        <w:t>We will not remove any labels that might identify you (anonymize) from your specimens and data and use or share them with other researchers for future studies at the NIH or other places.{{END-IF}}</w:t>
-      </w:r>
-    </w:p>
-    <w:p>
-      <w:pPr>
-        <w:pStyle w:val="Heading2"/>
-        <w:rPr>
-          <w:rFonts w:hint="eastAsia"/>
-        </w:rPr>
-      </w:pPr>
-      <w:r>
-        <w:t>Risks of storage and sharing of specimens and data</w:t>
-      </w:r>
-    </w:p>
-    <w:p>
-      <w:pPr>
-        <w:jc w:val="left"/>
-        <w:rPr>
-          <w:b/>
-          <w:szCs w:val="24"/>
-        </w:rPr>
-      </w:pPr>
-      <w:r>
-        <w:rPr>
-          <w:szCs w:val="24"/>
-        </w:rPr>
-        <w:t xml:space="preserve">When we store your specimens and data, we take precautions to protect your information from others </w:t>
-      </w:r>
-      <w:r>
-        <w:rPr>
-          <w:szCs w:val="24"/>
-        </w:rPr>
-        <w:t>who</w:t>
-      </w:r>
-      <w:r>
-        <w:rPr>
-          <w:szCs w:val="24"/>
-        </w:rPr>
-        <w:t xml:space="preserve"> should not have access to it. When we share your specimens and data, we will do everything we can to protect your identity, for example, when appropriate, we remove information that can identify you. Even with the safeguards we put in place, we cannot guarantee that your identity will never become known, or that no one will gain unauthorized access to your information. New methods may be created in the future that could make it possible to re-identify your specimens and data.</w:t>
-      </w:r>
-    </w:p>
-    <w:p>
-      <w:pPr>
-        <w:pStyle w:val="Heading2"/>
-        <w:rPr>
-          <w:rFonts w:hint="eastAsia"/>
-        </w:rPr>
-      </w:pPr>
-      <w:r>
-        <w:t>Can you change your mind about use and sharing for future research?</w:t>
-      </w:r>
-    </w:p>
-    <w:p>
-      <w:pPr>
-        <w:ind w:right="180"/>
-        <w:jc w:val="left"/>
-        <w:rPr>
-          <w:szCs w:val="24"/>
-        </w:rPr>
-      </w:pPr>
-      <w:r>
-        <w:rPr>
-          <w:szCs w:val="24"/>
-        </w:rPr>
-        <w:t xml:space="preserve">If you change your mind and do not want us to store and use your specimens and data for future studies, you should contact the study team. We will do our best to comply with your request but cannot guarantee that we will always be able to destroy your specimens and data. For example, if some research with your specimens and data is already complete, the information from that research may still be used. Also, if the specimens and data have been shared already, it might not be possible to withdraw them. </w:t>
-      </w:r>
-    </w:p>
-    <w:p>
-      <w:pPr>
-        <w:pStyle w:val="Heading2"/>
-        <w:rPr>
-          <w:rFonts w:hint="eastAsia"/>
-        </w:rPr>
-      </w:pPr>
-      <w:r>
-        <w:t>How long will your specimens and data be stored by the NIH?</w:t>
-      </w:r>
-    </w:p>
-    <w:p>
-      <w:pPr>
-        <w:ind w:right="180"/>
-        <w:jc w:val="left"/>
-        <w:rPr>
-          <w:szCs w:val="24"/>
-        </w:rPr>
-      </w:pPr>
-      <w:r>
-        <w:rPr>
-          <w:szCs w:val="24"/>
-        </w:rPr>
-        <w:t>Your specimens and data may be stored by the NIH {{</w:t>
-      </w:r>
-      <w:proofErr w:type="spellStart"/>
-      <w:r>
-        <w:rPr>
-          <w:szCs w:val="24"/>
-        </w:rPr>
-        <w:t>specimen_storage_duration</w:t>
-      </w:r>
-      <w:proofErr w:type="spellEnd"/>
-      <w:r>
-        <w:rPr>
-          <w:szCs w:val="24"/>
-        </w:rPr>
-        <w:t>}}.</w:t>
-      </w:r>
-    </w:p>
-    <w:p>
-      <w:pPr>
-        <w:pStyle w:val="Heading1"/>
-        <w:rPr>
-          <w:rFonts w:hint="eastAsia"/>
-        </w:rPr>
-      </w:pPr>
-      <w:bookmarkStart w:id="10" w:name="_Hlk57730381"/>
-      <w:r>
-        <w:t>PAYMENT</w:t>
-      </w:r>
-    </w:p>
-    <w:p>
-      <w:pPr>
-        <w:pStyle w:val="Heading2"/>
-        <w:rPr>
-          <w:rFonts w:hint="eastAsia"/>
-        </w:rPr>
-      </w:pPr>
-      <w:r>
-        <w:t xml:space="preserve">Will </w:t>
-      </w:r>
-      <w:r>
-        <w:t>you</w:t>
-      </w:r>
-      <w:r>
-        <w:t xml:space="preserve"> </w:t>
-      </w:r>
-      <w:r>
-        <w:t>receive any type of payment</w:t>
-      </w:r>
-      <w:r>
-        <w:t xml:space="preserve"> for taking part</w:t>
-      </w:r>
-      <w:r>
-        <w:t xml:space="preserve"> in </w:t>
-      </w:r>
-      <w:r>
-        <w:t xml:space="preserve">this </w:t>
-      </w:r>
-      <w:r>
-        <w:t>study?</w:t>
-      </w:r>
-    </w:p>
-    <w:p>
-      <w:pPr>
-        <w:ind w:right="180"/>
-        <w:jc w:val="left"/>
-        <w:rPr>
-          <w:szCs w:val="24"/>
-        </w:rPr>
-      </w:pPr>
-      <w:r>
-        <w:rPr>
-          <w:szCs w:val="24"/>
-        </w:rPr>
-        <w:t xml:space="preserve">{{IF </w:t>
-      </w:r>
-      <w:proofErr w:type="spellStart"/>
-      <w:r>
-        <w:rPr>
-          <w:szCs w:val="24"/>
-        </w:rPr>
-        <w:t>no_payment</w:t>
-      </w:r>
-      <w:proofErr w:type="spellEnd"/>
-      <w:r>
-        <w:rPr>
-          <w:szCs w:val="24"/>
-        </w:rPr>
-        <w:t>}}</w:t>
-      </w:r>
-    </w:p>
-    <w:p>
-      <w:pPr>
-        <w:ind w:right="180"/>
-        <w:jc w:val="left"/>
-        <w:rPr>
-          <w:color w:val="0070C0"/>
-          <w:szCs w:val="24"/>
-        </w:rPr>
-      </w:pPr>
-      <w:r>
-        <w:t>You will not receive any payment for taking part in this study.{{END-IF}}</w:t>
-      </w:r>
-    </w:p>
-    <w:p>
-      <w:pPr>
-        <w:ind w:right="180"/>
-        <w:jc w:val="left"/>
-        <w:rPr>
-          <w:color w:val="0070C0"/>
-          <w:szCs w:val="24"/>
-        </w:rPr>
-      </w:pPr>
-      <w:r>
-        <w:t xml:space="preserve">{{IF </w:t>
-      </w:r>
-      <w:proofErr w:type="spellStart"/>
-      <w:r>
-        <w:t>has_payment</w:t>
-      </w:r>
-      <w:proofErr w:type="spellEnd"/>
-      <w:r>
-        <w:t>}}</w:t>
-      </w:r>
-    </w:p>
-    <w:p>
-      <w:pPr>
-        <w:ind w:right="180"/>
-        <w:jc w:val="left"/>
-        <w:rPr>
-          <w:color w:val="0070C0"/>
-          <w:szCs w:val="24"/>
-        </w:rPr>
-      </w:pPr>
-      <w:r>
-        <w:t>{{</w:t>
-      </w:r>
-      <w:proofErr w:type="spellStart"/>
-      <w:r>
-        <w:t>payment_details</w:t>
-      </w:r>
-      <w:proofErr w:type="spellEnd"/>
-      <w:r>
-        <w:t>}}</w:t>
-      </w:r>
-    </w:p>
-    <w:p>
-      <w:pPr>
-        <w:ind w:right="180"/>
-        <w:jc w:val="left"/>
-      </w:pPr>
-      <w:r>
-        <w:lastRenderedPageBreak/>
-        <w:t>If you are unable to finish the study, you will receive {{</w:t>
-      </w:r>
-      <w:proofErr w:type="spellStart"/>
-      <w:r>
-        <w:t>partial_payment_details</w:t>
-      </w:r>
-      <w:proofErr w:type="spellEnd"/>
-      <w:r>
-        <w:t xml:space="preserve">}} for the parts you completed. If you have unpaid debt to the federal government, please be aware that some or </w:t>
-      </w:r>
-      <w:proofErr w:type="gramStart"/>
-      <w:r>
-        <w:t>all of</w:t>
-      </w:r>
-      <w:proofErr w:type="gramEnd"/>
-      <w:r>
-        <w:t xml:space="preserve"> your compensation may be automatically reduced to repay that debt on your behalf.{{END-IF}}</w:t>
-      </w:r>
-    </w:p>
-    <w:p>
-      <w:pPr>
-        <w:ind w:right="180"/>
-        <w:jc w:val="left"/>
-        <w:rPr>
-          <w:szCs w:val="24"/>
-        </w:rPr>
-      </w:pPr>
-      <w:r>
-        <w:rPr>
-          <w:szCs w:val="24"/>
-        </w:rPr>
-        <w:t xml:space="preserve">{{IF </w:t>
-      </w:r>
-      <w:proofErr w:type="spellStart"/>
-      <w:r>
-        <w:rPr>
-          <w:szCs w:val="24"/>
-        </w:rPr>
-        <w:t>payment_exceeds</w:t>
-      </w:r>
-      <w:proofErr w:type="spellEnd"/>
-      <w:r>
-        <w:rPr>
-          <w:szCs w:val="24"/>
-        </w:rPr>
-        <w:t>}}</w:t>
-      </w:r>
-    </w:p>
-    <w:p>
-      <w:pPr>
-        <w:ind w:right="180"/>
-        <w:jc w:val="left"/>
-        <w:rPr>
-          <w:color w:val="0070C0"/>
-          <w:szCs w:val="24"/>
-        </w:rPr>
-      </w:pPr>
-      <w:r>
-        <w:t xml:space="preserve">Study compensation may be considered taxable income that is reportable to the Internal Revenue Service (IRS).  A “Form 1099-Other Income” will be sent to you if your total payments for research participation exceeds the threshold to be reported as taxable income in the calendar year of your participation. Please contact the Clinical Research Volunteer Program at CC-PRPLRVSSupport@cc.nih.gov if you have any questions. </w:t>
-      </w:r>
-      <w:r>
-        <w:t>{{END-IF}}</w:t>
-      </w:r>
-    </w:p>
-    <w:p>
-      <w:pPr>
-        <w:pStyle w:val="Heading1"/>
-        <w:rPr>
-          <w:rFonts w:hint="eastAsia"/>
-        </w:rPr>
-      </w:pPr>
-      <w:r>
-        <w:t>REIMBURSEMENT</w:t>
-      </w:r>
-    </w:p>
-    <w:p>
-      <w:pPr>
-        <w:pStyle w:val="Heading2"/>
-        <w:rPr>
-          <w:rFonts w:hint="eastAsia"/>
-        </w:rPr>
-      </w:pPr>
-      <w:r>
-        <w:t xml:space="preserve">Will </w:t>
-      </w:r>
-      <w:r>
-        <w:t>you</w:t>
-      </w:r>
-      <w:r>
-        <w:t xml:space="preserve"> receive r</w:t>
-      </w:r>
-      <w:r>
-        <w:t xml:space="preserve">eimbursement by NIH </w:t>
-      </w:r>
-      <w:r>
-        <w:t xml:space="preserve">as </w:t>
-      </w:r>
-      <w:r>
-        <w:t>p</w:t>
-      </w:r>
-      <w:r>
-        <w:t xml:space="preserve">art </w:t>
-      </w:r>
-      <w:r>
-        <w:t xml:space="preserve">of </w:t>
-      </w:r>
-      <w:r>
-        <w:t>your</w:t>
-      </w:r>
-      <w:r>
-        <w:t xml:space="preserve"> </w:t>
-      </w:r>
-      <w:r>
-        <w:t>p</w:t>
-      </w:r>
-      <w:r>
-        <w:t>articipation</w:t>
-      </w:r>
-      <w:r>
-        <w:t>?</w:t>
-      </w:r>
-    </w:p>
-    <w:p>
-      <w:pPr>
-        <w:jc w:val="left"/>
-      </w:pPr>
-      <w:r>
-        <w:t>{{</w:t>
-      </w:r>
-      <w:r>
-        <w:t xml:space="preserve">IF </w:t>
-      </w:r>
-      <w:proofErr w:type="spellStart"/>
-      <w:r>
-        <w:t>reimbursement_</w:t>
-      </w:r>
-      <w:r>
-        <w:t>true</w:t>
-      </w:r>
-      <w:proofErr w:type="spellEnd"/>
-      <w:r>
-        <w:t>}}</w:t>
-      </w:r>
-      <w:r>
-        <w:t>{{</w:t>
-      </w:r>
-      <w:proofErr w:type="spellStart"/>
-      <w:r>
-        <w:t>reimbursement_info</w:t>
-      </w:r>
-      <w:proofErr w:type="spellEnd"/>
-      <w:r>
-        <w:t>}}</w:t>
-      </w:r>
-    </w:p>
-    <w:p>
-      <w:pPr>
-        <w:jc w:val="left"/>
-      </w:pPr>
-      <w:r>
-        <w:t xml:space="preserve">{{IF </w:t>
-      </w:r>
-      <w:proofErr w:type="spellStart"/>
-      <w:r>
-        <w:t>reimbursement_flat_rate</w:t>
-      </w:r>
-      <w:proofErr w:type="spellEnd"/>
-      <w:r>
-        <w:t>}}</w:t>
+      <w:r>
+        <w:t>{{reimbursement_info}}</w:t>
+      </w:r>
+    </w:p>
+    <w:p>
+      <w:pPr>
+        <w:jc w:val="left"/>
+      </w:pPr>
+      <w:r>
+        <w:t>{{IF reimbursement_flat_rate}}</w:t>
       </w:r>
     </w:p>
     <w:p>
@@ -3636,15 +3028,7 @@
         <w:t xml:space="preserve">Parents and participants will be reimbursed a total per diem of </w:t>
       </w:r>
       <w:r>
-        <w:t>{{</w:t>
-      </w:r>
-      <w:proofErr w:type="spellStart"/>
-      <w:r>
-        <w:t>per_diem_amount</w:t>
-      </w:r>
-      <w:proofErr w:type="spellEnd"/>
-      <w:r>
-        <w:t>}}</w:t>
+        <w:t>{{per_diem_amount}}</w:t>
       </w:r>
       <w:r>
         <w:t xml:space="preserve"> to offset the costs of meals and incidentals (for example, cab fare).</w:t>
@@ -3658,15 +3042,7 @@
         <w:jc w:val="left"/>
       </w:pPr>
       <w:r>
-        <w:t xml:space="preserve">{{IF </w:t>
-      </w:r>
-      <w:proofErr w:type="spellStart"/>
-      <w:r>
-        <w:t>reimbursement_travel_arranged</w:t>
-      </w:r>
-      <w:proofErr w:type="spellEnd"/>
-      <w:r>
-        <w:t>}}</w:t>
+        <w:t>{{IF reimbursement_travel_arranged}}</w:t>
       </w:r>
     </w:p>
     <w:p>
@@ -3685,15 +3061,7 @@
         <w:jc w:val="left"/>
       </w:pPr>
       <w:r>
-        <w:t xml:space="preserve">{{IF </w:t>
-      </w:r>
-      <w:proofErr w:type="spellStart"/>
-      <w:r>
-        <w:t>reimbursement_false</w:t>
-      </w:r>
-      <w:proofErr w:type="spellEnd"/>
-      <w:r>
-        <w:t>}}</w:t>
+        <w:t>{{IF reimbursement_false}}</w:t>
       </w:r>
     </w:p>
     <w:p>
@@ -3771,53 +3139,30 @@
         <w:rPr>
           <w:szCs w:val="24"/>
         </w:rPr>
+        <w:t>{{IF cost_additional}}</w:t>
+      </w:r>
+    </w:p>
+    <w:p>
+      <w:pPr>
+        <w:ind w:right="180"/>
+        <w:jc w:val="left"/>
+        <w:rPr>
+          <w:color w:val="000000"/>
+          <w:szCs w:val="24"/>
+        </w:rPr>
+      </w:pPr>
+      <w:r>
+        <w:lastRenderedPageBreak/>
+        <w:t>{{cost_additional}}{{END-IF}}</w:t>
+      </w:r>
+    </w:p>
+    <w:p>
+      <w:r>
         <w:t xml:space="preserve">{{IF </w:t>
       </w:r>
-      <w:proofErr w:type="spellStart"/>
-      <w:r>
-        <w:rPr>
-          <w:szCs w:val="24"/>
-        </w:rPr>
-        <w:t>cost_additional</w:t>
-      </w:r>
-      <w:proofErr w:type="spellEnd"/>
-      <w:r>
-        <w:rPr>
-          <w:szCs w:val="24"/>
-        </w:rPr>
-        <w:t>}}</w:t>
-      </w:r>
-    </w:p>
-    <w:p>
-      <w:pPr>
-        <w:ind w:right="180"/>
-        <w:jc w:val="left"/>
-        <w:rPr>
-          <w:color w:val="000000"/>
-          <w:szCs w:val="24"/>
-        </w:rPr>
-      </w:pPr>
-      <w:r>
-        <w:t>{{</w:t>
-      </w:r>
-      <w:proofErr w:type="spellStart"/>
-      <w:r>
-        <w:t>cost_additional</w:t>
-      </w:r>
-      <w:proofErr w:type="spellEnd"/>
-      <w:r>
-        <w:t>}}{{END-IF}}</w:t>
-      </w:r>
-    </w:p>
-    <w:p>
-      <w:r>
-        <w:t xml:space="preserve">{{IF </w:t>
-      </w:r>
-      <w:proofErr w:type="spellStart"/>
       <w:r>
         <w:t>covered_protocol</w:t>
       </w:r>
-      <w:proofErr w:type="spellEnd"/>
       <w:r>
         <w:t>}}</w:t>
       </w:r>
@@ -3849,15 +3194,7 @@
           <w:rFonts w:eastAsia="Times"/>
           <w:szCs w:val="24"/>
         </w:rPr>
-        <w:t xml:space="preserve">The NIH reviews NIH staff researchers at least yearly for conflicts of interest. This process is detailed in a COI Guide. You may ask your research team for a copy of the COI Guide or for more information. Members of the research team who do not work for NIH are expected to </w:t>
-      </w:r>
-      <w:r>
-        <w:rPr>
-          <w:rFonts w:eastAsia="Times"/>
-          <w:szCs w:val="24"/>
-        </w:rPr>
-        <w:lastRenderedPageBreak/>
-        <w:t>follow these guidelines or the guidelines of their home institution, but they do not need to report their personal finances to the NIH.</w:t>
+        <w:t>The NIH reviews NIH staff researchers at least yearly for conflicts of interest. This process is detailed in a COI Guide. You may ask your research team for a copy of the COI Guide or for more information. Members of the research team who do not work for NIH are expected to follow these guidelines or the guidelines of their home institution, but they do not need to report their personal finances to the NIH.</w:t>
       </w:r>
     </w:p>
     <w:p>
@@ -3875,21 +3212,7 @@
         <w:rPr>
           <w:szCs w:val="24"/>
         </w:rPr>
-        <w:t xml:space="preserve">{{IF </w:t>
-      </w:r>
-      <w:proofErr w:type="spellStart"/>
-      <w:r>
-        <w:rPr>
-          <w:szCs w:val="24"/>
-        </w:rPr>
-        <w:t>coi_no_agreements</w:t>
-      </w:r>
-      <w:proofErr w:type="spellEnd"/>
-      <w:r>
-        <w:rPr>
-          <w:szCs w:val="24"/>
-        </w:rPr>
-        <w:t>}}</w:t>
+        <w:t>{{IF coi_no_agreements}}</w:t>
       </w:r>
     </w:p>
     <w:p>
@@ -3919,15 +3242,7 @@
         </w:rPr>
       </w:pPr>
       <w:r>
-        <w:t xml:space="preserve">{{IF </w:t>
-      </w:r>
-      <w:proofErr w:type="spellStart"/>
-      <w:r>
-        <w:t>coi_tech_license</w:t>
-      </w:r>
-      <w:proofErr w:type="spellEnd"/>
-      <w:r>
-        <w:t>}}</w:t>
+        <w:t>{{IF coi_tech_license}}</w:t>
       </w:r>
     </w:p>
     <w:p>
@@ -3942,23 +3257,7 @@
         </w:rPr>
       </w:pPr>
       <w:r>
-        <w:t>The NIH and the research team for this study have developed {{</w:t>
-      </w:r>
-      <w:proofErr w:type="spellStart"/>
-      <w:r>
-        <w:t>coi_product_description</w:t>
-      </w:r>
-      <w:proofErr w:type="spellEnd"/>
-      <w:r>
-        <w:t>}} being used in this study. This means it is possible that the results of this study could lead to payments to NIH. By law, the government is required to share such payments with the employee inventors. You will not receive any money from the development of {{</w:t>
-      </w:r>
-      <w:proofErr w:type="spellStart"/>
-      <w:r>
-        <w:t>coi_product_name</w:t>
-      </w:r>
-      <w:proofErr w:type="spellEnd"/>
-      <w:r>
-        <w:t>}}.{{END-IF}}</w:t>
+        <w:t>The NIH and the research team for this study have developed {{coi_product_description}} being used in this study. This means it is possible that the results of this study could lead to payments to NIH. By law, the government is required to share such payments with the employee inventors. You will not receive any money from the development of {{coi_product_name}}.{{END-IF}}</w:t>
       </w:r>
     </w:p>
     <w:p>
@@ -3973,15 +3272,7 @@
         </w:rPr>
       </w:pPr>
       <w:r>
-        <w:t xml:space="preserve">{{IF </w:t>
-      </w:r>
-      <w:proofErr w:type="spellStart"/>
-      <w:r>
-        <w:t>coi_crada</w:t>
-      </w:r>
-      <w:proofErr w:type="spellEnd"/>
-      <w:r>
-        <w:t>}}</w:t>
+        <w:t>{{IF coi_crada}}</w:t>
       </w:r>
     </w:p>
     <w:p>
@@ -3996,23 +3287,7 @@
         </w:rPr>
       </w:pPr>
       <w:r>
-        <w:t>The NIH and the research team for this study are using {{</w:t>
-      </w:r>
-      <w:proofErr w:type="spellStart"/>
-      <w:r>
-        <w:t>coi_product_description</w:t>
-      </w:r>
-      <w:proofErr w:type="spellEnd"/>
-      <w:r>
-        <w:t>}} developed by {{</w:t>
-      </w:r>
-      <w:proofErr w:type="spellStart"/>
-      <w:r>
-        <w:t>coi_company_name</w:t>
-      </w:r>
-      <w:proofErr w:type="spellEnd"/>
-      <w:r>
-        <w:t>}} through a collaboration between your study team and the company. The company also provides financial support for this study.{{END-IF}}</w:t>
+        <w:t>The NIH and the research team for this study are using {{coi_product_description}} developed by {{coi_company_name}} through a collaboration between your study team and the company. The company also provides financial support for this study.{{END-IF}}</w:t>
       </w:r>
     </w:p>
     <w:p>
@@ -4027,15 +3302,7 @@
         </w:rPr>
       </w:pPr>
       <w:r>
-        <w:t xml:space="preserve">{{IF </w:t>
-      </w:r>
-      <w:proofErr w:type="spellStart"/>
-      <w:r>
-        <w:t>coi_cta</w:t>
-      </w:r>
-      <w:proofErr w:type="spellEnd"/>
-      <w:r>
-        <w:t>}}</w:t>
+        <w:t>{{IF coi_cta}}</w:t>
       </w:r>
     </w:p>
     <w:p>
@@ -4052,34 +3319,6 @@
       <w:r>
         <w:t>{{coi_company_name}} is providing {{coi_product_provision}} for this study to NIH without charge{{= coi_through_program ? ` through the ${coi_program_name}` : `` }}. No NIH employee involved in this study receives any payment or other benefits from {{coi_company_name}}{{= coi_through_program ? ` or ${coi_program_name}` : `` }}.</w:t>
       </w:r>
-      <w:proofErr w:type="spellStart"/>
-      <w:r/>
-      <w:proofErr w:type="spellEnd"/>
-      <w:r/>
-      <w:proofErr w:type="spellStart"/>
-      <w:r/>
-      <w:proofErr w:type="spellEnd"/>
-      <w:r/>
-      <w:proofErr w:type="spellStart"/>
-      <w:r/>
-      <w:proofErr w:type="spellEnd"/>
-      <w:r/>
-      <w:proofErr w:type="spellStart"/>
-      <w:r/>
-      <w:proofErr w:type="spellEnd"/>
-      <w:r/>
-      <w:proofErr w:type="spellStart"/>
-      <w:r/>
-      <w:proofErr w:type="spellEnd"/>
-      <w:r/>
-      <w:proofErr w:type="spellStart"/>
-      <w:r/>
-      <w:proofErr w:type="spellEnd"/>
-      <w:r/>
-      <w:proofErr w:type="spellStart"/>
-      <w:r/>
-      <w:proofErr w:type="spellEnd"/>
-      <w:r/>
     </w:p>
     <w:p>
       <w:pPr>
@@ -4128,21 +3367,7 @@
         <w:rPr>
           <w:szCs w:val="24"/>
         </w:rPr>
-        <w:t xml:space="preserve">The study results may be published in scientific or medical journals. This includes positive, negative, and inconclusive results. It will not be possible to identify you </w:t>
-      </w:r>
-      <w:proofErr w:type="gramStart"/>
-      <w:r>
-        <w:rPr>
-          <w:szCs w:val="24"/>
-        </w:rPr>
-        <w:t>from</w:t>
-      </w:r>
-      <w:proofErr w:type="gramEnd"/>
-      <w:r>
-        <w:rPr>
-          <w:szCs w:val="24"/>
-        </w:rPr>
-        <w:t xml:space="preserve"> any of these.</w:t>
+        <w:t>The study results may be published in scientific or medical journals. This includes positive, negative, and inconclusive results. It will not be possible to identify you from any of these.</w:t>
       </w:r>
     </w:p>
     <w:p>
@@ -4158,14 +3383,12 @@
         </w:rPr>
         <w:t xml:space="preserve">{{IF </w:t>
       </w:r>
-      <w:proofErr w:type="spellStart"/>
       <w:r>
         <w:rPr>
           <w:szCs w:val="24"/>
         </w:rPr>
         <w:t>ct_gov_registration</w:t>
       </w:r>
-      <w:proofErr w:type="spellEnd"/>
       <w:r>
         <w:rPr>
           <w:szCs w:val="24"/>
@@ -4211,13 +3434,8 @@
         <w:t>{{</w:t>
       </w:r>
       <w:r>
-        <w:t xml:space="preserve"> </w:t>
-      </w:r>
-      <w:proofErr w:type="spellStart"/>
-      <w:r>
-        <w:t>confidentiality_general</w:t>
-      </w:r>
-      <w:proofErr w:type="spellEnd"/>
+        <w:t xml:space="preserve"> confidentiality_general</w:t>
+      </w:r>
       <w:r>
         <w:t>}}</w:t>
       </w:r>
@@ -4230,6 +3448,7 @@
         </w:rPr>
       </w:pPr>
       <w:r>
+        <w:lastRenderedPageBreak/>
         <w:t xml:space="preserve">Will </w:t>
       </w:r>
       <w:r>
@@ -4315,47 +3534,14 @@
           <w:szCs w:val="24"/>
           <w:lang w:eastAsia="ar-SA"/>
         </w:rPr>
-        <w:lastRenderedPageBreak/>
-        <w:t xml:space="preserve">{{IF </w:t>
-      </w:r>
-      <w:proofErr w:type="spellStart"/>
+        <w:t>{{IF study_sponsor}}</w:t>
+      </w:r>
       <w:r>
         <w:rPr>
           <w:szCs w:val="24"/>
           <w:lang w:eastAsia="ar-SA"/>
         </w:rPr>
-        <w:t>study_sponsor</w:t>
-      </w:r>
-      <w:proofErr w:type="spellEnd"/>
-      <w:r>
-        <w:rPr>
-          <w:szCs w:val="24"/>
-          <w:lang w:eastAsia="ar-SA"/>
-        </w:rPr>
-        <w:t>}}</w:t>
-      </w:r>
-      <w:r>
-        <w:rPr>
-          <w:szCs w:val="24"/>
-          <w:lang w:eastAsia="ar-SA"/>
-        </w:rPr>
-        <w:t>The study Sponsor, {{</w:t>
-      </w:r>
-      <w:proofErr w:type="spellStart"/>
-      <w:r>
-        <w:rPr>
-          <w:szCs w:val="24"/>
-          <w:lang w:eastAsia="ar-SA"/>
-        </w:rPr>
-        <w:t>sponsor_name</w:t>
-      </w:r>
-      <w:proofErr w:type="spellEnd"/>
-      <w:r>
-        <w:rPr>
-          <w:szCs w:val="24"/>
-          <w:lang w:eastAsia="ar-SA"/>
-        </w:rPr>
-        <w:t>}}</w:t>
+        <w:t>The study Sponsor, {{sponsor_name}}</w:t>
       </w:r>
     </w:p>
     <w:p>
@@ -4376,39 +3562,7 @@
           <w:szCs w:val="24"/>
           <w:lang w:eastAsia="ar-SA"/>
         </w:rPr>
-        <w:t>Qualified representatives from {{</w:t>
-      </w:r>
-      <w:proofErr w:type="spellStart"/>
-      <w:r>
-        <w:rPr>
-          <w:szCs w:val="24"/>
-          <w:lang w:eastAsia="ar-SA"/>
-        </w:rPr>
-        <w:t>manufacturer_name</w:t>
-      </w:r>
-      <w:proofErr w:type="spellEnd"/>
-      <w:r>
-        <w:rPr>
-          <w:szCs w:val="24"/>
-          <w:lang w:eastAsia="ar-SA"/>
-        </w:rPr>
-        <w:t>}}, the pharmaceutical company that provides {{</w:t>
-      </w:r>
-      <w:proofErr w:type="spellStart"/>
-      <w:r>
-        <w:rPr>
-          <w:szCs w:val="24"/>
-          <w:lang w:eastAsia="ar-SA"/>
-        </w:rPr>
-        <w:t>product_name</w:t>
-      </w:r>
-      <w:proofErr w:type="spellEnd"/>
-      <w:r>
-        <w:rPr>
-          <w:szCs w:val="24"/>
-          <w:lang w:eastAsia="ar-SA"/>
-        </w:rPr>
-        <w:t>}}.</w:t>
+        <w:t>Qualified representatives from {{manufacturer_name}}, the pharmaceutical company that provides {{product_name}}.</w:t>
       </w:r>
       <w:r>
         <w:rPr>
@@ -4460,21 +3614,7 @@
         <w:rPr>
           <w:lang w:eastAsia="ar-SA"/>
         </w:rPr>
-        <w:t xml:space="preserve">Information gathered for this study is protected under </w:t>
-      </w:r>
-      <w:proofErr w:type="gramStart"/>
-      <w:r>
-        <w:rPr>
-          <w:lang w:eastAsia="ar-SA"/>
-        </w:rPr>
-        <w:t>a Certificate</w:t>
-      </w:r>
-      <w:proofErr w:type="gramEnd"/>
-      <w:r>
-        <w:rPr>
-          <w:lang w:eastAsia="ar-SA"/>
-        </w:rPr>
-        <w:t xml:space="preserve"> of Confidentiality and the Privacy Act.</w:t>
+        <w:t>Information gathered for this study is protected under a Certificate of Confidentiality and the Privacy Act.</w:t>
       </w:r>
     </w:p>
     <w:p>
@@ -4617,30 +3757,8 @@
         <w:rPr>
           <w:szCs w:val="24"/>
         </w:rPr>
-        <w:t xml:space="preserve">is for </w:t>
-      </w:r>
-      <w:proofErr w:type="gramStart"/>
-      <w:r>
-        <w:rPr>
-          <w:szCs w:val="24"/>
-        </w:rPr>
-        <w:t>other</w:t>
-      </w:r>
-      <w:proofErr w:type="gramEnd"/>
-      <w:r>
-        <w:rPr>
-          <w:szCs w:val="24"/>
-        </w:rPr>
-        <w:t xml:space="preserve"> research if allowed by other </w:t>
-      </w:r>
-      <w:proofErr w:type="gramStart"/>
-      <w:r>
-        <w:rPr>
-          <w:szCs w:val="24"/>
-        </w:rPr>
-        <w:t>regulations;</w:t>
-      </w:r>
-      <w:proofErr w:type="gramEnd"/>
+        <w:t>is for other research if allowed by other regulations;</w:t>
+      </w:r>
     </w:p>
     <w:p>
       <w:pPr>
@@ -4727,7 +3845,11 @@
         <w:t>The Privacy Act helps keep your NIH medical information confidential.  In some cases, it is different from the Certificate. </w:t>
       </w:r>
       <w:r>
-        <w:t xml:space="preserve"> Under 42 U.S.C. § 282, NIH is authorized to collect the data for this study. This data is covered by an NIH Privacy Act System of Records Notices: </w:t>
+        <w:t xml:space="preserve"> Under 42 U.S.C. § 282, NIH is authorized to collect the data for </w:t>
+      </w:r>
+      <w:r>
+        <w:lastRenderedPageBreak/>
+        <w:t xml:space="preserve">this study. This data is covered by an NIH Privacy Act System of Records Notices: </w:t>
       </w:r>
       <w:hyperlink r:id="rId19" w:history="1">
         <w:r>
@@ -4770,19 +3892,7 @@
         <w:jc w:val="left"/>
       </w:pPr>
       <w:r>
-        <w:t xml:space="preserve">Information may also be shared for some research. It can be given to some federal and state agencies. It can be used for HIV partner notification, or for infectious </w:t>
-      </w:r>
-      <w:proofErr w:type="gramStart"/>
-      <w:r>
-        <w:t>disease</w:t>
-      </w:r>
-      <w:proofErr w:type="gramEnd"/>
-      <w:r>
-        <w:t xml:space="preserve">, abuse, or neglect reports.  It may be shared with tumor registries, for quality and medical reviews.  It may also be </w:t>
-      </w:r>
-      <w:r>
-        <w:lastRenderedPageBreak/>
-        <w:t>shared if NIH is involved in a lawsuit</w:t>
+        <w:t>Information may also be shared for some research. It can be given to some federal and state agencies. It can be used for HIV partner notification, or for infectious disease, abuse, or neglect reports.  It may be shared with tumor registries, for quality and medical reviews.  It may also be shared if NIH is involved in a lawsuit</w:t>
       </w:r>
       <w:r>
         <w:t xml:space="preserve"> or event of a suspected or confirmed breach</w:t>
@@ -4832,55 +3942,7 @@
         <w:jc w:val="left"/>
       </w:pPr>
       <w:r>
-        <w:t>If you have any problems or questions about this study, or about your rights as a research participant, or about any research-related injury, contact the Principal Investigator, {{</w:t>
-      </w:r>
-      <w:proofErr w:type="spellStart"/>
-      <w:r>
-        <w:t>contact_name</w:t>
-      </w:r>
-      <w:proofErr w:type="spellEnd"/>
-      <w:r>
-        <w:t>}}, {{</w:t>
-      </w:r>
-      <w:proofErr w:type="spellStart"/>
-      <w:r>
-        <w:t>contact_email</w:t>
-      </w:r>
-      <w:proofErr w:type="spellEnd"/>
-      <w:r>
-        <w:t>}}, {{</w:t>
-      </w:r>
-      <w:proofErr w:type="spellStart"/>
-      <w:r>
-        <w:t>contact_phone</w:t>
-      </w:r>
-      <w:proofErr w:type="spellEnd"/>
-      <w:r>
-        <w:t xml:space="preserve">}}.{{IF </w:t>
-      </w:r>
-      <w:proofErr w:type="spellStart"/>
-      <w:r>
-        <w:t>other_contact_name</w:t>
-      </w:r>
-      <w:proofErr w:type="spellEnd"/>
-      <w:r>
-        <w:t>}} Other researchers you may call are: {{</w:t>
-      </w:r>
-      <w:proofErr w:type="spellStart"/>
-      <w:r>
-        <w:t>other_contact_name</w:t>
-      </w:r>
-      <w:proofErr w:type="spellEnd"/>
-      <w:r>
-        <w:t>}}, at {{</w:t>
-      </w:r>
-      <w:proofErr w:type="spellStart"/>
-      <w:r>
-        <w:t>other_contact_phone</w:t>
-      </w:r>
-      <w:proofErr w:type="spellEnd"/>
-      <w:r>
-        <w:t>}}.{{END-IF}} You may also call the NIH Clinical Center Patient Representative at 301-496-2626, or the NIH Office of IRB Operations at 301-402-3713 if you have a research-related complaint or concern.</w:t>
+        <w:t>If you have any problems or questions about this study, or about your rights as a research participant, or about any research-related injury, contact the Principal Investigator, {{contact_name}}, {{contact_email}}, {{contact_phone}}.{{IF other_contact_name}} Other researchers you may call are: {{other_contact_name}}, at {{other_contact_phone}}.{{END-IF}} You may also call the NIH Clinical Center Patient Representative at 301-496-2626, or the NIH Office of IRB Operations at 301-402-3713 if you have a research-related complaint or concern.</w:t>
       </w:r>
     </w:p>
     <w:p>
@@ -4981,39 +4043,7 @@
                 <w:bCs/>
                 <w:szCs w:val="24"/>
               </w:rPr>
-              <w:t>!(</w:t>
-            </w:r>
-            <w:proofErr w:type="spellStart"/>
-            <w:r>
-              <w:rPr>
-                <w:bCs/>
-                <w:szCs w:val="24"/>
-              </w:rPr>
-              <w:t>impaired_adults</w:t>
-            </w:r>
-            <w:proofErr w:type="spellEnd"/>
-            <w:r>
-              <w:rPr>
-                <w:bCs/>
-                <w:szCs w:val="24"/>
-              </w:rPr>
-              <w:t xml:space="preserve"> || </w:t>
-            </w:r>
-            <w:proofErr w:type="spellStart"/>
-            <w:r>
-              <w:rPr>
-                <w:bCs/>
-                <w:szCs w:val="24"/>
-              </w:rPr>
-              <w:t>parent_permission</w:t>
-            </w:r>
-            <w:proofErr w:type="spellEnd"/>
-            <w:r>
-              <w:rPr>
-                <w:bCs/>
-                <w:szCs w:val="24"/>
-              </w:rPr>
-              <w:t>)}}</w:t>
+              <w:t>!(impaired_adults || parent_permission)}}</w:t>
             </w:r>
           </w:p>
         </w:tc>
@@ -5044,21 +4074,7 @@
               <w:rPr>
                 <w:szCs w:val="24"/>
               </w:rPr>
-              <w:t xml:space="preserve">I have read the explanation about this study and have been given the opportunity to discuss it and to ask questions. I </w:t>
-            </w:r>
-            <w:proofErr w:type="gramStart"/>
-            <w:r>
-              <w:rPr>
-                <w:szCs w:val="24"/>
-              </w:rPr>
-              <w:t>consent</w:t>
-            </w:r>
-            <w:proofErr w:type="gramEnd"/>
-            <w:r>
-              <w:rPr>
-                <w:szCs w:val="24"/>
-              </w:rPr>
-              <w:t xml:space="preserve"> to participate in this study.</w:t>
+              <w:t>I have read the explanation about this study and have been given the opportunity to discuss it and to ask questions. I consent to participate in this study.</w:t>
             </w:r>
           </w:p>
         </w:tc>
@@ -5301,23 +4317,7 @@
                 <w:bCs/>
                 <w:szCs w:val="24"/>
               </w:rPr>
-              <w:t xml:space="preserve">{{IF </w:t>
-            </w:r>
-            <w:proofErr w:type="spellStart"/>
-            <w:r>
-              <w:rPr>
-                <w:bCs/>
-                <w:szCs w:val="24"/>
-              </w:rPr>
-              <w:t>impaired_adults</w:t>
-            </w:r>
-            <w:proofErr w:type="spellEnd"/>
-            <w:r>
-              <w:rPr>
-                <w:bCs/>
-                <w:szCs w:val="24"/>
-              </w:rPr>
-              <w:t>}}</w:t>
+              <w:t>{{IF impaired_adults}}</w:t>
             </w:r>
           </w:p>
           <w:p>
@@ -5575,23 +4575,7 @@
                 <w:bCs/>
                 <w:szCs w:val="24"/>
               </w:rPr>
-              <w:t xml:space="preserve">{{IF </w:t>
-            </w:r>
-            <w:proofErr w:type="spellStart"/>
-            <w:r>
-              <w:rPr>
-                <w:bCs/>
-                <w:szCs w:val="24"/>
-              </w:rPr>
-              <w:t>parent_permission</w:t>
-            </w:r>
-            <w:proofErr w:type="spellEnd"/>
-            <w:r>
-              <w:rPr>
-                <w:bCs/>
-                <w:szCs w:val="24"/>
-              </w:rPr>
-              <w:t>}}</w:t>
+              <w:t>{{IF parent_permission}}</w:t>
             </w:r>
           </w:p>
         </w:tc>
@@ -6699,21 +5683,12 @@
                 <w:szCs w:val="24"/>
               </w:rPr>
             </w:pPr>
-            <w:proofErr w:type="gramStart"/>
             <w:r>
               <w:rPr>
                 <w:b/>
                 <w:szCs w:val="24"/>
               </w:rPr>
-              <w:t>Witness</w:t>
-            </w:r>
-            <w:proofErr w:type="gramEnd"/>
-            <w:r>
-              <w:rPr>
-                <w:b/>
-                <w:szCs w:val="24"/>
-              </w:rPr>
-              <w:t xml:space="preserve"> </w:t>
+              <w:t xml:space="preserve">Witness </w:t>
             </w:r>
             <w:r>
               <w:rPr>
@@ -6783,43 +5758,7 @@
                 <w:bCs/>
                 <w:szCs w:val="24"/>
               </w:rPr>
-              <w:t xml:space="preserve">An oral presentation of </w:t>
-            </w:r>
-            <w:proofErr w:type="gramStart"/>
-            <w:r>
-              <w:rPr>
-                <w:b/>
-                <w:bCs/>
-                <w:szCs w:val="24"/>
-              </w:rPr>
-              <w:t>the full</w:t>
-            </w:r>
-            <w:proofErr w:type="gramEnd"/>
-            <w:r>
-              <w:rPr>
-                <w:b/>
-                <w:bCs/>
-                <w:szCs w:val="24"/>
-              </w:rPr>
-              <w:t xml:space="preserve"> consent has been used to </w:t>
-            </w:r>
-            <w:proofErr w:type="gramStart"/>
-            <w:r>
-              <w:rPr>
-                <w:b/>
-                <w:bCs/>
-                <w:szCs w:val="24"/>
-              </w:rPr>
-              <w:t>enroll</w:t>
-            </w:r>
-            <w:proofErr w:type="gramEnd"/>
-            <w:r>
-              <w:rPr>
-                <w:b/>
-                <w:bCs/>
-                <w:szCs w:val="24"/>
-              </w:rPr>
-              <w:t xml:space="preserve"> a blind or illiterate subject</w:t>
+              <w:t>An oral presentation of the full consent has been used to enroll a blind or illiterate subject</w:t>
             </w:r>
           </w:p>
           <w:p>
@@ -8021,21 +6960,7 @@
             <w:rPr>
               <w:sz w:val="20"/>
             </w:rPr>
-            <w:t>{{</w:t>
-          </w:r>
-          <w:proofErr w:type="spellStart"/>
-          <w:r>
-            <w:rPr>
-              <w:sz w:val="20"/>
-            </w:rPr>
-            <w:t>consent_version</w:t>
-          </w:r>
-          <w:proofErr w:type="spellEnd"/>
-          <w:r>
-            <w:rPr>
-              <w:sz w:val="20"/>
-            </w:rPr>
-            <w:t>}}</w:t>
+            <w:t>{{consent_version}}</w:t>
           </w:r>
         </w:p>
         <w:p>
@@ -10223,7 +9148,7 @@
   <w:style w:type="paragraph" w:default="1" w:styleId="Normal">
     <w:name w:val="Normal"/>
     <w:qFormat/>
-    <w:rsid w:val="00D205B9"/>
+    <w:rsid w:val="00F8148E"/>
     <w:pPr>
       <w:spacing w:before="120" w:after="120" w:line="240" w:lineRule="auto"/>
       <w:jc w:val="both"/>

</xml_diff>

<commit_message>
Added a disclaimer to the template
Added this disclaimer to the template - requested by the IRB: "This consent document was prepared with the assistance of an AI drafting tool, drawing directly from the study protocol. All content has been thoroughly reviewed, revised, and approved by the Principal Investigator. "
</commit_message>
<xml_diff>
--- a/client/templates/nih-cc/template-v14-final.docx
+++ b/client/templates/nih-cc/template-v14-final.docx
@@ -3962,14 +3962,34 @@
     <w:p>
       <w:pPr>
         <w:jc w:val="left"/>
+      </w:pPr>
+      <w:r>
+        <w:t>Please keep a copy of this document in case you want to read it again.</w:t>
+      </w:r>
+    </w:p>
+    <w:p>
+      <w:pPr>
+        <w:jc w:val="left"/>
         <w:rPr>
           <w:b/>
           <w:spacing w:val="-20"/>
         </w:rPr>
       </w:pPr>
       <w:r>
-        <w:t>Please keep a copy of this document in case you want to read it again.</w:t>
-      </w:r>
+        <w:t>This consent document was prepared with the assistance of an artificial intelligence drafting tool, drawing directly from the study protocol.  All content has been thoroughly reviewed, revised, and approved by the Principal Investigator.</w:t>
+      </w:r>
+    </w:p>
+    <w:p>
+      <w:pPr>
+        <w:spacing w:after="160"/>
+        <w:jc w:val="left"/>
+        <w:rPr>
+          <w:b/>
+          <w:color w:val="000000"/>
+          <w:spacing w:val="-20"/>
+          <w:szCs w:val="24"/>
+        </w:rPr>
+      </w:pPr>
     </w:p>
     <w:p>
       <w:pPr>
@@ -10274,7 +10294,9 @@
 </file>
 
 <file path=customXml/item1.xml><?xml version="1.0" encoding="utf-8"?>
-<b:Sources xmlns:b="http://schemas.openxmlformats.org/officeDocument/2006/bibliography" xmlns="http://schemas.openxmlformats.org/officeDocument/2006/bibliography" SelectedStyle="\APASixthEditionOfficeOnline.xsl" StyleName="APA" Version="6"/>
+<p:properties xmlns:p="http://schemas.microsoft.com/office/2006/metadata/properties" xmlns:xsi="http://www.w3.org/2001/XMLSchema-instance" xmlns:pc="http://schemas.microsoft.com/office/infopath/2007/PartnerControls">
+  <documentManagement/>
+</p:properties>
 </file>
 
 <file path=customXml/item2.xml><?xml version="1.0" encoding="utf-8"?>
@@ -10282,21 +10304,10 @@
 </file>
 
 <file path=customXml/item3.xml><?xml version="1.0" encoding="utf-8"?>
-<p:properties xmlns:p="http://schemas.microsoft.com/office/2006/metadata/properties" xmlns:xsi="http://www.w3.org/2001/XMLSchema-instance" xmlns:pc="http://schemas.microsoft.com/office/infopath/2007/PartnerControls">
-  <documentManagement/>
-</p:properties>
+<b:Sources xmlns:b="http://schemas.openxmlformats.org/officeDocument/2006/bibliography" xmlns="http://schemas.openxmlformats.org/officeDocument/2006/bibliography" SelectedStyle="\APASixthEditionOfficeOnline.xsl" StyleName="APA" Version="6"/>
 </file>
 
 <file path=customXml/item4.xml><?xml version="1.0" encoding="utf-8"?>
-<?mso-contentType ?>
-<FormTemplates xmlns="http://schemas.microsoft.com/sharepoint/v3/contenttype/forms">
-  <Display>DocumentLibraryForm</Display>
-  <Edit>DocumentLibraryForm</Edit>
-  <New>DocumentLibraryForm</New>
-</FormTemplates>
-</file>
-
-<file path=customXml/item5.xml><?xml version="1.0" encoding="utf-8"?>
 <ct:contentTypeSchema xmlns:ct="http://schemas.microsoft.com/office/2006/metadata/contentType" xmlns:ma="http://schemas.microsoft.com/office/2006/metadata/properties/metaAttributes" ct:_="" ma:_="" ma:contentTypeName="Document" ma:contentTypeID="0x0101006EBA941743B38D45B2E924265CA1ECC7" ma:contentTypeVersion="4" ma:contentTypeDescription="Create a new document." ma:contentTypeScope="" ma:versionID="6385e4529cfa076c3d2526307011ff18">
   <xsd:schema xmlns:xsd="http://www.w3.org/2001/XMLSchema" xmlns:xs="http://www.w3.org/2001/XMLSchema" xmlns:p="http://schemas.microsoft.com/office/2006/metadata/properties" xmlns:ns2="a2f212bc-a290-44da-a0f0-db4e540d6332" targetNamespace="http://schemas.microsoft.com/office/2006/metadata/properties" ma:root="true" ma:fieldsID="6d0f47cddc0917f7a0bfe86b0c4fee95" ns2:_="">
     <xsd:import namespace="a2f212bc-a290-44da-a0f0-db4e540d6332"/>
@@ -10440,10 +10451,20 @@
 </ct:contentTypeSchema>
 </file>
 
+<file path=customXml/item5.xml><?xml version="1.0" encoding="utf-8"?>
+<?mso-contentType ?>
+<FormTemplates xmlns="http://schemas.microsoft.com/sharepoint/v3/contenttype/forms">
+  <Display>DocumentLibraryForm</Display>
+  <Edit>DocumentLibraryForm</Edit>
+  <New>DocumentLibraryForm</New>
+</FormTemplates>
+</file>
+
 <file path=customXml/itemProps1.xml><?xml version="1.0" encoding="utf-8"?>
-<ds:datastoreItem xmlns:ds="http://schemas.openxmlformats.org/officeDocument/2006/customXml" ds:itemID="{FA5870B6-1FE5-43BB-95BF-EFDDA930C5ED}">
+<ds:datastoreItem xmlns:ds="http://schemas.openxmlformats.org/officeDocument/2006/customXml" ds:itemID="{6F5DD42D-7D19-459A-8B97-FC9CC664C713}">
   <ds:schemaRefs>
-    <ds:schemaRef ds:uri="http://schemas.openxmlformats.org/officeDocument/2006/bibliography"/>
+    <ds:schemaRef ds:uri="http://schemas.microsoft.com/office/2006/metadata/properties"/>
+    <ds:schemaRef ds:uri="http://schemas.microsoft.com/office/infopath/2007/PartnerControls"/>
   </ds:schemaRefs>
 </ds:datastoreItem>
 </file>
@@ -10457,23 +10478,14 @@
 </file>
 
 <file path=customXml/itemProps3.xml><?xml version="1.0" encoding="utf-8"?>
-<ds:datastoreItem xmlns:ds="http://schemas.openxmlformats.org/officeDocument/2006/customXml" ds:itemID="{6F5DD42D-7D19-459A-8B97-FC9CC664C713}">
+<ds:datastoreItem xmlns:ds="http://schemas.openxmlformats.org/officeDocument/2006/customXml" ds:itemID="{FA5870B6-1FE5-43BB-95BF-EFDDA930C5ED}">
   <ds:schemaRefs>
-    <ds:schemaRef ds:uri="http://schemas.microsoft.com/office/2006/metadata/properties"/>
-    <ds:schemaRef ds:uri="http://schemas.microsoft.com/office/infopath/2007/PartnerControls"/>
+    <ds:schemaRef ds:uri="http://schemas.openxmlformats.org/officeDocument/2006/bibliography"/>
   </ds:schemaRefs>
 </ds:datastoreItem>
 </file>
 
 <file path=customXml/itemProps4.xml><?xml version="1.0" encoding="utf-8"?>
-<ds:datastoreItem xmlns:ds="http://schemas.openxmlformats.org/officeDocument/2006/customXml" ds:itemID="{D85C4CB9-286F-40ED-A3CD-E8D4D7E0177A}">
-  <ds:schemaRefs>
-    <ds:schemaRef ds:uri="http://schemas.microsoft.com/sharepoint/v3/contenttype/forms"/>
-  </ds:schemaRefs>
-</ds:datastoreItem>
-</file>
-
-<file path=customXml/itemProps5.xml><?xml version="1.0" encoding="utf-8"?>
 <ds:datastoreItem xmlns:ds="http://schemas.openxmlformats.org/officeDocument/2006/customXml" ds:itemID="{2DFF37D1-3A33-430F-A556-4127A7EB50D1}">
   <ds:schemaRefs>
     <ds:schemaRef ds:uri="http://schemas.microsoft.com/office/2006/metadata/contentType"/>
@@ -10491,6 +10503,14 @@
 </ds:datastoreItem>
 </file>
 
+<file path=customXml/itemProps5.xml><?xml version="1.0" encoding="utf-8"?>
+<ds:datastoreItem xmlns:ds="http://schemas.openxmlformats.org/officeDocument/2006/customXml" ds:itemID="{D85C4CB9-286F-40ED-A3CD-E8D4D7E0177A}">
+  <ds:schemaRefs>
+    <ds:schemaRef ds:uri="http://schemas.microsoft.com/sharepoint/v3/contenttype/forms"/>
+  </ds:schemaRefs>
+</ds:datastoreItem>
+</file>
+
 <file path=docMetadata/LabelInfo.xml><?xml version="1.0" encoding="utf-8"?>
 <clbl:labelList xmlns:clbl="http://schemas.microsoft.com/office/2020/mipLabelMetadata">
   <clbl:label id="{14b77578-9773-42d5-8507-251ca2dc2b06}" enabled="0" method="" siteId="{14b77578-9773-42d5-8507-251ca2dc2b06}" removed="1"/>

</xml_diff>

<commit_message>
Added additional OHSRP inline comment
Added additional OHSRP inline comment to What Will Happen Section.  Should stay until we can optimize the AI-generated content for this section
</commit_message>
<xml_diff>
--- a/client/templates/nih-cc/template-v14-final.docx
+++ b/client/templates/nih-cc/template-v14-final.docx
@@ -746,11 +746,23 @@
           <w:rFonts w:hint="eastAsia"/>
         </w:rPr>
       </w:pPr>
+      <w:commentRangeStart w:id="4"/>
       <w:r>
         <w:t>WHAT WILL HAPPEN DURING THE STUDY</w:t>
       </w:r>
       <w:r>
         <w:t>?</w:t>
+      </w:r>
+      <w:commentRangeEnd w:id="4"/>
+      <w:r>
+        <w:rPr>
+          <w:rStyle w:val="CommentReference"/>
+          <w:rFonts w:ascii="Times New Roman" w:eastAsia="Times New Roman" w:hAnsi="Times New Roman"/>
+          <w:b w:val="0"/>
+          <w:caps w:val="0"/>
+          <w:spacing w:val="0"/>
+        </w:rPr>
+        <w:commentReference w:id="4"/>
       </w:r>
     </w:p>
     <w:p>
@@ -1786,11 +1798,11 @@
           <w:rFonts w:hint="eastAsia"/>
         </w:rPr>
       </w:pPr>
-      <w:bookmarkStart w:id="4" w:name="_Hlk535331221"/>
+      <w:bookmarkStart w:id="5" w:name="_Hlk535331221"/>
       <w:r>
         <w:t>What are the risks of radiation from being in the study:</w:t>
       </w:r>
-      <w:bookmarkEnd w:id="4"/>
+      <w:bookmarkEnd w:id="5"/>
     </w:p>
     <w:p>
       <w:pPr>
@@ -2100,11 +2112,11 @@
           <w:rFonts w:hint="eastAsia"/>
         </w:rPr>
       </w:pPr>
-      <w:commentRangeStart w:id="5"/>
+      <w:commentRangeStart w:id="6"/>
       <w:r>
         <w:t>STORAGE, SHARING AND FUTURE RESEARCH USING YOUR SPECIMENS AND DATA</w:t>
       </w:r>
-      <w:commentRangeEnd w:id="5"/>
+      <w:commentRangeEnd w:id="6"/>
       <w:r>
         <w:rPr>
           <w:rStyle w:val="CommentReference"/>
@@ -2112,7 +2124,7 @@
           <w:sz w:val="24"/>
           <w:szCs w:val="24"/>
         </w:rPr>
-        <w:commentReference w:id="5"/>
+        <w:commentReference w:id="6"/>
       </w:r>
     </w:p>
     <w:p>
@@ -2122,7 +2134,7 @@
           <w:rFonts w:hint="eastAsia"/>
         </w:rPr>
       </w:pPr>
-      <w:commentRangeStart w:id="6"/>
+      <w:commentRangeStart w:id="7"/>
       <w:r>
         <w:t xml:space="preserve">Will your specimens or data be saved </w:t>
       </w:r>
@@ -2138,7 +2150,7 @@
       <w:r>
         <w:t>for use in other studies?</w:t>
       </w:r>
-      <w:commentRangeEnd w:id="6"/>
+      <w:commentRangeEnd w:id="7"/>
       <w:r>
         <w:rPr>
           <w:rStyle w:val="CommentReference"/>
@@ -2146,7 +2158,7 @@
           <w:sz w:val="24"/>
           <w:szCs w:val="24"/>
         </w:rPr>
-        <w:commentReference w:id="6"/>
+        <w:commentReference w:id="7"/>
       </w:r>
     </w:p>
     <w:p>
@@ -2274,8 +2286,8 @@
           <w:rFonts w:hint="eastAsia"/>
         </w:rPr>
       </w:pPr>
-      <w:bookmarkStart w:id="7" w:name="_Hlk19462990"/>
-      <w:commentRangeStart w:id="8"/>
+      <w:bookmarkStart w:id="8" w:name="_Hlk19462990"/>
+      <w:commentRangeStart w:id="9"/>
       <w:r>
         <w:t xml:space="preserve">Will your specimens or data be shared </w:t>
       </w:r>
@@ -2285,7 +2297,7 @@
       <w:r>
         <w:t>for use in other studies?</w:t>
       </w:r>
-      <w:commentRangeEnd w:id="8"/>
+      <w:commentRangeEnd w:id="9"/>
       <w:r>
         <w:rPr>
           <w:rStyle w:val="CommentReference"/>
@@ -2293,10 +2305,10 @@
           <w:sz w:val="24"/>
           <w:szCs w:val="24"/>
         </w:rPr>
-        <w:commentReference w:id="8"/>
-      </w:r>
-    </w:p>
-    <w:bookmarkEnd w:id="7"/>
+        <w:commentReference w:id="9"/>
+      </w:r>
+    </w:p>
+    <w:bookmarkEnd w:id="8"/>
     <w:p>
       <w:pPr>
         <w:jc w:val="left"/>
@@ -2387,7 +2399,7 @@
           <w:szCs w:val="24"/>
         </w:rPr>
       </w:pPr>
-      <w:commentRangeStart w:id="9"/>
+      <w:commentRangeStart w:id="10"/>
       <w:r>
         <w:rPr>
           <w:szCs w:val="24"/>
@@ -2561,14 +2573,14 @@
         <w:tab/>
         <w:t>Initial</w:t>
       </w:r>
-      <w:commentRangeEnd w:id="9"/>
+      <w:commentRangeEnd w:id="10"/>
       <w:r>
         <w:rPr>
           <w:rStyle w:val="CommentReference"/>
           <w:sz w:val="24"/>
           <w:szCs w:val="24"/>
         </w:rPr>
-        <w:commentReference w:id="9"/>
+        <w:commentReference w:id="10"/>
       </w:r>
     </w:p>
     <w:p>
@@ -2787,7 +2799,7 @@
           <w:rFonts w:hint="eastAsia"/>
         </w:rPr>
       </w:pPr>
-      <w:bookmarkStart w:id="10" w:name="_Hlk57730381"/>
+      <w:bookmarkStart w:id="11" w:name="_Hlk57730381"/>
       <w:r>
         <w:lastRenderedPageBreak/>
         <w:t>PAYMENT</w:t>
@@ -3110,7 +3122,7 @@
         <w:t xml:space="preserve"> anything?</w:t>
       </w:r>
     </w:p>
-    <w:bookmarkEnd w:id="10"/>
+    <w:bookmarkEnd w:id="11"/>
     <w:p>
       <w:pPr>
         <w:ind w:right="180"/>
@@ -3962,10 +3974,6 @@
     <w:p>
       <w:pPr>
         <w:jc w:val="left"/>
-        <w:rPr>
-          <w:b/>
-          <w:spacing w:val="-20"/>
-        </w:rPr>
       </w:pPr>
       <w:r>
         <w:t>Please keep a copy of this document in case you want to read it again.</w:t>
@@ -6076,8 +6084,8 @@
           <w:szCs w:val="24"/>
         </w:rPr>
       </w:pPr>
-      <w:bookmarkStart w:id="11" w:name="lastpage"/>
-      <w:bookmarkEnd w:id="11"/>
+      <w:bookmarkStart w:id="12" w:name="lastpage"/>
+      <w:bookmarkEnd w:id="12"/>
     </w:p>
     <w:sectPr>
       <w:footerReference w:type="first" r:id="rId26"/>
@@ -6186,7 +6194,7 @@
       </w:r>
     </w:p>
   </w:comment>
-  <w:comment w:id="5" w:author="OHSRP Guidance" w:date="2026-02-26T15:44:00Z" w:initials="OHSRP">
+  <w:comment w:id="4" w:author="OHSRP Guidance" w:date="2026-03-10T11:54:00Z" w:initials="OHSRP">
     <w:p>
       <w:pPr>
         <w:pStyle w:val="CommentText"/>
@@ -6197,19 +6205,13 @@
           <w:rStyle w:val="CommentReference"/>
         </w:rPr>
         <w:annotationRef/>
-      </w:r>
-      <w:r>
-        <w:t xml:space="preserve">If your protocol offers the </w:t>
       </w:r>
       <w:r>
         <w:rPr>
           <w:b/>
           <w:bCs/>
         </w:rPr>
-        <w:t>prospect of direct benefit</w:t>
-      </w:r>
-      <w:r>
-        <w:t xml:space="preserve"> to the participant, e.g., a study with therapeutic intent, you must include the permission statements and yes/no boxes in the sections below. </w:t>
+        <w:t xml:space="preserve">NOTE: This section requires modification after AI generated first-draft: </w:t>
       </w:r>
     </w:p>
     <w:p>
@@ -6224,42 +6226,128 @@
         <w:jc w:val="left"/>
       </w:pPr>
       <w:r>
-        <w:t xml:space="preserve">If your study has </w:t>
-      </w:r>
+        <w:t>Describe, in plain language, what the participant will be asked to do — step by step. Be concise.  Do not include entire study calendar.</w:t>
+      </w:r>
+    </w:p>
+    <w:p>
+      <w:pPr>
+        <w:pStyle w:val="CommentText"/>
+        <w:jc w:val="left"/>
+      </w:pPr>
+    </w:p>
+    <w:p>
+      <w:pPr>
+        <w:pStyle w:val="CommentText"/>
+        <w:jc w:val="left"/>
+      </w:pPr>
+      <w:r>
+        <w:t xml:space="preserve">Clearly distinguish research procedures from standard of care. </w:t>
+      </w:r>
+    </w:p>
+    <w:p>
+      <w:pPr>
+        <w:pStyle w:val="CommentText"/>
+        <w:jc w:val="left"/>
+      </w:pPr>
+    </w:p>
+    <w:p>
+      <w:pPr>
+        <w:pStyle w:val="CommentText"/>
+        <w:jc w:val="left"/>
+      </w:pPr>
+      <w:r>
+        <w:t xml:space="preserve">Note if randomization is involved, if inpatient stay is required, or if email communication will be used. </w:t>
+      </w:r>
+    </w:p>
+    <w:p>
+      <w:pPr>
+        <w:pStyle w:val="CommentText"/>
+        <w:jc w:val="left"/>
+      </w:pPr>
+    </w:p>
+    <w:p>
+      <w:pPr>
+        <w:pStyle w:val="CommentText"/>
+        <w:jc w:val="left"/>
+      </w:pPr>
+      <w:r>
+        <w:t xml:space="preserve">List all study procedures, including where they will take place (and if different procedures occur at different locations, say so). </w:t>
+      </w:r>
+    </w:p>
+    <w:p>
+      <w:pPr>
+        <w:pStyle w:val="CommentText"/>
+        <w:jc w:val="left"/>
+      </w:pPr>
+    </w:p>
+    <w:p>
+      <w:pPr>
+        <w:pStyle w:val="CommentText"/>
+        <w:jc w:val="left"/>
+      </w:pPr>
+      <w:r>
+        <w:t xml:space="preserve">If the research involves biospecimens, state whether whole genome sequencing will or might be performed. </w:t>
+      </w:r>
+    </w:p>
+    <w:p>
+      <w:pPr>
+        <w:pStyle w:val="CommentText"/>
+        <w:jc w:val="left"/>
+      </w:pPr>
+    </w:p>
+    <w:p>
+      <w:pPr>
+        <w:pStyle w:val="CommentText"/>
+        <w:jc w:val="left"/>
+      </w:pPr>
+      <w:r>
+        <w:t>If participants are co-enrolled in another NIH protocol and data or specimens will be shared between studies, include this statement: "If you are co-enrolled in another NIH protocol, data [and/or specify specimen type] collected in either study may be shared with and used for research in either study."</w:t>
+      </w:r>
+    </w:p>
+    <w:p>
+      <w:pPr>
+        <w:pStyle w:val="CommentText"/>
+        <w:jc w:val="left"/>
+      </w:pPr>
+    </w:p>
+    <w:p>
+      <w:pPr>
+        <w:pStyle w:val="CommentText"/>
+        <w:jc w:val="left"/>
+      </w:pPr>
       <w:r>
         <w:rPr>
           <w:b/>
           <w:bCs/>
         </w:rPr>
-        <w:t>no prospect of direct benefit</w:t>
-      </w:r>
-      <w:r>
-        <w:t xml:space="preserve">, e.g., a repository or a study with only healthy volunteers, the permission statements and yes/no boxes below are optional and may be removed. </w:t>
-      </w:r>
-    </w:p>
+        <w:t>DELETE THIS COMMENT AFTER REVIEW</w:t>
+      </w:r>
+    </w:p>
+  </w:comment>
+  <w:comment w:id="6" w:author="OHSRP Guidance" w:date="2026-02-26T15:44:00Z" w:initials="OHSRP">
     <w:p>
       <w:pPr>
         <w:pStyle w:val="CommentText"/>
         <w:jc w:val="left"/>
       </w:pPr>
-    </w:p>
-    <w:p>
-      <w:pPr>
-        <w:pStyle w:val="CommentText"/>
-        <w:jc w:val="left"/>
-      </w:pPr>
-      <w:r>
-        <w:t xml:space="preserve">If the </w:t>
+      <w:r>
+        <w:rPr>
+          <w:rStyle w:val="CommentReference"/>
+        </w:rPr>
+        <w:annotationRef/>
+      </w:r>
+      <w:r>
+        <w:t xml:space="preserve">If your protocol offers the </w:t>
       </w:r>
       <w:r>
         <w:rPr>
           <w:b/>
           <w:bCs/>
         </w:rPr>
-        <w:t>primary objective of your study is to collect and retain specimens and/or data for future use</w:t>
-      </w:r>
-      <w:r>
-        <w:t xml:space="preserve"> (i.e., a repository study), you should delete the permission statements and yes/no boxes, as applicable. </w:t>
+        <w:t>prospect of direct benefit</w:t>
+      </w:r>
+      <w:r>
+        <w:t xml:space="preserve"> to the participant, e.g., a study with therapeutic intent, you must include the permission statements and yes/no boxes in the sections below. </w:t>
       </w:r>
     </w:p>
     <w:p>
@@ -6274,17 +6362,17 @@
         <w:jc w:val="left"/>
       </w:pPr>
       <w:r>
-        <w:t>If you are</w:t>
+        <w:t xml:space="preserve">If your study has </w:t>
       </w:r>
       <w:r>
         <w:rPr>
           <w:b/>
           <w:bCs/>
         </w:rPr>
-        <w:t xml:space="preserve"> only collecting data and not any specimens</w:t>
-      </w:r>
-      <w:r>
-        <w:t xml:space="preserve">, remove all references to specimens in this section. </w:t>
+        <w:t>no prospect of direct benefit</w:t>
+      </w:r>
+      <w:r>
+        <w:t xml:space="preserve">, e.g., a repository or a study with only healthy volunteers, the permission statements and yes/no boxes below are optional and may be removed. </w:t>
       </w:r>
     </w:p>
     <w:p>
@@ -6298,99 +6386,79 @@
         <w:pStyle w:val="CommentText"/>
         <w:jc w:val="left"/>
       </w:pPr>
+      <w:r>
+        <w:t xml:space="preserve">If the </w:t>
+      </w:r>
       <w:r>
         <w:rPr>
           <w:b/>
           <w:bCs/>
         </w:rPr>
-        <w:t>DELETE THIS COMMENT AFTER REVIEW</w:t>
-      </w:r>
-    </w:p>
-  </w:comment>
-  <w:comment w:id="6" w:author="OHSRP Guidance" w:date="2026-02-26T15:45:00Z" w:initials="OHSRP">
+        <w:t>primary objective of your study is to collect and retain specimens and/or data for future use</w:t>
+      </w:r>
+      <w:r>
+        <w:t xml:space="preserve"> (i.e., a repository study), you should delete the permission statements and yes/no boxes, as applicable. </w:t>
+      </w:r>
+    </w:p>
     <w:p>
       <w:pPr>
         <w:pStyle w:val="CommentText"/>
         <w:jc w:val="left"/>
       </w:pPr>
-      <w:r>
-        <w:rPr>
-          <w:rStyle w:val="CommentReference"/>
-        </w:rPr>
-        <w:annotationRef/>
-      </w:r>
-      <w:r>
-        <w:t>If you might use identifiable specimens/data for future research, you must include the language in this subsection.</w:t>
-      </w:r>
     </w:p>
     <w:p>
       <w:pPr>
         <w:pStyle w:val="CommentText"/>
         <w:jc w:val="left"/>
       </w:pPr>
-    </w:p>
-    <w:p>
-      <w:pPr>
-        <w:pStyle w:val="CommentText"/>
-        <w:jc w:val="left"/>
-      </w:pPr>
+      <w:r>
+        <w:t>If you are</w:t>
+      </w:r>
       <w:r>
         <w:rPr>
           <w:b/>
           <w:bCs/>
         </w:rPr>
-        <w:t>DELETE THIS COMMENT AFTER REVIEW</w:t>
-      </w:r>
-    </w:p>
-  </w:comment>
-  <w:comment w:id="8" w:author="OHSRP Guidance" w:date="2026-02-26T15:45:00Z" w:initials="OHSRP">
+        <w:t xml:space="preserve"> only collecting data and not any specimens</w:t>
+      </w:r>
+      <w:r>
+        <w:t xml:space="preserve">, remove all references to specimens in this section. </w:t>
+      </w:r>
+    </w:p>
     <w:p>
       <w:pPr>
         <w:pStyle w:val="CommentText"/>
         <w:jc w:val="left"/>
       </w:pPr>
-      <w:r>
-        <w:rPr>
-          <w:rStyle w:val="CommentReference"/>
-        </w:rPr>
-        <w:annotationRef/>
-      </w:r>
-      <w:r>
-        <w:t>Specimens/Data SHARED Guidance:</w:t>
-      </w:r>
     </w:p>
     <w:p>
       <w:pPr>
         <w:pStyle w:val="CommentText"/>
         <w:jc w:val="left"/>
       </w:pPr>
-      <w:r>
-        <w:t>For all studies, you</w:t>
-      </w:r>
       <w:r>
         <w:rPr>
           <w:b/>
           <w:bCs/>
         </w:rPr>
-        <w:t xml:space="preserve"> must</w:t>
-      </w:r>
-      <w:r>
-        <w:t xml:space="preserve"> include both of the first two paragraphs.</w:t>
-      </w:r>
-    </w:p>
+        <w:t>DELETE THIS COMMENT AFTER REVIEW</w:t>
+      </w:r>
+    </w:p>
+  </w:comment>
+  <w:comment w:id="7" w:author="OHSRP Guidance" w:date="2026-02-26T15:45:00Z" w:initials="OHSRP">
     <w:p>
       <w:pPr>
         <w:pStyle w:val="CommentText"/>
         <w:jc w:val="left"/>
       </w:pPr>
-    </w:p>
-    <w:p>
-      <w:pPr>
-        <w:pStyle w:val="CommentText"/>
-        <w:jc w:val="left"/>
-      </w:pPr>
-      <w:r>
-        <w:t>Depending on whether the repository will be open or closed access.  Please confirm the correct repository statement is included (open or closed)</w:t>
+      <w:r>
+        <w:rPr>
+          <w:rStyle w:val="CommentReference"/>
+        </w:rPr>
+        <w:annotationRef/>
+      </w:r>
+      <w:r>
+        <w:t>If you might use identifiable specimens/data for future research, you must include the language in this subsection.</w:t>
       </w:r>
     </w:p>
     <w:p>
@@ -6413,7 +6481,77 @@
       </w:r>
     </w:p>
   </w:comment>
-  <w:comment w:id="9" w:author="OHSRP Guidance" w:date="2026-02-26T15:46:00Z" w:initials="OHSRP">
+  <w:comment w:id="9" w:author="OHSRP Guidance" w:date="2026-02-26T15:45:00Z" w:initials="OHSRP">
+    <w:p>
+      <w:pPr>
+        <w:pStyle w:val="CommentText"/>
+        <w:jc w:val="left"/>
+      </w:pPr>
+      <w:r>
+        <w:rPr>
+          <w:rStyle w:val="CommentReference"/>
+        </w:rPr>
+        <w:annotationRef/>
+      </w:r>
+      <w:r>
+        <w:t>Specimens/Data SHARED Guidance:</w:t>
+      </w:r>
+    </w:p>
+    <w:p>
+      <w:pPr>
+        <w:pStyle w:val="CommentText"/>
+        <w:jc w:val="left"/>
+      </w:pPr>
+      <w:r>
+        <w:t>For all studies, you</w:t>
+      </w:r>
+      <w:r>
+        <w:rPr>
+          <w:b/>
+          <w:bCs/>
+        </w:rPr>
+        <w:t xml:space="preserve"> must</w:t>
+      </w:r>
+      <w:r>
+        <w:t xml:space="preserve"> include both of the first two paragraphs.</w:t>
+      </w:r>
+    </w:p>
+    <w:p>
+      <w:pPr>
+        <w:pStyle w:val="CommentText"/>
+        <w:jc w:val="left"/>
+      </w:pPr>
+    </w:p>
+    <w:p>
+      <w:pPr>
+        <w:pStyle w:val="CommentText"/>
+        <w:jc w:val="left"/>
+      </w:pPr>
+      <w:r>
+        <w:t>Depending on whether the repository will be open or closed access.  Please confirm the correct repository statement is included (open or closed)</w:t>
+      </w:r>
+    </w:p>
+    <w:p>
+      <w:pPr>
+        <w:pStyle w:val="CommentText"/>
+        <w:jc w:val="left"/>
+      </w:pPr>
+    </w:p>
+    <w:p>
+      <w:pPr>
+        <w:pStyle w:val="CommentText"/>
+        <w:jc w:val="left"/>
+      </w:pPr>
+      <w:r>
+        <w:rPr>
+          <w:b/>
+          <w:bCs/>
+        </w:rPr>
+        <w:t>DELETE THIS COMMENT AFTER REVIEW</w:t>
+      </w:r>
+    </w:p>
+  </w:comment>
+  <w:comment w:id="10" w:author="OHSRP Guidance" w:date="2026-02-26T15:46:00Z" w:initials="OHSRP">
     <w:p>
       <w:pPr>
         <w:pStyle w:val="CommentText"/>
@@ -6471,6 +6609,7 @@
 <w15:commentsEx xmlns:wpc="http://schemas.microsoft.com/office/word/2010/wordprocessingCanvas" xmlns:cx="http://schemas.microsoft.com/office/drawing/2014/chartex" xmlns:cx1="http://schemas.microsoft.com/office/drawing/2015/9/8/chartex" xmlns:cx2="http://schemas.microsoft.com/office/drawing/2015/10/21/chartex" xmlns:cx3="http://schemas.microsoft.com/office/drawing/2016/5/9/chartex" xmlns:cx4="http://schemas.microsoft.com/office/drawing/2016/5/10/chartex" xmlns:cx5="http://schemas.microsoft.com/office/drawing/2016/5/11/chartex" xmlns:cx6="http://schemas.microsoft.com/office/drawing/2016/5/12/chartex" xmlns:cx7="http://schemas.microsoft.com/office/drawing/2016/5/13/chartex" xmlns:cx8="http://schemas.microsoft.com/office/drawing/2016/5/14/chartex" xmlns:mc="http://schemas.openxmlformats.org/markup-compatibility/2006" xmlns:aink="http://schemas.microsoft.com/office/drawing/2016/ink" xmlns:am3d="http://schemas.microsoft.com/office/drawing/2017/model3d" xmlns:o="urn:schemas-microsoft-com:office:office" xmlns:oel="http://schemas.microsoft.com/office/2019/extlst" xmlns:r="http://schemas.openxmlformats.org/officeDocument/2006/relationships" xmlns:m="http://schemas.openxmlformats.org/officeDocument/2006/math" xmlns:v="urn:schemas-microsoft-com:vml" xmlns:wp14="http://schemas.microsoft.com/office/word/2010/wordprocessingDrawing" xmlns:wp="http://schemas.openxmlformats.org/drawingml/2006/wordprocessingDrawing" xmlns:w10="urn:schemas-microsoft-com:office:word" xmlns:w="http://schemas.openxmlformats.org/wordprocessingml/2006/main" xmlns:w14="http://schemas.microsoft.com/office/word/2010/wordml" xmlns:w15="http://schemas.microsoft.com/office/word/2012/wordml" xmlns:w16cex="http://schemas.microsoft.com/office/word/2018/wordml/cex" xmlns:w16cid="http://schemas.microsoft.com/office/word/2016/wordml/cid" xmlns:w16="http://schemas.microsoft.com/office/word/2018/wordml" xmlns:w16du="http://schemas.microsoft.com/office/word/2023/wordml/word16du" xmlns:w16sdtdh="http://schemas.microsoft.com/office/word/2020/wordml/sdtdatahash" xmlns:w16sdtfl="http://schemas.microsoft.com/office/word/2024/wordml/sdtformatlock" xmlns:w16se="http://schemas.microsoft.com/office/word/2015/wordml/symex" xmlns:wpg="http://schemas.microsoft.com/office/word/2010/wordprocessingGroup" xmlns:wpi="http://schemas.microsoft.com/office/word/2010/wordprocessingInk" xmlns:wne="http://schemas.microsoft.com/office/word/2006/wordml" xmlns:wps="http://schemas.microsoft.com/office/word/2010/wordprocessingShape" mc:Ignorable="w14 w15 w16se w16cid w16 w16cex w16sdtdh w16sdtfl w16du wp14">
   <w15:commentEx w15:paraId="3D1F968B" w15:done="0"/>
   <w15:commentEx w15:paraId="728716D4" w15:done="0"/>
+  <w15:commentEx w15:paraId="46A8C493" w15:done="0"/>
   <w15:commentEx w15:paraId="4CD6630C" w15:done="0"/>
   <w15:commentEx w15:paraId="7AD219EA" w15:done="0"/>
   <w15:commentEx w15:paraId="2AF215EA" w15:done="0"/>
@@ -6482,6 +6621,7 @@
 <w16cex:commentsExtensible xmlns:wpc="http://schemas.microsoft.com/office/word/2010/wordprocessingCanvas" xmlns:cx="http://schemas.microsoft.com/office/drawing/2014/chartex" xmlns:cx1="http://schemas.microsoft.com/office/drawing/2015/9/8/chartex" xmlns:cx2="http://schemas.microsoft.com/office/drawing/2015/10/21/chartex" xmlns:cx3="http://schemas.microsoft.com/office/drawing/2016/5/9/chartex" xmlns:cx4="http://schemas.microsoft.com/office/drawing/2016/5/10/chartex" xmlns:cx5="http://schemas.microsoft.com/office/drawing/2016/5/11/chartex" xmlns:cx6="http://schemas.microsoft.com/office/drawing/2016/5/12/chartex" xmlns:cx7="http://schemas.microsoft.com/office/drawing/2016/5/13/chartex" xmlns:cx8="http://schemas.microsoft.com/office/drawing/2016/5/14/chartex" xmlns:cr="http://schemas.microsoft.com/office/comments/2020/reactions" xmlns:mc="http://schemas.openxmlformats.org/markup-compatibility/2006" xmlns:aink="http://schemas.microsoft.com/office/drawing/2016/ink" xmlns:am3d="http://schemas.microsoft.com/office/drawing/2017/model3d" xmlns:o="urn:schemas-microsoft-com:office:office" xmlns:oel="http://schemas.microsoft.com/office/2019/extlst" xmlns:r="http://schemas.openxmlformats.org/officeDocument/2006/relationships" xmlns:m="http://schemas.openxmlformats.org/officeDocument/2006/math" xmlns:v="urn:schemas-microsoft-com:vml" xmlns:wp14="http://schemas.microsoft.com/office/word/2010/wordprocessingDrawing" xmlns:wp="http://schemas.openxmlformats.org/drawingml/2006/wordprocessingDrawing" xmlns:w10="urn:schemas-microsoft-com:office:word" xmlns:w="http://schemas.openxmlformats.org/wordprocessingml/2006/main" xmlns:w14="http://schemas.microsoft.com/office/word/2010/wordml" xmlns:w15="http://schemas.microsoft.com/office/word/2012/wordml" xmlns:w16cex="http://schemas.microsoft.com/office/word/2018/wordml/cex" xmlns:w16cid="http://schemas.microsoft.com/office/word/2016/wordml/cid" xmlns:w16="http://schemas.microsoft.com/office/word/2018/wordml" xmlns:w16du="http://schemas.microsoft.com/office/word/2023/wordml/word16du" xmlns:w16sdtdh="http://schemas.microsoft.com/office/word/2020/wordml/sdtdatahash" xmlns:w16sdtfl="http://schemas.microsoft.com/office/word/2024/wordml/sdtformatlock" xmlns:w16se="http://schemas.microsoft.com/office/word/2015/wordml/symex" xmlns:wpg="http://schemas.microsoft.com/office/word/2010/wordprocessingGroup" xmlns:wpi="http://schemas.microsoft.com/office/word/2010/wordprocessingInk" xmlns:wne="http://schemas.microsoft.com/office/word/2006/wordml" xmlns:wps="http://schemas.microsoft.com/office/word/2010/wordprocessingShape" mc:Ignorable="w14 w15 w16se w16cid w16 w16cex w16sdtdh w16sdtfl cr w16du wp14">
   <w16cex:commentExtensible w16cex:durableId="75AF5A2C" w16cex:dateUtc="2026-02-26T20:43:00Z"/>
   <w16cex:commentExtensible w16cex:durableId="58CB134E" w16cex:dateUtc="2026-02-26T20:44:00Z"/>
+  <w16cex:commentExtensible w16cex:durableId="6E8109D2" w16cex:dateUtc="2026-03-10T15:54:00Z"/>
   <w16cex:commentExtensible w16cex:durableId="74BB44D5" w16cex:dateUtc="2026-02-26T20:44:00Z"/>
   <w16cex:commentExtensible w16cex:durableId="5F700770" w16cex:dateUtc="2026-02-26T20:45:00Z"/>
   <w16cex:commentExtensible w16cex:durableId="0519DC77" w16cex:dateUtc="2026-02-26T20:45:00Z"/>
@@ -6493,6 +6633,7 @@
 <w16cid:commentsIds xmlns:wpc="http://schemas.microsoft.com/office/word/2010/wordprocessingCanvas" xmlns:cx="http://schemas.microsoft.com/office/drawing/2014/chartex" xmlns:cx1="http://schemas.microsoft.com/office/drawing/2015/9/8/chartex" xmlns:cx2="http://schemas.microsoft.com/office/drawing/2015/10/21/chartex" xmlns:cx3="http://schemas.microsoft.com/office/drawing/2016/5/9/chartex" xmlns:cx4="http://schemas.microsoft.com/office/drawing/2016/5/10/chartex" xmlns:cx5="http://schemas.microsoft.com/office/drawing/2016/5/11/chartex" xmlns:cx6="http://schemas.microsoft.com/office/drawing/2016/5/12/chartex" xmlns:cx7="http://schemas.microsoft.com/office/drawing/2016/5/13/chartex" xmlns:cx8="http://schemas.microsoft.com/office/drawing/2016/5/14/chartex" xmlns:mc="http://schemas.openxmlformats.org/markup-compatibility/2006" xmlns:aink="http://schemas.microsoft.com/office/drawing/2016/ink" xmlns:am3d="http://schemas.microsoft.com/office/drawing/2017/model3d" xmlns:o="urn:schemas-microsoft-com:office:office" xmlns:oel="http://schemas.microsoft.com/office/2019/extlst" xmlns:r="http://schemas.openxmlformats.org/officeDocument/2006/relationships" xmlns:m="http://schemas.openxmlformats.org/officeDocument/2006/math" xmlns:v="urn:schemas-microsoft-com:vml" xmlns:wp14="http://schemas.microsoft.com/office/word/2010/wordprocessingDrawing" xmlns:wp="http://schemas.openxmlformats.org/drawingml/2006/wordprocessingDrawing" xmlns:w10="urn:schemas-microsoft-com:office:word" xmlns:w="http://schemas.openxmlformats.org/wordprocessingml/2006/main" xmlns:w14="http://schemas.microsoft.com/office/word/2010/wordml" xmlns:w15="http://schemas.microsoft.com/office/word/2012/wordml" xmlns:w16cex="http://schemas.microsoft.com/office/word/2018/wordml/cex" xmlns:w16cid="http://schemas.microsoft.com/office/word/2016/wordml/cid" xmlns:w16="http://schemas.microsoft.com/office/word/2018/wordml" xmlns:w16du="http://schemas.microsoft.com/office/word/2023/wordml/word16du" xmlns:w16sdtdh="http://schemas.microsoft.com/office/word/2020/wordml/sdtdatahash" xmlns:w16sdtfl="http://schemas.microsoft.com/office/word/2024/wordml/sdtformatlock" xmlns:w16se="http://schemas.microsoft.com/office/word/2015/wordml/symex" xmlns:wpg="http://schemas.microsoft.com/office/word/2010/wordprocessingGroup" xmlns:wpi="http://schemas.microsoft.com/office/word/2010/wordprocessingInk" xmlns:wne="http://schemas.microsoft.com/office/word/2006/wordml" xmlns:wps="http://schemas.microsoft.com/office/word/2010/wordprocessingShape" mc:Ignorable="w14 w15 w16se w16cid w16 w16cex w16sdtdh w16sdtfl w16du wp14">
   <w16cid:commentId w16cid:paraId="3D1F968B" w16cid:durableId="75AF5A2C"/>
   <w16cid:commentId w16cid:paraId="728716D4" w16cid:durableId="58CB134E"/>
+  <w16cid:commentId w16cid:paraId="46A8C493" w16cid:durableId="6E8109D2"/>
   <w16cid:commentId w16cid:paraId="4CD6630C" w16cid:durableId="74BB44D5"/>
   <w16cid:commentId w16cid:paraId="7AD219EA" w16cid:durableId="5F700770"/>
   <w16cid:commentId w16cid:paraId="2AF215EA" w16cid:durableId="0519DC77"/>
@@ -10274,7 +10415,9 @@
 </file>
 
 <file path=customXml/item1.xml><?xml version="1.0" encoding="utf-8"?>
-<b:Sources xmlns:b="http://schemas.openxmlformats.org/officeDocument/2006/bibliography" xmlns="http://schemas.openxmlformats.org/officeDocument/2006/bibliography" SelectedStyle="\APASixthEditionOfficeOnline.xsl" StyleName="APA" Version="6"/>
+<p:properties xmlns:p="http://schemas.microsoft.com/office/2006/metadata/properties" xmlns:xsi="http://www.w3.org/2001/XMLSchema-instance" xmlns:pc="http://schemas.microsoft.com/office/infopath/2007/PartnerControls">
+  <documentManagement/>
+</p:properties>
 </file>
 
 <file path=customXml/item2.xml><?xml version="1.0" encoding="utf-8"?>
@@ -10282,21 +10425,10 @@
 </file>
 
 <file path=customXml/item3.xml><?xml version="1.0" encoding="utf-8"?>
-<p:properties xmlns:p="http://schemas.microsoft.com/office/2006/metadata/properties" xmlns:xsi="http://www.w3.org/2001/XMLSchema-instance" xmlns:pc="http://schemas.microsoft.com/office/infopath/2007/PartnerControls">
-  <documentManagement/>
-</p:properties>
+<b:Sources xmlns:b="http://schemas.openxmlformats.org/officeDocument/2006/bibliography" xmlns="http://schemas.openxmlformats.org/officeDocument/2006/bibliography" SelectedStyle="\APASixthEditionOfficeOnline.xsl" StyleName="APA" Version="6"/>
 </file>
 
 <file path=customXml/item4.xml><?xml version="1.0" encoding="utf-8"?>
-<?mso-contentType ?>
-<FormTemplates xmlns="http://schemas.microsoft.com/sharepoint/v3/contenttype/forms">
-  <Display>DocumentLibraryForm</Display>
-  <Edit>DocumentLibraryForm</Edit>
-  <New>DocumentLibraryForm</New>
-</FormTemplates>
-</file>
-
-<file path=customXml/item5.xml><?xml version="1.0" encoding="utf-8"?>
 <ct:contentTypeSchema xmlns:ct="http://schemas.microsoft.com/office/2006/metadata/contentType" xmlns:ma="http://schemas.microsoft.com/office/2006/metadata/properties/metaAttributes" ct:_="" ma:_="" ma:contentTypeName="Document" ma:contentTypeID="0x0101006EBA941743B38D45B2E924265CA1ECC7" ma:contentTypeVersion="4" ma:contentTypeDescription="Create a new document." ma:contentTypeScope="" ma:versionID="6385e4529cfa076c3d2526307011ff18">
   <xsd:schema xmlns:xsd="http://www.w3.org/2001/XMLSchema" xmlns:xs="http://www.w3.org/2001/XMLSchema" xmlns:p="http://schemas.microsoft.com/office/2006/metadata/properties" xmlns:ns2="a2f212bc-a290-44da-a0f0-db4e540d6332" targetNamespace="http://schemas.microsoft.com/office/2006/metadata/properties" ma:root="true" ma:fieldsID="6d0f47cddc0917f7a0bfe86b0c4fee95" ns2:_="">
     <xsd:import namespace="a2f212bc-a290-44da-a0f0-db4e540d6332"/>
@@ -10440,10 +10572,20 @@
 </ct:contentTypeSchema>
 </file>
 
+<file path=customXml/item5.xml><?xml version="1.0" encoding="utf-8"?>
+<?mso-contentType ?>
+<FormTemplates xmlns="http://schemas.microsoft.com/sharepoint/v3/contenttype/forms">
+  <Display>DocumentLibraryForm</Display>
+  <Edit>DocumentLibraryForm</Edit>
+  <New>DocumentLibraryForm</New>
+</FormTemplates>
+</file>
+
 <file path=customXml/itemProps1.xml><?xml version="1.0" encoding="utf-8"?>
-<ds:datastoreItem xmlns:ds="http://schemas.openxmlformats.org/officeDocument/2006/customXml" ds:itemID="{FA5870B6-1FE5-43BB-95BF-EFDDA930C5ED}">
+<ds:datastoreItem xmlns:ds="http://schemas.openxmlformats.org/officeDocument/2006/customXml" ds:itemID="{6F5DD42D-7D19-459A-8B97-FC9CC664C713}">
   <ds:schemaRefs>
-    <ds:schemaRef ds:uri="http://schemas.openxmlformats.org/officeDocument/2006/bibliography"/>
+    <ds:schemaRef ds:uri="http://schemas.microsoft.com/office/2006/metadata/properties"/>
+    <ds:schemaRef ds:uri="http://schemas.microsoft.com/office/infopath/2007/PartnerControls"/>
   </ds:schemaRefs>
 </ds:datastoreItem>
 </file>
@@ -10457,23 +10599,14 @@
 </file>
 
 <file path=customXml/itemProps3.xml><?xml version="1.0" encoding="utf-8"?>
-<ds:datastoreItem xmlns:ds="http://schemas.openxmlformats.org/officeDocument/2006/customXml" ds:itemID="{6F5DD42D-7D19-459A-8B97-FC9CC664C713}">
+<ds:datastoreItem xmlns:ds="http://schemas.openxmlformats.org/officeDocument/2006/customXml" ds:itemID="{FA5870B6-1FE5-43BB-95BF-EFDDA930C5ED}">
   <ds:schemaRefs>
-    <ds:schemaRef ds:uri="http://schemas.microsoft.com/office/2006/metadata/properties"/>
-    <ds:schemaRef ds:uri="http://schemas.microsoft.com/office/infopath/2007/PartnerControls"/>
+    <ds:schemaRef ds:uri="http://schemas.openxmlformats.org/officeDocument/2006/bibliography"/>
   </ds:schemaRefs>
 </ds:datastoreItem>
 </file>
 
 <file path=customXml/itemProps4.xml><?xml version="1.0" encoding="utf-8"?>
-<ds:datastoreItem xmlns:ds="http://schemas.openxmlformats.org/officeDocument/2006/customXml" ds:itemID="{D85C4CB9-286F-40ED-A3CD-E8D4D7E0177A}">
-  <ds:schemaRefs>
-    <ds:schemaRef ds:uri="http://schemas.microsoft.com/sharepoint/v3/contenttype/forms"/>
-  </ds:schemaRefs>
-</ds:datastoreItem>
-</file>
-
-<file path=customXml/itemProps5.xml><?xml version="1.0" encoding="utf-8"?>
 <ds:datastoreItem xmlns:ds="http://schemas.openxmlformats.org/officeDocument/2006/customXml" ds:itemID="{2DFF37D1-3A33-430F-A556-4127A7EB50D1}">
   <ds:schemaRefs>
     <ds:schemaRef ds:uri="http://schemas.microsoft.com/office/2006/metadata/contentType"/>
@@ -10491,6 +10624,14 @@
 </ds:datastoreItem>
 </file>
 
+<file path=customXml/itemProps5.xml><?xml version="1.0" encoding="utf-8"?>
+<ds:datastoreItem xmlns:ds="http://schemas.openxmlformats.org/officeDocument/2006/customXml" ds:itemID="{D85C4CB9-286F-40ED-A3CD-E8D4D7E0177A}">
+  <ds:schemaRefs>
+    <ds:schemaRef ds:uri="http://schemas.microsoft.com/sharepoint/v3/contenttype/forms"/>
+  </ds:schemaRefs>
+</ds:datastoreItem>
+</file>
+
 <file path=docMetadata/LabelInfo.xml><?xml version="1.0" encoding="utf-8"?>
 <clbl:labelList xmlns:clbl="http://schemas.microsoft.com/office/2020/mipLabelMetadata">
   <clbl:label id="{14b77578-9773-42d5-8507-251ca2dc2b06}" enabled="0" method="" siteId="{14b77578-9773-42d5-8507-251ca2dc2b06}" removed="1"/>

</xml_diff>

<commit_message>
Added Blue text for required language
Added blue text back into the template for required language.
</commit_message>
<xml_diff>
--- a/client/templates/nih-cc/template-v14-final.docx
+++ b/client/templates/nih-cc/template-v14-final.docx
@@ -125,9 +125,9 @@
       <w:r>
         <w:rPr>
           <w:b/>
-          <w:szCs w:val="24"/>
-        </w:rPr>
-        <w:lastRenderedPageBreak/>
+          <w:color w:val="0070C0"/>
+          <w:szCs w:val="24"/>
+        </w:rPr>
         <w:t xml:space="preserve">PRINCIPAL INVESTIGATOR: </w:t>
       </w:r>
       <w:r>
@@ -135,7 +135,23 @@
           <w:bCs/>
           <w:szCs w:val="24"/>
         </w:rPr>
-        <w:t>{{pi_name}}</w:t>
+        <w:t>{{</w:t>
+      </w:r>
+      <w:proofErr w:type="spellStart"/>
+      <w:r>
+        <w:rPr>
+          <w:bCs/>
+          <w:szCs w:val="24"/>
+        </w:rPr>
+        <w:t>pi_name</w:t>
+      </w:r>
+      <w:proofErr w:type="spellEnd"/>
+      <w:r>
+        <w:rPr>
+          <w:bCs/>
+          <w:szCs w:val="24"/>
+        </w:rPr>
+        <w:t>}}</w:t>
       </w:r>
     </w:p>
     <w:p>
@@ -149,6 +165,7 @@
       <w:r>
         <w:rPr>
           <w:b/>
+          <w:color w:val="0070C0"/>
           <w:szCs w:val="24"/>
         </w:rPr>
         <w:t>STUDY TITLE:</w:t>
@@ -156,6 +173,7 @@
       <w:r>
         <w:rPr>
           <w:b/>
+          <w:color w:val="0070C0"/>
           <w:szCs w:val="24"/>
         </w:rPr>
         <w:t xml:space="preserve"> </w:t>
@@ -165,7 +183,23 @@
           <w:bCs/>
           <w:szCs w:val="24"/>
         </w:rPr>
-        <w:t>{{study_title}}</w:t>
+        <w:t>{{</w:t>
+      </w:r>
+      <w:proofErr w:type="spellStart"/>
+      <w:r>
+        <w:rPr>
+          <w:bCs/>
+          <w:szCs w:val="24"/>
+        </w:rPr>
+        <w:t>study_title</w:t>
+      </w:r>
+      <w:proofErr w:type="spellEnd"/>
+      <w:r>
+        <w:rPr>
+          <w:bCs/>
+          <w:szCs w:val="24"/>
+        </w:rPr>
+        <w:t>}}</w:t>
       </w:r>
     </w:p>
     <w:p>
@@ -179,6 +213,7 @@
       <w:r>
         <w:rPr>
           <w:b/>
+          <w:color w:val="0070C0"/>
           <w:szCs w:val="24"/>
         </w:rPr>
         <w:t xml:space="preserve">STUDY SITE: </w:t>
@@ -188,7 +223,23 @@
           <w:bCs/>
           <w:szCs w:val="24"/>
         </w:rPr>
-        <w:t>{{study_site}}</w:t>
+        <w:t>{{</w:t>
+      </w:r>
+      <w:proofErr w:type="spellStart"/>
+      <w:r>
+        <w:rPr>
+          <w:bCs/>
+          <w:szCs w:val="24"/>
+        </w:rPr>
+        <w:t>study_site</w:t>
+      </w:r>
+      <w:proofErr w:type="spellEnd"/>
+      <w:r>
+        <w:rPr>
+          <w:bCs/>
+          <w:szCs w:val="24"/>
+        </w:rPr>
+        <w:t>}}</w:t>
       </w:r>
       <w:r>
         <w:rPr>
@@ -215,9 +266,16 @@
       <w:bookmarkStart w:id="1" w:name="_Hlk499618129"/>
       <w:r>
         <w:rPr>
-          <w:szCs w:val="24"/>
-        </w:rPr>
-        <w:t>Cohort: {{cohort}}</w:t>
+          <w:color w:val="0070C0"/>
+          <w:szCs w:val="24"/>
+        </w:rPr>
+        <w:t xml:space="preserve">Cohort: </w:t>
+      </w:r>
+      <w:r>
+        <w:rPr>
+          <w:szCs w:val="24"/>
+        </w:rPr>
+        <w:t>{{cohort}}</w:t>
       </w:r>
       <w:bookmarkStart w:id="2" w:name="_Hlk1733306"/>
       <w:bookmarkEnd w:id="2"/>
@@ -232,9 +290,30 @@
       </w:pPr>
       <w:r>
         <w:rPr>
-          <w:szCs w:val="24"/>
-        </w:rPr>
-        <w:t>Consent Version: {{consent_version}}</w:t>
+          <w:color w:val="0070C0"/>
+          <w:szCs w:val="24"/>
+        </w:rPr>
+        <w:t xml:space="preserve">Consent Version: </w:t>
+      </w:r>
+      <w:r>
+        <w:rPr>
+          <w:szCs w:val="24"/>
+        </w:rPr>
+        <w:t>{{</w:t>
+      </w:r>
+      <w:proofErr w:type="spellStart"/>
+      <w:r>
+        <w:rPr>
+          <w:szCs w:val="24"/>
+        </w:rPr>
+        <w:t>consent_version</w:t>
+      </w:r>
+      <w:proofErr w:type="spellEnd"/>
+      <w:r>
+        <w:rPr>
+          <w:szCs w:val="24"/>
+        </w:rPr>
+        <w:t>}}</w:t>
       </w:r>
     </w:p>
     <w:bookmarkEnd w:id="1"/>
@@ -257,7 +336,55 @@
     </w:p>
     <w:p>
       <w:r>
-        <w:t>{{= [contact_name ? `Name: ${contact_name}` : null, contact_phone ? `Phone: ${contact_phone}` : null, contact_email ? `Email: ${contact_email}` : null].filter(Boolean).join(", ") }}</w:t>
+        <w:t>{{= [</w:t>
+      </w:r>
+      <w:proofErr w:type="spellStart"/>
+      <w:r>
+        <w:t>contact_name</w:t>
+      </w:r>
+      <w:proofErr w:type="spellEnd"/>
+      <w:r>
+        <w:t xml:space="preserve"> ? `Name: ${</w:t>
+      </w:r>
+      <w:proofErr w:type="spellStart"/>
+      <w:r>
+        <w:t>contact_name</w:t>
+      </w:r>
+      <w:proofErr w:type="spellEnd"/>
+      <w:r>
+        <w:t xml:space="preserve">}` : null, </w:t>
+      </w:r>
+      <w:proofErr w:type="spellStart"/>
+      <w:r>
+        <w:t>contact_phone</w:t>
+      </w:r>
+      <w:proofErr w:type="spellEnd"/>
+      <w:r>
+        <w:t xml:space="preserve"> ? `Phone: ${</w:t>
+      </w:r>
+      <w:proofErr w:type="spellStart"/>
+      <w:r>
+        <w:t>contact_phone</w:t>
+      </w:r>
+      <w:proofErr w:type="spellEnd"/>
+      <w:r>
+        <w:t xml:space="preserve">}` : null, </w:t>
+      </w:r>
+      <w:proofErr w:type="spellStart"/>
+      <w:r>
+        <w:t>contact_email</w:t>
+      </w:r>
+      <w:proofErr w:type="spellEnd"/>
+      <w:r>
+        <w:t xml:space="preserve"> ? `Email: ${</w:t>
+      </w:r>
+      <w:proofErr w:type="spellStart"/>
+      <w:r>
+        <w:t>contact_email</w:t>
+      </w:r>
+      <w:proofErr w:type="spellEnd"/>
+      <w:r>
+        <w:t>}` : null].filter(Boolean).join(", ") }}</w:t>
       </w:r>
     </w:p>
     <w:p>
@@ -299,16 +426,28 @@
           <w:p>
             <w:pPr>
               <w:jc w:val="left"/>
-            </w:pPr>
-            <w:r>
+              <w:rPr>
+                <w:color w:val="0070C0"/>
+              </w:rPr>
+            </w:pPr>
+            <w:r>
+              <w:rPr>
+                <w:color w:val="0070C0"/>
+              </w:rPr>
               <w:t>This consent form describes a research study and is designed to help you decide if you would like to be a part of the research study.</w:t>
             </w:r>
           </w:p>
           <w:p>
             <w:pPr>
               <w:jc w:val="left"/>
-            </w:pPr>
-            <w:r>
+              <w:rPr>
+                <w:color w:val="0070C0"/>
+              </w:rPr>
+            </w:pPr>
+            <w:r>
+              <w:rPr>
+                <w:color w:val="0070C0"/>
+              </w:rPr>
               <w:t>You are being asked to take part in a research study at the National Institutes of Health (NIH). This section provides the information we believe is most helpful and important to you in making your decision about participating in this study. Additional information that may help you decide can be found in other sections of the document. Taking part in research at the NIH is your choice.</w:t>
             </w:r>
           </w:p>
@@ -317,13 +456,29 @@
               <w:jc w:val="left"/>
             </w:pPr>
             <w:r>
-              <w:t>{{key_info_why_asked}}</w:t>
+              <w:t>{{</w:t>
+            </w:r>
+            <w:proofErr w:type="spellStart"/>
+            <w:r>
+              <w:t>key_info_why_asked</w:t>
+            </w:r>
+            <w:proofErr w:type="spellEnd"/>
+            <w:r>
+              <w:t>}}</w:t>
             </w:r>
             <w:r>
               <w:t xml:space="preserve"> </w:t>
             </w:r>
             <w:r>
-              <w:t>{{key_info_purpose}}</w:t>
+              <w:t>{{</w:t>
+            </w:r>
+            <w:proofErr w:type="spellStart"/>
+            <w:r>
+              <w:t>key_info_purpose</w:t>
+            </w:r>
+            <w:proofErr w:type="spellEnd"/>
+            <w:r>
+              <w:t>}}</w:t>
             </w:r>
           </w:p>
           <w:p>
@@ -334,47 +489,103 @@
               <w:t xml:space="preserve">This is a </w:t>
             </w:r>
             <w:r>
-              <w:t>{{key_info_phase_explanation}} {{key_info_fda_status}}</w:t>
-            </w:r>
-          </w:p>
-          <w:p>
-            <w:pPr>
-              <w:jc w:val="left"/>
-            </w:pPr>
-            <w:r>
-              <w:t>{{key_info_happenings}}</w:t>
-            </w:r>
-          </w:p>
-          <w:p>
-            <w:pPr>
-              <w:jc w:val="left"/>
-            </w:pPr>
-            <w:r>
-              <w:t>{{key_info_benefits}}</w:t>
-            </w:r>
-          </w:p>
-          <w:p>
-            <w:pPr>
-              <w:jc w:val="left"/>
-            </w:pPr>
-            <w:r>
-              <w:t>{{key_info_risks}}</w:t>
-            </w:r>
-          </w:p>
-          <w:p>
-            <w:pPr>
-              <w:jc w:val="left"/>
-            </w:pPr>
-            <w:r>
-              <w:t>{{key_info_alternatives}}</w:t>
-            </w:r>
-          </w:p>
-          <w:p>
-            <w:pPr>
-              <w:jc w:val="left"/>
-            </w:pPr>
-            <w:r>
-              <w:t>{{key_info_voluntariness}}</w:t>
+              <w:t>{{</w:t>
+            </w:r>
+            <w:proofErr w:type="spellStart"/>
+            <w:r>
+              <w:t>key_info_phase_explanation</w:t>
+            </w:r>
+            <w:proofErr w:type="spellEnd"/>
+            <w:r>
+              <w:t>}} {{</w:t>
+            </w:r>
+            <w:proofErr w:type="spellStart"/>
+            <w:r>
+              <w:t>key_info_fda_status</w:t>
+            </w:r>
+            <w:proofErr w:type="spellEnd"/>
+            <w:r>
+              <w:t>}}</w:t>
+            </w:r>
+          </w:p>
+          <w:p>
+            <w:pPr>
+              <w:jc w:val="left"/>
+            </w:pPr>
+            <w:r>
+              <w:t>{{</w:t>
+            </w:r>
+            <w:proofErr w:type="spellStart"/>
+            <w:r>
+              <w:t>key_info_happenings</w:t>
+            </w:r>
+            <w:proofErr w:type="spellEnd"/>
+            <w:r>
+              <w:t>}}</w:t>
+            </w:r>
+          </w:p>
+          <w:p>
+            <w:pPr>
+              <w:jc w:val="left"/>
+            </w:pPr>
+            <w:r>
+              <w:t>{{</w:t>
+            </w:r>
+            <w:proofErr w:type="spellStart"/>
+            <w:r>
+              <w:t>key_info_benefits</w:t>
+            </w:r>
+            <w:proofErr w:type="spellEnd"/>
+            <w:r>
+              <w:t>}}</w:t>
+            </w:r>
+          </w:p>
+          <w:p>
+            <w:pPr>
+              <w:jc w:val="left"/>
+            </w:pPr>
+            <w:r>
+              <w:t>{{</w:t>
+            </w:r>
+            <w:proofErr w:type="spellStart"/>
+            <w:r>
+              <w:t>key_info_risks</w:t>
+            </w:r>
+            <w:proofErr w:type="spellEnd"/>
+            <w:r>
+              <w:t>}}</w:t>
+            </w:r>
+          </w:p>
+          <w:p>
+            <w:pPr>
+              <w:jc w:val="left"/>
+            </w:pPr>
+            <w:r>
+              <w:t>{{</w:t>
+            </w:r>
+            <w:proofErr w:type="spellStart"/>
+            <w:r>
+              <w:t>key_info_alternatives</w:t>
+            </w:r>
+            <w:proofErr w:type="spellEnd"/>
+            <w:r>
+              <w:t>}}</w:t>
+            </w:r>
+          </w:p>
+          <w:p>
+            <w:pPr>
+              <w:jc w:val="left"/>
+            </w:pPr>
+            <w:r>
+              <w:t>{{</w:t>
+            </w:r>
+            <w:proofErr w:type="spellStart"/>
+            <w:r>
+              <w:t>key_info_voluntariness</w:t>
+            </w:r>
+            <w:proofErr w:type="spellEnd"/>
+            <w:r>
+              <w:t>}}</w:t>
             </w:r>
           </w:p>
         </w:tc>
@@ -384,35 +595,41 @@
       <w:pPr>
         <w:jc w:val="left"/>
         <w:rPr>
-          <w:szCs w:val="24"/>
-        </w:rPr>
-      </w:pPr>
-      <w:r>
-        <w:rPr>
+          <w:color w:val="0070C0"/>
+          <w:szCs w:val="24"/>
+        </w:rPr>
+      </w:pPr>
+      <w:r>
+        <w:rPr>
+          <w:color w:val="0070C0"/>
           <w:szCs w:val="24"/>
         </w:rPr>
         <w:t xml:space="preserve">The remaining document will now describe the research study in more detail.  This information should be considered before you make your choice. Members of the study team will talk with you about the information in this document. Some people have personal, religious, or ethical beliefs that may limit the kinds of medical or research </w:t>
       </w:r>
       <w:r>
         <w:rPr>
+          <w:color w:val="0070C0"/>
           <w:szCs w:val="24"/>
         </w:rPr>
         <w:t xml:space="preserve">interventions in which </w:t>
       </w:r>
       <w:r>
         <w:rPr>
+          <w:color w:val="0070C0"/>
           <w:szCs w:val="24"/>
         </w:rPr>
         <w:t xml:space="preserve">they would want to </w:t>
       </w:r>
       <w:r>
         <w:rPr>
+          <w:color w:val="0070C0"/>
           <w:szCs w:val="24"/>
         </w:rPr>
         <w:t xml:space="preserve">participate. </w:t>
       </w:r>
       <w:r>
         <w:rPr>
+          <w:color w:val="0070C0"/>
           <w:szCs w:val="24"/>
         </w:rPr>
         <w:t>Take the time you need to ask any questions and discuss this study with NIH staff, and with your family, friends, and personal health care providers.</w:t>
@@ -429,7 +646,21 @@
         <w:rPr>
           <w:szCs w:val="24"/>
         </w:rPr>
-        <w:t>{{IF parent_permission}}</w:t>
+        <w:t xml:space="preserve">{{IF </w:t>
+      </w:r>
+      <w:proofErr w:type="spellStart"/>
+      <w:r>
+        <w:rPr>
+          <w:szCs w:val="24"/>
+        </w:rPr>
+        <w:t>parent_permission</w:t>
+      </w:r>
+      <w:proofErr w:type="spellEnd"/>
+      <w:r>
+        <w:rPr>
+          <w:szCs w:val="24"/>
+        </w:rPr>
+        <w:t>}}</w:t>
       </w:r>
     </w:p>
     <w:p>
@@ -461,7 +692,21 @@
         <w:rPr>
           <w:szCs w:val="24"/>
         </w:rPr>
-        <w:t>{{IF impaired_adults}}</w:t>
+        <w:t xml:space="preserve">{{IF </w:t>
+      </w:r>
+      <w:proofErr w:type="spellStart"/>
+      <w:r>
+        <w:rPr>
+          <w:szCs w:val="24"/>
+        </w:rPr>
+        <w:t>impaired_adults</w:t>
+      </w:r>
+      <w:proofErr w:type="spellEnd"/>
+      <w:r>
+        <w:rPr>
+          <w:szCs w:val="24"/>
+        </w:rPr>
+        <w:t>}}</w:t>
       </w:r>
     </w:p>
     <w:p>
@@ -473,7 +718,6 @@
         </w:rPr>
       </w:pPr>
       <w:r>
-        <w:lastRenderedPageBreak/>
         <w:t>If the individual being asked to participate in this research study is not able to give consent for themselves, you, as the Legally Authorized Representative, will be their decision-maker and you are being asked to give permission for this person to be in this study. For the remainder of this document, the term "you" refers to you as the decision-maker and/or the individual being asked to participate in this research.</w:t>
       </w:r>
       <w:r>
@@ -498,107 +742,125 @@
       <w:pPr>
         <w:jc w:val="left"/>
         <w:rPr>
-          <w:szCs w:val="24"/>
-        </w:rPr>
-      </w:pPr>
-      <w:r>
-        <w:rPr>
+          <w:color w:val="0070C0"/>
+          <w:szCs w:val="24"/>
+        </w:rPr>
+      </w:pPr>
+      <w:r>
+        <w:rPr>
+          <w:color w:val="0070C0"/>
           <w:szCs w:val="24"/>
         </w:rPr>
         <w:t>You may choose not to take part</w:t>
       </w:r>
       <w:r>
         <w:rPr>
+          <w:color w:val="0070C0"/>
           <w:szCs w:val="24"/>
         </w:rPr>
         <w:t xml:space="preserve"> in this study </w:t>
       </w:r>
       <w:r>
         <w:rPr>
+          <w:color w:val="0070C0"/>
           <w:szCs w:val="24"/>
         </w:rPr>
         <w:t xml:space="preserve">for any reason. </w:t>
       </w:r>
       <w:r>
         <w:rPr>
+          <w:color w:val="0070C0"/>
           <w:szCs w:val="24"/>
         </w:rPr>
         <w:t xml:space="preserve">If you join this study, you may change your mind and </w:t>
       </w:r>
       <w:r>
         <w:rPr>
+          <w:color w:val="0070C0"/>
           <w:szCs w:val="24"/>
         </w:rPr>
         <w:t xml:space="preserve">stop participating in </w:t>
       </w:r>
       <w:r>
         <w:rPr>
+          <w:color w:val="0070C0"/>
           <w:szCs w:val="24"/>
         </w:rPr>
         <w:t xml:space="preserve">the study at any time and for any reason. </w:t>
       </w:r>
       <w:r>
         <w:rPr>
+          <w:color w:val="0070C0"/>
           <w:szCs w:val="24"/>
         </w:rPr>
         <w:t xml:space="preserve">In either case, you will not lose any benefits to which you are otherwise entitled. However, to </w:t>
       </w:r>
       <w:r>
         <w:rPr>
+          <w:color w:val="0070C0"/>
           <w:szCs w:val="24"/>
         </w:rPr>
         <w:t>be seen</w:t>
       </w:r>
       <w:r>
         <w:rPr>
+          <w:color w:val="0070C0"/>
           <w:szCs w:val="24"/>
         </w:rPr>
         <w:t xml:space="preserve"> at the NIH, you must be taking part in a study</w:t>
       </w:r>
       <w:r>
         <w:rPr>
+          <w:color w:val="0070C0"/>
           <w:szCs w:val="24"/>
         </w:rPr>
         <w:t xml:space="preserve"> </w:t>
       </w:r>
       <w:r>
         <w:rPr>
+          <w:color w:val="0070C0"/>
           <w:szCs w:val="24"/>
         </w:rPr>
         <w:t xml:space="preserve">or </w:t>
       </w:r>
       <w:r>
         <w:rPr>
+          <w:color w:val="0070C0"/>
           <w:szCs w:val="24"/>
         </w:rPr>
         <w:t xml:space="preserve">are </w:t>
       </w:r>
       <w:r>
         <w:rPr>
+          <w:color w:val="0070C0"/>
           <w:szCs w:val="24"/>
         </w:rPr>
         <w:t>be</w:t>
       </w:r>
       <w:r>
         <w:rPr>
+          <w:color w:val="0070C0"/>
           <w:szCs w:val="24"/>
         </w:rPr>
         <w:t>ing considered for a study. If you do</w:t>
       </w:r>
       <w:r>
         <w:rPr>
+          <w:color w:val="0070C0"/>
           <w:szCs w:val="24"/>
         </w:rPr>
         <w:t xml:space="preserve"> choose to leave the study, please inform your study team to ensure a safe withdrawal from the </w:t>
       </w:r>
       <w:r>
         <w:rPr>
+          <w:color w:val="0070C0"/>
           <w:szCs w:val="24"/>
         </w:rPr>
         <w:t>research</w:t>
       </w:r>
       <w:r>
         <w:rPr>
+          <w:color w:val="0070C0"/>
           <w:szCs w:val="24"/>
         </w:rPr>
         <w:t xml:space="preserve">.  </w:t>
@@ -639,7 +901,21 @@
         <w:rPr>
           <w:szCs w:val="24"/>
         </w:rPr>
-        <w:t>The purpose of this research study is {{study_purpose}}</w:t>
+        <w:t>The purpose of this research study is {{</w:t>
+      </w:r>
+      <w:proofErr w:type="spellStart"/>
+      <w:r>
+        <w:rPr>
+          <w:szCs w:val="24"/>
+        </w:rPr>
+        <w:t>study_purpose</w:t>
+      </w:r>
+      <w:proofErr w:type="spellEnd"/>
+      <w:r>
+        <w:rPr>
+          <w:szCs w:val="24"/>
+        </w:rPr>
+        <w:t>}}</w:t>
       </w:r>
       <w:r>
         <w:rPr>
@@ -651,7 +927,21 @@
         <w:rPr>
           <w:szCs w:val="24"/>
         </w:rPr>
-        <w:t>We are asking you to join this research study because you {{why_you_asked}}</w:t>
+        <w:t>We are asking you to join this research study because you {{</w:t>
+      </w:r>
+      <w:proofErr w:type="spellStart"/>
+      <w:r>
+        <w:rPr>
+          <w:szCs w:val="24"/>
+        </w:rPr>
+        <w:t>why_you_asked</w:t>
+      </w:r>
+      <w:proofErr w:type="spellEnd"/>
+      <w:r>
+        <w:rPr>
+          <w:szCs w:val="24"/>
+        </w:rPr>
+        <w:t>}}</w:t>
       </w:r>
     </w:p>
     <w:p>
@@ -667,7 +957,21 @@
         <w:rPr>
           <w:szCs w:val="24"/>
         </w:rPr>
-        <w:t>{{IF is_investigational}}</w:t>
+        <w:t xml:space="preserve">{{IF </w:t>
+      </w:r>
+      <w:proofErr w:type="spellStart"/>
+      <w:r>
+        <w:rPr>
+          <w:szCs w:val="24"/>
+        </w:rPr>
+        <w:t>is_investigational</w:t>
+      </w:r>
+      <w:proofErr w:type="spellEnd"/>
+      <w:r>
+        <w:rPr>
+          <w:szCs w:val="24"/>
+        </w:rPr>
+        <w:t>}}</w:t>
       </w:r>
     </w:p>
     <w:p>
@@ -682,15 +986,27 @@
       <w:r>
         <w:t>{{</w:t>
       </w:r>
+      <w:proofErr w:type="spellStart"/>
       <w:r>
         <w:t>approach_investigational_drug_name</w:t>
       </w:r>
-      <w:r>
-        <w:t>}} is considered investigational, which means that it has not been approved by the U.S. Food and Drug Administration (FDA) to treat {{investigational_condition}}. However, the FDA has given us permission to use {{</w:t>
-      </w:r>
+      <w:proofErr w:type="spellEnd"/>
+      <w:r>
+        <w:t>}} is considered investigational, which means that it has not been approved by the U.S. Food and Drug Administration (FDA) to treat {{</w:t>
+      </w:r>
+      <w:proofErr w:type="spellStart"/>
+      <w:r>
+        <w:t>investigational_condition</w:t>
+      </w:r>
+      <w:proofErr w:type="spellEnd"/>
+      <w:r>
+        <w:t>}}. However, the FDA has given us permission to use {{</w:t>
+      </w:r>
+      <w:proofErr w:type="spellStart"/>
       <w:r>
         <w:t>approach_investigational_drug_name</w:t>
       </w:r>
+      <w:proofErr w:type="spellEnd"/>
       <w:r>
         <w:t>}} in this study.</w:t>
       </w:r>
@@ -711,7 +1027,15 @@
         </w:rPr>
       </w:pPr>
       <w:r>
-        <w:t>{{IF is_fda_approved_off_label}}</w:t>
+        <w:t xml:space="preserve">{{IF </w:t>
+      </w:r>
+      <w:proofErr w:type="spellStart"/>
+      <w:r>
+        <w:t>is_fda_approved_off_label</w:t>
+      </w:r>
+      <w:proofErr w:type="spellEnd"/>
+      <w:r>
+        <w:t>}}</w:t>
       </w:r>
     </w:p>
     <w:p>
@@ -726,11 +1050,29 @@
       <w:r>
         <w:t>The use of {{</w:t>
       </w:r>
+      <w:proofErr w:type="spellStart"/>
       <w:r>
         <w:t>approach_investigational_drug_name</w:t>
       </w:r>
-      <w:r>
-        <w:t>}} is approved to treat {{fda_approved_indication}}. We are testing it in this research study to see {{research_testing_reason}}</w:t>
+      <w:proofErr w:type="spellEnd"/>
+      <w:r>
+        <w:t>}} is approved to treat {{</w:t>
+      </w:r>
+      <w:proofErr w:type="spellStart"/>
+      <w:r>
+        <w:t>fda_approved_indication</w:t>
+      </w:r>
+      <w:proofErr w:type="spellEnd"/>
+      <w:r>
+        <w:t>}}. We are testing it in this research study to see {{</w:t>
+      </w:r>
+      <w:proofErr w:type="spellStart"/>
+      <w:r>
+        <w:t>research_testing_reason</w:t>
+      </w:r>
+      <w:proofErr w:type="spellEnd"/>
+      <w:r>
+        <w:t>}}</w:t>
       </w:r>
       <w:r>
         <w:t xml:space="preserve"> </w:t>
@@ -778,7 +1120,23 @@
           <w:bCs/>
           <w:szCs w:val="24"/>
         </w:rPr>
-        <w:t>{{study_procedures_intro}}</w:t>
+        <w:t>{{</w:t>
+      </w:r>
+      <w:proofErr w:type="spellStart"/>
+      <w:r>
+        <w:rPr>
+          <w:bCs/>
+          <w:szCs w:val="24"/>
+        </w:rPr>
+        <w:t>study_procedures_intro</w:t>
+      </w:r>
+      <w:proofErr w:type="spellEnd"/>
+      <w:r>
+        <w:rPr>
+          <w:bCs/>
+          <w:szCs w:val="24"/>
+        </w:rPr>
+        <w:t>}}</w:t>
       </w:r>
     </w:p>
     <w:tbl>
@@ -870,7 +1228,15 @@
               </w:rPr>
             </w:pPr>
             <w:r>
-              <w:t>{{FOR procedure IN study_procedures}}</w:t>
+              <w:t xml:space="preserve">{{FOR procedure IN </w:t>
+            </w:r>
+            <w:proofErr w:type="spellStart"/>
+            <w:r>
+              <w:t>study_procedures</w:t>
+            </w:r>
+            <w:proofErr w:type="spellEnd"/>
+            <w:r>
+              <w:t>}}</w:t>
             </w:r>
           </w:p>
         </w:tc>
@@ -914,7 +1280,23 @@
                 <w:b/>
                 <w:bCs/>
               </w:rPr>
-              <w:t>{{$procedure.title}}</w:t>
+              <w:t>{{$</w:t>
+            </w:r>
+            <w:proofErr w:type="spellStart"/>
+            <w:r>
+              <w:rPr>
+                <w:b/>
+                <w:bCs/>
+              </w:rPr>
+              <w:t>procedure.title</w:t>
+            </w:r>
+            <w:proofErr w:type="spellEnd"/>
+            <w:r>
+              <w:rPr>
+                <w:b/>
+                <w:bCs/>
+              </w:rPr>
+              <w:t>}}</w:t>
             </w:r>
           </w:p>
         </w:tc>
@@ -934,7 +1316,15 @@
               </w:rPr>
             </w:pPr>
             <w:r>
-              <w:t>{{$procedure.description}}</w:t>
+              <w:t>{{$</w:t>
+            </w:r>
+            <w:proofErr w:type="spellStart"/>
+            <w:r>
+              <w:t>procedure.description</w:t>
+            </w:r>
+            <w:proofErr w:type="spellEnd"/>
+            <w:r>
+              <w:t>}}</w:t>
             </w:r>
           </w:p>
         </w:tc>
@@ -992,7 +1382,6 @@
         </w:rPr>
       </w:pPr>
       <w:r>
-        <w:lastRenderedPageBreak/>
         <w:t xml:space="preserve">HOW LONG </w:t>
       </w:r>
       <w:r>
@@ -1017,7 +1406,23 @@
           <w:bCs/>
           <w:szCs w:val="24"/>
         </w:rPr>
-        <w:t>If you agree to take part in this study, you will be in it for about {{study_duration}}.</w:t>
+        <w:t>If you agree to take part in this study, you will be in it for about {{</w:t>
+      </w:r>
+      <w:proofErr w:type="spellStart"/>
+      <w:r>
+        <w:rPr>
+          <w:bCs/>
+          <w:szCs w:val="24"/>
+        </w:rPr>
+        <w:t>study_duration</w:t>
+      </w:r>
+      <w:proofErr w:type="spellEnd"/>
+      <w:r>
+        <w:rPr>
+          <w:bCs/>
+          <w:szCs w:val="24"/>
+        </w:rPr>
+        <w:t>}}.</w:t>
       </w:r>
     </w:p>
     <w:p>
@@ -1054,7 +1459,21 @@
         <w:rPr>
           <w:szCs w:val="24"/>
         </w:rPr>
-        <w:t xml:space="preserve"> {{accrual_ceiling}} people </w:t>
+        <w:t xml:space="preserve"> {{</w:t>
+      </w:r>
+      <w:proofErr w:type="spellStart"/>
+      <w:r>
+        <w:rPr>
+          <w:szCs w:val="24"/>
+        </w:rPr>
+        <w:t>accrual_ceiling</w:t>
+      </w:r>
+      <w:proofErr w:type="spellEnd"/>
+      <w:r>
+        <w:rPr>
+          <w:szCs w:val="24"/>
+        </w:rPr>
+        <w:t xml:space="preserve">}} people </w:t>
       </w:r>
       <w:r>
         <w:rPr>
@@ -1077,18 +1496,34 @@
         </w:rPr>
       </w:pPr>
       <w:r>
-        <w:t>{{IF multisite_count}}</w:t>
-      </w:r>
-    </w:p>
-    <w:p>
-      <w:pPr>
-        <w:jc w:val="left"/>
-        <w:rPr>
-          <w:szCs w:val="24"/>
-        </w:rPr>
-      </w:pPr>
-      <w:r>
-        <w:t xml:space="preserve">Up to {{multisite_count}} people might also </w:t>
+        <w:t xml:space="preserve">{{IF </w:t>
+      </w:r>
+      <w:proofErr w:type="spellStart"/>
+      <w:r>
+        <w:t>multisite_count</w:t>
+      </w:r>
+      <w:proofErr w:type="spellEnd"/>
+      <w:r>
+        <w:t>}}</w:t>
+      </w:r>
+    </w:p>
+    <w:p>
+      <w:pPr>
+        <w:jc w:val="left"/>
+        <w:rPr>
+          <w:szCs w:val="24"/>
+        </w:rPr>
+      </w:pPr>
+      <w:r>
+        <w:t>Up to {{</w:t>
+      </w:r>
+      <w:proofErr w:type="spellStart"/>
+      <w:r>
+        <w:t>multisite_count</w:t>
+      </w:r>
+      <w:proofErr w:type="spellEnd"/>
+      <w:r>
+        <w:t xml:space="preserve">}} people might also </w:t>
       </w:r>
       <w:r>
         <w:t>take part</w:t>
@@ -1138,7 +1573,21 @@
         <w:rPr>
           <w:szCs w:val="24"/>
         </w:rPr>
-        <w:t>{{risks_intro}}</w:t>
+        <w:t>{{</w:t>
+      </w:r>
+      <w:proofErr w:type="spellStart"/>
+      <w:r>
+        <w:rPr>
+          <w:szCs w:val="24"/>
+        </w:rPr>
+        <w:t>risks_intro</w:t>
+      </w:r>
+      <w:proofErr w:type="spellEnd"/>
+      <w:r>
+        <w:rPr>
+          <w:szCs w:val="24"/>
+        </w:rPr>
+        <w:t>}}</w:t>
       </w:r>
     </w:p>
     <w:p>
@@ -1150,7 +1599,15 @@
         </w:rPr>
       </w:pPr>
       <w:r>
-        <w:t>{{FOR drug IN drug_risks}}</w:t>
+        <w:t xml:space="preserve">{{FOR drug IN </w:t>
+      </w:r>
+      <w:proofErr w:type="spellStart"/>
+      <w:r>
+        <w:t>drug_risks</w:t>
+      </w:r>
+      <w:proofErr w:type="spellEnd"/>
+      <w:r>
+        <w:t>}}</w:t>
       </w:r>
     </w:p>
     <w:p>
@@ -1168,7 +1625,23 @@
           <w:b/>
           <w:bCs/>
         </w:rPr>
-        <w:t>Possible Side Effects of {{$drug.drug_name}}</w:t>
+        <w:t>Possible Side Effects of {{$</w:t>
+      </w:r>
+      <w:proofErr w:type="spellStart"/>
+      <w:r>
+        <w:rPr>
+          <w:b/>
+          <w:bCs/>
+        </w:rPr>
+        <w:t>drug.drug_name</w:t>
+      </w:r>
+      <w:proofErr w:type="spellEnd"/>
+      <w:r>
+        <w:rPr>
+          <w:b/>
+          <w:bCs/>
+        </w:rPr>
+        <w:t>}}</w:t>
       </w:r>
     </w:p>
     <w:tbl>
@@ -1217,7 +1690,15 @@
               </w:rPr>
             </w:pPr>
             <w:r>
-              <w:t>{{$drug.common_definition}}</w:t>
+              <w:t>{{$</w:t>
+            </w:r>
+            <w:proofErr w:type="spellStart"/>
+            <w:r>
+              <w:t>drug.common_definition</w:t>
+            </w:r>
+            <w:proofErr w:type="spellEnd"/>
+            <w:r>
+              <w:t>}}</w:t>
             </w:r>
           </w:p>
         </w:tc>
@@ -1236,7 +1717,15 @@
               </w:rPr>
             </w:pPr>
             <w:r>
-              <w:t>{{FOR risk IN $drug.common_risks}}</w:t>
+              <w:t>{{FOR risk IN $</w:t>
+            </w:r>
+            <w:proofErr w:type="spellStart"/>
+            <w:r>
+              <w:t>drug.common_risks</w:t>
+            </w:r>
+            <w:proofErr w:type="spellEnd"/>
+            <w:r>
+              <w:t>}}</w:t>
             </w:r>
           </w:p>
           <w:p>
@@ -1312,7 +1801,15 @@
               </w:rPr>
             </w:pPr>
             <w:r>
-              <w:t>{{$drug.occasional_definition}}</w:t>
+              <w:t>{{$</w:t>
+            </w:r>
+            <w:proofErr w:type="spellStart"/>
+            <w:r>
+              <w:t>drug.occasional_definition</w:t>
+            </w:r>
+            <w:proofErr w:type="spellEnd"/>
+            <w:r>
+              <w:t>}}</w:t>
             </w:r>
           </w:p>
         </w:tc>
@@ -1335,7 +1832,15 @@
               </w:rPr>
             </w:pPr>
             <w:r>
-              <w:t>{{FOR risk IN $drug.occasional_risks}}</w:t>
+              <w:t>{{FOR risk IN $</w:t>
+            </w:r>
+            <w:proofErr w:type="spellStart"/>
+            <w:r>
+              <w:t>drug.occasional_risks</w:t>
+            </w:r>
+            <w:proofErr w:type="spellEnd"/>
+            <w:r>
+              <w:t>}}</w:t>
             </w:r>
           </w:p>
           <w:p>
@@ -1410,7 +1915,15 @@
               </w:rPr>
             </w:pPr>
             <w:r>
-              <w:t>{{$drug.rare_definition}}</w:t>
+              <w:t>{{$</w:t>
+            </w:r>
+            <w:proofErr w:type="spellStart"/>
+            <w:r>
+              <w:t>drug.rare_definition</w:t>
+            </w:r>
+            <w:proofErr w:type="spellEnd"/>
+            <w:r>
+              <w:t>}}</w:t>
             </w:r>
           </w:p>
         </w:tc>
@@ -1429,7 +1942,15 @@
               </w:rPr>
             </w:pPr>
             <w:r>
-              <w:t>{{FOR risk IN $drug.rare_risks}}</w:t>
+              <w:t>{{FOR risk IN $</w:t>
+            </w:r>
+            <w:proofErr w:type="spellStart"/>
+            <w:r>
+              <w:t>drug.rare_risks</w:t>
+            </w:r>
+            <w:proofErr w:type="spellEnd"/>
+            <w:r>
+              <w:t>}}</w:t>
             </w:r>
           </w:p>
           <w:p>
@@ -1491,7 +2012,23 @@
           <w:bCs/>
           <w:szCs w:val="24"/>
         </w:rPr>
-        <w:t>{{procedures_risks_intro}}</w:t>
+        <w:t>{{</w:t>
+      </w:r>
+      <w:proofErr w:type="spellStart"/>
+      <w:r>
+        <w:rPr>
+          <w:bCs/>
+          <w:szCs w:val="24"/>
+        </w:rPr>
+        <w:t>procedures_risks_intro</w:t>
+      </w:r>
+      <w:proofErr w:type="spellEnd"/>
+      <w:r>
+        <w:rPr>
+          <w:bCs/>
+          <w:szCs w:val="24"/>
+        </w:rPr>
+        <w:t>}}</w:t>
       </w:r>
     </w:p>
     <w:tbl>
@@ -1533,7 +2070,6 @@
                 <w:bCs/>
                 <w:szCs w:val="24"/>
               </w:rPr>
-              <w:lastRenderedPageBreak/>
               <w:t>Procedure Name</w:t>
             </w:r>
           </w:p>
@@ -1600,9 +2136,11 @@
             <w:r>
               <w:t xml:space="preserve">IN </w:t>
             </w:r>
+            <w:proofErr w:type="spellStart"/>
             <w:r>
               <w:t>procedure_risks</w:t>
             </w:r>
+            <w:proofErr w:type="spellEnd"/>
             <w:r>
               <w:t>}}</w:t>
             </w:r>
@@ -1650,6 +2188,7 @@
               </w:rPr>
               <w:t>{{$</w:t>
             </w:r>
+            <w:proofErr w:type="spellStart"/>
             <w:r>
               <w:t>proc</w:t>
             </w:r>
@@ -1658,7 +2197,15 @@
                 <w:b/>
                 <w:bCs/>
               </w:rPr>
-              <w:t>.title}}</w:t>
+              <w:t>.title</w:t>
+            </w:r>
+            <w:proofErr w:type="spellEnd"/>
+            <w:r>
+              <w:rPr>
+                <w:b/>
+                <w:bCs/>
+              </w:rPr>
+              <w:t>}}</w:t>
             </w:r>
           </w:p>
         </w:tc>
@@ -1680,11 +2227,16 @@
             <w:r>
               <w:t>{{$</w:t>
             </w:r>
+            <w:proofErr w:type="spellStart"/>
             <w:r>
               <w:t>proc</w:t>
             </w:r>
             <w:r>
-              <w:t>.description}}</w:t>
+              <w:t>.description</w:t>
+            </w:r>
+            <w:proofErr w:type="spellEnd"/>
+            <w:r>
+              <w:t>}}</w:t>
             </w:r>
           </w:p>
         </w:tc>
@@ -1740,7 +2292,15 @@
         </w:rPr>
       </w:pPr>
       <w:r>
-        <w:t>{{IF pregnancy_risks}}</w:t>
+        <w:t xml:space="preserve">{{IF </w:t>
+      </w:r>
+      <w:proofErr w:type="spellStart"/>
+      <w:r>
+        <w:t>pregnancy_risks</w:t>
+      </w:r>
+      <w:proofErr w:type="spellEnd"/>
+      <w:r>
+        <w:t>}}</w:t>
       </w:r>
     </w:p>
     <w:p>
@@ -1765,7 +2325,21 @@
         <w:rPr>
           <w:szCs w:val="24"/>
         </w:rPr>
-        <w:t>{{pregnancy_risks}}</w:t>
+        <w:t>{{</w:t>
+      </w:r>
+      <w:proofErr w:type="spellStart"/>
+      <w:r>
+        <w:rPr>
+          <w:szCs w:val="24"/>
+        </w:rPr>
+        <w:t>pregnancy_risks</w:t>
+      </w:r>
+      <w:proofErr w:type="spellEnd"/>
+      <w:r>
+        <w:rPr>
+          <w:szCs w:val="24"/>
+        </w:rPr>
+        <w:t>}}</w:t>
       </w:r>
       <w:r>
         <w:rPr>
@@ -1784,9 +2358,11 @@
         </w:rPr>
         <w:t xml:space="preserve">{{IF </w:t>
       </w:r>
+      <w:proofErr w:type="spellStart"/>
       <w:r>
         <w:t>radiation_risks</w:t>
       </w:r>
+      <w:proofErr w:type="spellEnd"/>
       <w:r>
         <w:t>}}</w:t>
       </w:r>
@@ -1809,7 +2385,15 @@
         <w:jc w:val="left"/>
       </w:pPr>
       <w:r>
-        <w:t>{{radiation_risks}}</w:t>
+        <w:t>{{</w:t>
+      </w:r>
+      <w:proofErr w:type="spellStart"/>
+      <w:r>
+        <w:t>radiation_risks</w:t>
+      </w:r>
+      <w:proofErr w:type="spellEnd"/>
+      <w:r>
+        <w:t>}}</w:t>
       </w:r>
       <w:r>
         <w:t>{{END-IF}}</w:t>
@@ -1843,29 +2427,65 @@
         <w:rPr>
           <w:szCs w:val="24"/>
         </w:rPr>
-        <w:t>{{IF has_potential_benefits}}</w:t>
-      </w:r>
-    </w:p>
-    <w:p>
-      <w:pPr>
-        <w:jc w:val="left"/>
-        <w:rPr>
-          <w:szCs w:val="24"/>
-        </w:rPr>
-      </w:pPr>
-      <w:r>
-        <w:t>You might not benefit from being in this study. However, the potential benefit to you might be {{benefits_description}}{{END-IF}}</w:t>
-      </w:r>
-    </w:p>
-    <w:p>
-      <w:pPr>
-        <w:jc w:val="left"/>
-        <w:rPr>
-          <w:szCs w:val="24"/>
-        </w:rPr>
-      </w:pPr>
-      <w:r>
-        <w:t>{{IF no_potential_benefits}}</w:t>
+        <w:t xml:space="preserve">{{IF </w:t>
+      </w:r>
+      <w:proofErr w:type="spellStart"/>
+      <w:r>
+        <w:rPr>
+          <w:szCs w:val="24"/>
+        </w:rPr>
+        <w:t>has_potential_benefits</w:t>
+      </w:r>
+      <w:proofErr w:type="spellEnd"/>
+      <w:r>
+        <w:rPr>
+          <w:szCs w:val="24"/>
+        </w:rPr>
+        <w:t>}}</w:t>
+      </w:r>
+    </w:p>
+    <w:p>
+      <w:pPr>
+        <w:jc w:val="left"/>
+        <w:rPr>
+          <w:szCs w:val="24"/>
+        </w:rPr>
+      </w:pPr>
+      <w:r>
+        <w:rPr>
+          <w:color w:val="0070C0"/>
+        </w:rPr>
+        <w:t xml:space="preserve">You might not benefit from being in this study. </w:t>
+      </w:r>
+      <w:r>
+        <w:t>However, the potential benefit to you might be {{</w:t>
+      </w:r>
+      <w:proofErr w:type="spellStart"/>
+      <w:r>
+        <w:t>benefits_description</w:t>
+      </w:r>
+      <w:proofErr w:type="spellEnd"/>
+      <w:r>
+        <w:t>}}{{END-IF}}</w:t>
+      </w:r>
+    </w:p>
+    <w:p>
+      <w:pPr>
+        <w:jc w:val="left"/>
+        <w:rPr>
+          <w:szCs w:val="24"/>
+        </w:rPr>
+      </w:pPr>
+      <w:r>
+        <w:t xml:space="preserve">{{IF </w:t>
+      </w:r>
+      <w:proofErr w:type="spellStart"/>
+      <w:r>
+        <w:t>no_potential_benefits</w:t>
+      </w:r>
+      <w:proofErr w:type="spellEnd"/>
+      <w:r>
+        <w:t>}}</w:t>
       </w:r>
     </w:p>
     <w:p>
@@ -1908,7 +2528,21 @@
         <w:rPr>
           <w:szCs w:val="24"/>
         </w:rPr>
-        <w:t>In the future, other people might benefit from this study because {{benefits_others_reason}}.</w:t>
+        <w:t>In the future, other people might benefit from this study because {{</w:t>
+      </w:r>
+      <w:proofErr w:type="spellStart"/>
+      <w:r>
+        <w:rPr>
+          <w:szCs w:val="24"/>
+        </w:rPr>
+        <w:t>benefits_others_reason</w:t>
+      </w:r>
+      <w:proofErr w:type="spellEnd"/>
+      <w:r>
+        <w:rPr>
+          <w:szCs w:val="24"/>
+        </w:rPr>
+        <w:t>}}.</w:t>
       </w:r>
     </w:p>
     <w:p>
@@ -1958,7 +2592,15 @@
         </w:rPr>
       </w:pPr>
       <w:r>
-        <w:t>{{FOR alt IN alternatives_list}}</w:t>
+        <w:t xml:space="preserve">{{FOR alt IN </w:t>
+      </w:r>
+      <w:proofErr w:type="spellStart"/>
+      <w:r>
+        <w:t>alternatives_list</w:t>
+      </w:r>
+      <w:proofErr w:type="spellEnd"/>
+      <w:r>
+        <w:t>}}</w:t>
       </w:r>
     </w:p>
     <w:p>
@@ -1987,7 +2629,15 @@
         </w:rPr>
       </w:pPr>
       <w:r>
-        <w:t>{{IF alternatives_advice}}</w:t>
+        <w:t xml:space="preserve">{{IF </w:t>
+      </w:r>
+      <w:proofErr w:type="spellStart"/>
+      <w:r>
+        <w:t>alternatives_advice</w:t>
+      </w:r>
+      <w:proofErr w:type="spellEnd"/>
+      <w:r>
+        <w:t>}}</w:t>
       </w:r>
     </w:p>
     <w:p>
@@ -1999,7 +2649,15 @@
         </w:rPr>
       </w:pPr>
       <w:r>
-        <w:t>{{alternatives_advice}}{{END-IF}}</w:t>
+        <w:t>{{</w:t>
+      </w:r>
+      <w:proofErr w:type="spellStart"/>
+      <w:r>
+        <w:t>alternatives_advice</w:t>
+      </w:r>
+      <w:proofErr w:type="spellEnd"/>
+      <w:r>
+        <w:t>}}{{END-IF}}</w:t>
       </w:r>
     </w:p>
     <w:p>
@@ -2010,7 +2668,6 @@
         </w:rPr>
       </w:pPr>
       <w:r>
-        <w:lastRenderedPageBreak/>
         <w:t xml:space="preserve">DISCUSSION </w:t>
       </w:r>
       <w:r>
@@ -2077,7 +2734,15 @@
         <w:jc w:val="left"/>
       </w:pPr>
       <w:r>
-        <w:t>{{return_of_results}}</w:t>
+        <w:t>{{</w:t>
+      </w:r>
+      <w:proofErr w:type="spellStart"/>
+      <w:r>
+        <w:t>return_of_results</w:t>
+      </w:r>
+      <w:proofErr w:type="spellEnd"/>
+      <w:r>
+        <w:t>}}</w:t>
       </w:r>
     </w:p>
     <w:p>
@@ -2102,7 +2767,15 @@
         <w:jc w:val="left"/>
       </w:pPr>
       <w:r>
-        <w:t>{{early_withdrawal}}</w:t>
+        <w:t>{{</w:t>
+      </w:r>
+      <w:proofErr w:type="spellStart"/>
+      <w:r>
+        <w:t>early_withdrawal</w:t>
+      </w:r>
+      <w:proofErr w:type="spellEnd"/>
+      <w:r>
+        <w:t>}}</w:t>
       </w:r>
     </w:p>
     <w:p>
@@ -2165,9 +2838,29 @@
       <w:pPr>
         <w:ind w:right="180"/>
         <w:jc w:val="left"/>
-      </w:pPr>
-      <w:r>
-        <w:t>As part of this study, we are obtaining specimens and data from you. We plan to store and use these specimens and data for studies other than the one described in this consent form that are going on right now, as well as studies that may be conducted in the future. The specimens and data will be kept in a way that we will still know that they came from you (i.e., they will be identifiable to us). If we use your identifiable specimens or data for future research, our study will be reviewed and approved by an Institutional Review Board who will make sure that we are protecting your confidentiality. These future studies might help us better understand {{disease_condition}} or other diseases or conditions. This could include studies to develop other research tests, treatments, drugs, or devices, that may lead to the development of a commercial product by the NIH and/or its research or commercial partners. There are no plans to provide financial compensation to you if this happens. Also, it is unlikely that we will learn anything from these studies that may directly benefit you.</w:t>
+        <w:rPr>
+          <w:color w:val="0070C0"/>
+        </w:rPr>
+      </w:pPr>
+      <w:r>
+        <w:rPr>
+          <w:color w:val="0070C0"/>
+        </w:rPr>
+        <w:t>As part of this study, we are obtaining specimens and data from you. We plan to store and use these specimens and data for studies other than the one described in this consent form that are going on right now, as well as studies that may be conducted in the future. The specimens and data will be kept in a way that we will still know that they came from you (i.e., they will be identifiable to us). If we use your identifiable specimens or data for future research, our study will be reviewed and approved by an Institutional Review Board who will make sure that we are protecting your confidentiality. These future studies might help us better understand {{</w:t>
+      </w:r>
+      <w:proofErr w:type="spellStart"/>
+      <w:r>
+        <w:rPr>
+          <w:color w:val="0070C0"/>
+        </w:rPr>
+        <w:t>disease_condition</w:t>
+      </w:r>
+      <w:proofErr w:type="spellEnd"/>
+      <w:r>
+        <w:rPr>
+          <w:color w:val="0070C0"/>
+        </w:rPr>
+        <w:t>}} or other diseases or conditions. This could include studies to develop other research tests, treatments, drugs, or devices, that may lead to the development of a commercial product by the NIH and/or its research or commercial partners. There are no plans to provide financial compensation to you if this happens. Also, it is unlikely that we will learn anything from these studies that may directly benefit you.</w:t>
       </w:r>
     </w:p>
     <w:p>
@@ -2175,65 +2868,76 @@
         <w:ind w:right="187"/>
         <w:jc w:val="left"/>
         <w:rPr>
-          <w:szCs w:val="24"/>
-        </w:rPr>
-      </w:pPr>
-      <w:r>
-        <w:rPr>
+          <w:color w:val="0070C0"/>
+          <w:szCs w:val="24"/>
+        </w:rPr>
+      </w:pPr>
+      <w:r>
+        <w:rPr>
+          <w:color w:val="0070C0"/>
           <w:szCs w:val="24"/>
         </w:rPr>
         <w:t xml:space="preserve">I give permission for my </w:t>
       </w:r>
       <w:r>
         <w:rPr>
+          <w:color w:val="0070C0"/>
           <w:szCs w:val="24"/>
         </w:rPr>
         <w:t xml:space="preserve">identifiable </w:t>
       </w:r>
       <w:r>
         <w:rPr>
+          <w:color w:val="0070C0"/>
           <w:szCs w:val="24"/>
         </w:rPr>
         <w:t xml:space="preserve">specimens and data to be stored and used </w:t>
       </w:r>
       <w:r>
         <w:rPr>
+          <w:color w:val="0070C0"/>
           <w:szCs w:val="24"/>
         </w:rPr>
         <w:t xml:space="preserve">by the </w:t>
       </w:r>
       <w:r>
         <w:rPr>
+          <w:color w:val="0070C0"/>
           <w:szCs w:val="24"/>
         </w:rPr>
         <w:t>study</w:t>
       </w:r>
       <w:r>
         <w:rPr>
+          <w:color w:val="0070C0"/>
           <w:szCs w:val="24"/>
         </w:rPr>
         <w:t xml:space="preserve"> team </w:t>
       </w:r>
       <w:r>
         <w:rPr>
+          <w:color w:val="0070C0"/>
           <w:szCs w:val="24"/>
         </w:rPr>
         <w:t xml:space="preserve">for future </w:t>
       </w:r>
       <w:r>
         <w:rPr>
+          <w:color w:val="0070C0"/>
           <w:szCs w:val="24"/>
         </w:rPr>
         <w:t>studies</w:t>
       </w:r>
       <w:r>
         <w:rPr>
+          <w:color w:val="0070C0"/>
           <w:szCs w:val="24"/>
         </w:rPr>
         <w:t xml:space="preserve"> </w:t>
       </w:r>
       <w:r>
         <w:rPr>
+          <w:color w:val="0070C0"/>
           <w:szCs w:val="24"/>
         </w:rPr>
         <w:t>as described above.</w:t>
@@ -2245,17 +2949,20 @@
         <w:ind w:right="187"/>
         <w:jc w:val="left"/>
         <w:rPr>
-          <w:szCs w:val="24"/>
-        </w:rPr>
-      </w:pPr>
-      <w:r>
-        <w:rPr>
+          <w:color w:val="0070C0"/>
+          <w:szCs w:val="24"/>
+        </w:rPr>
+      </w:pPr>
+      <w:r>
+        <w:rPr>
+          <w:color w:val="0070C0"/>
           <w:szCs w:val="24"/>
         </w:rPr>
         <w:t>_____ Yes</w:t>
       </w:r>
       <w:r>
         <w:rPr>
+          <w:color w:val="0070C0"/>
           <w:szCs w:val="24"/>
         </w:rPr>
         <w:tab/>
@@ -2267,17 +2974,36 @@
         <w:spacing w:after="480"/>
         <w:ind w:right="187"/>
         <w:jc w:val="left"/>
-      </w:pPr>
-      <w:r>
+        <w:rPr>
+          <w:color w:val="0070C0"/>
+        </w:rPr>
+      </w:pPr>
+      <w:r>
+        <w:rPr>
+          <w:color w:val="0070C0"/>
+        </w:rPr>
         <w:t>Initial</w:t>
       </w:r>
       <w:r>
+        <w:rPr>
+          <w:color w:val="0070C0"/>
+        </w:rPr>
         <w:tab/>
       </w:r>
       <w:r>
+        <w:rPr>
+          <w:color w:val="0070C0"/>
+        </w:rPr>
         <w:tab/>
+      </w:r>
+      <w:proofErr w:type="spellStart"/>
+      <w:r>
+        <w:rPr>
+          <w:color w:val="0070C0"/>
+        </w:rPr>
         <w:t>Initial</w:t>
       </w:r>
+      <w:proofErr w:type="spellEnd"/>
     </w:p>
     <w:p>
       <w:pPr>
@@ -2312,8 +3038,14 @@
     <w:p>
       <w:pPr>
         <w:jc w:val="left"/>
-      </w:pPr>
-      <w:r>
+        <w:rPr>
+          <w:color w:val="0070C0"/>
+        </w:rPr>
+      </w:pPr>
+      <w:r>
+        <w:rPr>
+          <w:color w:val="0070C0"/>
+        </w:rPr>
         <w:t>We may share your specimens and data with other researchers. The other researchers may be doing studies in similar areas to this study or in other unrelated areas. These researchers may be at NIH, other research centers and institutions, or at commercial entities.</w:t>
       </w:r>
     </w:p>
@@ -2324,10 +3056,13 @@
           <w:rStyle w:val="Emphasis"/>
           <w:i w:val="0"/>
           <w:iCs w:val="0"/>
-        </w:rPr>
-      </w:pPr>
-      <w:r>
-        <w:lastRenderedPageBreak/>
+          <w:color w:val="0070C0"/>
+        </w:rPr>
+      </w:pPr>
+      <w:r>
+        <w:rPr>
+          <w:color w:val="0070C0"/>
+        </w:rPr>
         <w:t>One way that we may share your data is by putting it into a large database called a repository, which is a way to make it widely available to the research community. If we do place your data in a repository, it will be labeled with a code, (not with your name or other information that could be used to easily identify you). Even though it will only be labeled with a code, some types of data, in particular data about your genes (called genetic or genomic data), can be used to figure out who you are, although this is difficult to do, and we think it is unlikely to happen.</w:t>
       </w:r>
     </w:p>
@@ -2338,6 +3073,7 @@
           <w:rStyle w:val="Emphasis"/>
           <w:i w:val="0"/>
           <w:iCs w:val="0"/>
+          <w:color w:val="0070C0"/>
         </w:rPr>
       </w:pPr>
       <w:r>
@@ -2345,36 +3081,29 @@
           <w:rStyle w:val="Emphasis"/>
           <w:i w:val="0"/>
           <w:iCs w:val="0"/>
-        </w:rPr>
-        <w:t>{{IF is_open_repository}}</w:t>
-      </w:r>
-    </w:p>
-    <w:p>
-      <w:pPr>
-        <w:jc w:val="left"/>
+          <w:color w:val="0070C0"/>
+        </w:rPr>
+        <w:t xml:space="preserve">{{IF </w:t>
+      </w:r>
+      <w:proofErr w:type="spellStart"/>
+      <w:r>
         <w:rPr>
           <w:rStyle w:val="Emphasis"/>
           <w:i w:val="0"/>
           <w:iCs w:val="0"/>
           <w:color w:val="0070C0"/>
         </w:rPr>
-      </w:pPr>
-      <w:r>
-        <w:t>The data in the repository will be widely available to anyone who wants it.{{END-IF}}</w:t>
-      </w:r>
-    </w:p>
-    <w:p>
-      <w:pPr>
-        <w:jc w:val="left"/>
+        <w:t>is_open_repository</w:t>
+      </w:r>
+      <w:proofErr w:type="spellEnd"/>
+      <w:r>
         <w:rPr>
           <w:rStyle w:val="Emphasis"/>
           <w:i w:val="0"/>
           <w:iCs w:val="0"/>
           <w:color w:val="0070C0"/>
         </w:rPr>
-      </w:pPr>
-      <w:r>
-        <w:t>{{IF is_closed_repository}}</w:t>
+        <w:t>}}</w:t>
       </w:r>
     </w:p>
     <w:p>
@@ -2388,223 +3117,45 @@
         </w:rPr>
       </w:pPr>
       <w:r>
-        <w:t>The data in the repository will only be available to qualified researchers. These researchers must receive permission before they are allowed to access the data. Before receiving the data, the researchers must promise that they will not try to figure out the identity of the research participants.{{END-IF}}</w:t>
-      </w:r>
-    </w:p>
-    <w:p>
-      <w:pPr>
-        <w:ind w:right="180"/>
-        <w:jc w:val="left"/>
-        <w:rPr>
-          <w:szCs w:val="24"/>
-        </w:rPr>
-      </w:pPr>
-      <w:commentRangeStart w:id="10"/>
-      <w:r>
-        <w:rPr>
-          <w:szCs w:val="24"/>
-        </w:rPr>
-        <w:t>If we do share your specimens or data, we will know that the specimens and data came from you. However, the other researchers will not know that they came from you (i.e., they will be de-identified).</w:t>
-      </w:r>
-    </w:p>
-    <w:p>
-      <w:pPr>
-        <w:ind w:right="180"/>
-        <w:jc w:val="left"/>
-      </w:pPr>
-      <w:r>
-        <w:t xml:space="preserve">I give permission for my </w:t>
-      </w:r>
-      <w:r>
-        <w:rPr>
-          <w:b/>
-          <w:bCs/>
-        </w:rPr>
-        <w:t>de-identified</w:t>
-      </w:r>
-      <w:r>
-        <w:t xml:space="preserve"> specimens and data to be shared with and used by other researchers for future studies.</w:t>
-      </w:r>
-    </w:p>
-    <w:p>
-      <w:pPr>
-        <w:spacing w:before="0"/>
-        <w:ind w:right="187"/>
-        <w:jc w:val="left"/>
-        <w:rPr>
-          <w:szCs w:val="24"/>
-        </w:rPr>
-      </w:pPr>
-      <w:r>
-        <w:rPr>
-          <w:szCs w:val="24"/>
-        </w:rPr>
-        <w:t xml:space="preserve">_____ Yes </w:t>
-      </w:r>
-      <w:r>
-        <w:rPr>
-          <w:szCs w:val="24"/>
-        </w:rPr>
-        <w:tab/>
-        <w:t>_____ No</w:t>
-      </w:r>
-    </w:p>
-    <w:p>
-      <w:pPr>
-        <w:spacing w:before="0" w:after="0"/>
-        <w:ind w:right="187"/>
-        <w:jc w:val="left"/>
-        <w:rPr>
-          <w:szCs w:val="24"/>
-        </w:rPr>
-      </w:pPr>
-      <w:r>
-        <w:rPr>
-          <w:szCs w:val="24"/>
-        </w:rPr>
-        <w:t>Initial</w:t>
-      </w:r>
-      <w:r>
-        <w:rPr>
-          <w:szCs w:val="24"/>
-        </w:rPr>
-        <w:tab/>
-      </w:r>
-      <w:r>
-        <w:rPr>
-          <w:szCs w:val="24"/>
-        </w:rPr>
-        <w:tab/>
-        <w:t>Initial</w:t>
-      </w:r>
-    </w:p>
-    <w:p>
-      <w:pPr>
-        <w:ind w:right="180"/>
-        <w:jc w:val="left"/>
-      </w:pPr>
-    </w:p>
-    <w:p>
-      <w:pPr>
-        <w:ind w:right="180"/>
-        <w:jc w:val="left"/>
-      </w:pPr>
-      <w:r>
-        <w:t xml:space="preserve">In some cases, it may help other researchers to know that the specimens or data were collected from you (i.e., they will have your identifiers). If we share your identity with other researchers, their study will be reviewed and approved by an Institutional Review Board who will make sure that the study team is protecting your confidentiality. </w:t>
-      </w:r>
-    </w:p>
-    <w:p>
-      <w:pPr>
-        <w:ind w:right="180"/>
-        <w:jc w:val="left"/>
-        <w:rPr>
-          <w:szCs w:val="24"/>
-        </w:rPr>
-      </w:pPr>
-      <w:r>
-        <w:rPr>
-          <w:szCs w:val="24"/>
-        </w:rPr>
-        <w:t xml:space="preserve">I give permission for my </w:t>
-      </w:r>
-      <w:r>
-        <w:rPr>
-          <w:b/>
-          <w:bCs/>
-          <w:szCs w:val="24"/>
-        </w:rPr>
-        <w:t>identifiable</w:t>
-      </w:r>
-      <w:r>
-        <w:rPr>
-          <w:szCs w:val="24"/>
-        </w:rPr>
-        <w:t xml:space="preserve"> specimens and data to be shared with and used by other researchers for future studies.</w:t>
-      </w:r>
-    </w:p>
-    <w:p>
-      <w:pPr>
-        <w:spacing w:before="480"/>
-        <w:ind w:right="187"/>
-        <w:jc w:val="left"/>
-        <w:rPr>
-          <w:szCs w:val="24"/>
-        </w:rPr>
-      </w:pPr>
-      <w:r>
-        <w:rPr>
-          <w:szCs w:val="24"/>
-        </w:rPr>
-        <w:t xml:space="preserve">_____ Yes </w:t>
-      </w:r>
-      <w:r>
-        <w:rPr>
-          <w:szCs w:val="24"/>
-        </w:rPr>
-        <w:tab/>
-        <w:t>_____ No</w:t>
-      </w:r>
-    </w:p>
-    <w:p>
-      <w:pPr>
-        <w:spacing w:before="0" w:after="0"/>
-        <w:ind w:right="187"/>
-        <w:jc w:val="left"/>
-        <w:rPr>
-          <w:szCs w:val="24"/>
-        </w:rPr>
-      </w:pPr>
-      <w:r>
-        <w:rPr>
-          <w:szCs w:val="24"/>
-        </w:rPr>
-        <w:t>Initial</w:t>
-      </w:r>
-      <w:r>
-        <w:rPr>
-          <w:szCs w:val="24"/>
-        </w:rPr>
-        <w:tab/>
-      </w:r>
-      <w:r>
-        <w:rPr>
-          <w:szCs w:val="24"/>
-        </w:rPr>
-        <w:tab/>
-        <w:t>Initial</w:t>
-      </w:r>
-      <w:commentRangeEnd w:id="10"/>
-      <w:r>
-        <w:rPr>
-          <w:rStyle w:val="CommentReference"/>
-          <w:sz w:val="24"/>
-          <w:szCs w:val="24"/>
-        </w:rPr>
-        <w:commentReference w:id="10"/>
-      </w:r>
-    </w:p>
-    <w:p>
-      <w:pPr>
-        <w:jc w:val="left"/>
-      </w:pPr>
-    </w:p>
-    <w:p>
-      <w:pPr>
-        <w:ind w:right="180"/>
+        <w:rPr>
+          <w:color w:val="0070C0"/>
+        </w:rPr>
+        <w:t>The data in the repository will be widely available to anyone who wants it.{{END-IF}}</w:t>
+      </w:r>
+    </w:p>
+    <w:p>
+      <w:pPr>
         <w:jc w:val="left"/>
         <w:rPr>
           <w:rStyle w:val="Emphasis"/>
           <w:i w:val="0"/>
           <w:iCs w:val="0"/>
-        </w:rPr>
-      </w:pPr>
-      <w:r>
-        <w:t>{{IF genomic_non_sensitive}}</w:t>
-      </w:r>
-    </w:p>
-    <w:p>
-      <w:pPr>
-        <w:ind w:right="180"/>
+          <w:color w:val="0070C0"/>
+        </w:rPr>
+      </w:pPr>
+      <w:r>
+        <w:rPr>
+          <w:color w:val="0070C0"/>
+        </w:rPr>
+        <w:t xml:space="preserve">{{IF </w:t>
+      </w:r>
+      <w:proofErr w:type="spellStart"/>
+      <w:r>
+        <w:rPr>
+          <w:color w:val="0070C0"/>
+        </w:rPr>
+        <w:t>is_closed_repository</w:t>
+      </w:r>
+      <w:proofErr w:type="spellEnd"/>
+      <w:r>
+        <w:rPr>
+          <w:color w:val="0070C0"/>
+        </w:rPr>
+        <w:t>}}</w:t>
+      </w:r>
+    </w:p>
+    <w:p>
+      <w:pPr>
         <w:jc w:val="left"/>
         <w:rPr>
           <w:rStyle w:val="Emphasis"/>
@@ -2614,8 +3165,261 @@
         </w:rPr>
       </w:pPr>
       <w:r>
-        <w:t>Information about all the people (including you) in this study may be combined to create what is called summary information. The summary information may be placed in a database and shared in scientific publications. This information will help the researchers understand if some patterns are more common than others among everyone who was a part of this study. The summary information will be available to anyone without the need for any permission. The risk of anyone identifying you based on this information is very low.{{END-IF}}</w:t>
-      </w:r>
+        <w:rPr>
+          <w:color w:val="0070C0"/>
+        </w:rPr>
+        <w:t>The data in the repository will only be available to qualified researchers. These researchers must receive permission before they are allowed to access the data. Before receiving the data, the researchers must promise that they will not try to figure out the identity of the research participants.{{END-IF}}</w:t>
+      </w:r>
+    </w:p>
+    <w:p>
+      <w:pPr>
+        <w:ind w:right="180"/>
+        <w:jc w:val="left"/>
+        <w:rPr>
+          <w:color w:val="0070C0"/>
+          <w:szCs w:val="24"/>
+        </w:rPr>
+      </w:pPr>
+      <w:commentRangeStart w:id="10"/>
+      <w:r>
+        <w:rPr>
+          <w:color w:val="0070C0"/>
+          <w:szCs w:val="24"/>
+        </w:rPr>
+        <w:t>If we do share your specimens or data, we will know that the specimens and data came from you. However, the other researchers will not know that they came from you (i.e., they will be de-identified).</w:t>
+      </w:r>
+    </w:p>
+    <w:p>
+      <w:pPr>
+        <w:ind w:right="180"/>
+        <w:jc w:val="left"/>
+        <w:rPr>
+          <w:color w:val="0070C0"/>
+        </w:rPr>
+      </w:pPr>
+      <w:r>
+        <w:rPr>
+          <w:color w:val="0070C0"/>
+        </w:rPr>
+        <w:t xml:space="preserve">I give permission for my </w:t>
+      </w:r>
+      <w:r>
+        <w:rPr>
+          <w:b/>
+          <w:bCs/>
+          <w:color w:val="0070C0"/>
+        </w:rPr>
+        <w:t>de-identified</w:t>
+      </w:r>
+      <w:r>
+        <w:rPr>
+          <w:color w:val="0070C0"/>
+        </w:rPr>
+        <w:t xml:space="preserve"> specimens and data to be shared with and used by other researchers for future studies.</w:t>
+      </w:r>
+    </w:p>
+    <w:p>
+      <w:pPr>
+        <w:spacing w:before="0"/>
+        <w:ind w:right="187"/>
+        <w:jc w:val="left"/>
+        <w:rPr>
+          <w:color w:val="0070C0"/>
+          <w:szCs w:val="24"/>
+        </w:rPr>
+      </w:pPr>
+      <w:r>
+        <w:rPr>
+          <w:color w:val="0070C0"/>
+          <w:szCs w:val="24"/>
+        </w:rPr>
+        <w:t xml:space="preserve">_____ Yes </w:t>
+      </w:r>
+      <w:r>
+        <w:rPr>
+          <w:color w:val="0070C0"/>
+          <w:szCs w:val="24"/>
+        </w:rPr>
+        <w:tab/>
+        <w:t>_____ No</w:t>
+      </w:r>
+    </w:p>
+    <w:p>
+      <w:pPr>
+        <w:spacing w:before="0" w:after="0"/>
+        <w:ind w:right="187"/>
+        <w:jc w:val="left"/>
+        <w:rPr>
+          <w:color w:val="0070C0"/>
+          <w:szCs w:val="24"/>
+        </w:rPr>
+      </w:pPr>
+      <w:r>
+        <w:rPr>
+          <w:color w:val="0070C0"/>
+          <w:szCs w:val="24"/>
+        </w:rPr>
+        <w:t>Initial</w:t>
+      </w:r>
+      <w:r>
+        <w:rPr>
+          <w:color w:val="0070C0"/>
+          <w:szCs w:val="24"/>
+        </w:rPr>
+        <w:tab/>
+      </w:r>
+      <w:r>
+        <w:rPr>
+          <w:color w:val="0070C0"/>
+          <w:szCs w:val="24"/>
+        </w:rPr>
+        <w:tab/>
+      </w:r>
+      <w:proofErr w:type="spellStart"/>
+      <w:r>
+        <w:rPr>
+          <w:color w:val="0070C0"/>
+          <w:szCs w:val="24"/>
+        </w:rPr>
+        <w:t>Initial</w:t>
+      </w:r>
+      <w:proofErr w:type="spellEnd"/>
+    </w:p>
+    <w:p>
+      <w:pPr>
+        <w:ind w:right="180"/>
+        <w:jc w:val="left"/>
+      </w:pPr>
+    </w:p>
+    <w:p>
+      <w:pPr>
+        <w:ind w:right="180"/>
+        <w:jc w:val="left"/>
+        <w:rPr>
+          <w:color w:val="0070C0"/>
+        </w:rPr>
+      </w:pPr>
+      <w:r>
+        <w:rPr>
+          <w:color w:val="0070C0"/>
+        </w:rPr>
+        <w:t xml:space="preserve">In some cases, it may help other researchers to know that the specimens or data were collected from you (i.e., they will have your identifiers). If we share your identity with other researchers, their study will be reviewed and approved by an Institutional Review Board who will make sure that the study team is protecting your confidentiality. </w:t>
+      </w:r>
+    </w:p>
+    <w:p>
+      <w:pPr>
+        <w:ind w:right="180"/>
+        <w:jc w:val="left"/>
+        <w:rPr>
+          <w:color w:val="0070C0"/>
+          <w:szCs w:val="24"/>
+        </w:rPr>
+      </w:pPr>
+      <w:r>
+        <w:rPr>
+          <w:color w:val="0070C0"/>
+          <w:szCs w:val="24"/>
+        </w:rPr>
+        <w:t xml:space="preserve">I give permission for my </w:t>
+      </w:r>
+      <w:r>
+        <w:rPr>
+          <w:b/>
+          <w:bCs/>
+          <w:color w:val="0070C0"/>
+          <w:szCs w:val="24"/>
+        </w:rPr>
+        <w:t>identifiable</w:t>
+      </w:r>
+      <w:r>
+        <w:rPr>
+          <w:color w:val="0070C0"/>
+          <w:szCs w:val="24"/>
+        </w:rPr>
+        <w:t xml:space="preserve"> specimens and data to be shared with and used by other researchers for future studies.</w:t>
+      </w:r>
+    </w:p>
+    <w:p>
+      <w:pPr>
+        <w:spacing w:before="480"/>
+        <w:ind w:right="187"/>
+        <w:jc w:val="left"/>
+        <w:rPr>
+          <w:color w:val="0070C0"/>
+          <w:szCs w:val="24"/>
+        </w:rPr>
+      </w:pPr>
+      <w:r>
+        <w:rPr>
+          <w:color w:val="0070C0"/>
+          <w:szCs w:val="24"/>
+        </w:rPr>
+        <w:t xml:space="preserve">_____ Yes </w:t>
+      </w:r>
+      <w:r>
+        <w:rPr>
+          <w:color w:val="0070C0"/>
+          <w:szCs w:val="24"/>
+        </w:rPr>
+        <w:tab/>
+        <w:t>_____ No</w:t>
+      </w:r>
+    </w:p>
+    <w:p>
+      <w:pPr>
+        <w:spacing w:before="0" w:after="0"/>
+        <w:ind w:right="187"/>
+        <w:jc w:val="left"/>
+        <w:rPr>
+          <w:color w:val="0070C0"/>
+          <w:szCs w:val="24"/>
+        </w:rPr>
+      </w:pPr>
+      <w:r>
+        <w:rPr>
+          <w:color w:val="0070C0"/>
+          <w:szCs w:val="24"/>
+        </w:rPr>
+        <w:t>Initial</w:t>
+      </w:r>
+      <w:r>
+        <w:rPr>
+          <w:color w:val="0070C0"/>
+          <w:szCs w:val="24"/>
+        </w:rPr>
+        <w:tab/>
+      </w:r>
+      <w:r>
+        <w:rPr>
+          <w:color w:val="0070C0"/>
+          <w:szCs w:val="24"/>
+        </w:rPr>
+        <w:tab/>
+      </w:r>
+      <w:proofErr w:type="spellStart"/>
+      <w:r>
+        <w:rPr>
+          <w:color w:val="0070C0"/>
+          <w:szCs w:val="24"/>
+        </w:rPr>
+        <w:t>Initial</w:t>
+      </w:r>
+      <w:commentRangeEnd w:id="10"/>
+      <w:proofErr w:type="spellEnd"/>
+      <w:r>
+        <w:rPr>
+          <w:rStyle w:val="CommentReference"/>
+          <w:color w:val="0070C0"/>
+          <w:sz w:val="24"/>
+          <w:szCs w:val="24"/>
+        </w:rPr>
+        <w:commentReference w:id="10"/>
+      </w:r>
+    </w:p>
+    <w:p>
+      <w:pPr>
+        <w:jc w:val="left"/>
+      </w:pPr>
     </w:p>
     <w:p>
       <w:pPr>
@@ -2625,12 +3429,18 @@
           <w:rStyle w:val="Emphasis"/>
           <w:i w:val="0"/>
           <w:iCs w:val="0"/>
-          <w:color w:val="0070C0"/>
-        </w:rPr>
-      </w:pPr>
-      <w:r>
-        <w:lastRenderedPageBreak/>
-        <w:t>{{IF genomic_sensitive}}</w:t>
+        </w:rPr>
+      </w:pPr>
+      <w:r>
+        <w:t xml:space="preserve">{{IF </w:t>
+      </w:r>
+      <w:proofErr w:type="spellStart"/>
+      <w:r>
+        <w:t>genomic_non_sensitive</w:t>
+      </w:r>
+      <w:proofErr w:type="spellEnd"/>
+      <w:r>
+        <w:t>}}</w:t>
       </w:r>
     </w:p>
     <w:p>
@@ -2645,7 +3455,13 @@
         </w:rPr>
       </w:pPr>
       <w:r>
-        <w:t>Information about all the people (including you) in this study may be combined to create what is called summary information. The summary information may be placed in a database and will be made available to researchers only if they are granted permission. However, the summary information may still be shared in scientific publications without permissions. This information will help the researchers understand if some patterns are more common than others among everyone who was a part of this study. The risk of anyone identifying you based on this information is very low.{{END-IF}}</w:t>
+        <w:rPr>
+          <w:color w:val="0070C0"/>
+        </w:rPr>
+        <w:t>Information about all the people (including you) in this study may be combined to create what is called summary information. The summary information may be placed in a database and shared in scientific publications. This information will help the researchers understand if some patterns are more common than others among everyone who was a part of this study. The summary information will be available to anyone without the need for any permission. The risk of anyone identifying you based on this information is very low.</w:t>
+      </w:r>
+      <w:r>
+        <w:t>{{END-IF}}</w:t>
       </w:r>
     </w:p>
     <w:p>
@@ -2653,14 +3469,22 @@
         <w:ind w:right="180"/>
         <w:jc w:val="left"/>
         <w:rPr>
-          <w:szCs w:val="24"/>
-        </w:rPr>
-      </w:pPr>
-      <w:r>
-        <w:rPr>
-          <w:szCs w:val="24"/>
-        </w:rPr>
-        <w:t>{{IF may_anonymize}}</w:t>
+          <w:rStyle w:val="Emphasis"/>
+          <w:i w:val="0"/>
+          <w:iCs w:val="0"/>
+          <w:color w:val="0070C0"/>
+        </w:rPr>
+      </w:pPr>
+      <w:r>
+        <w:t xml:space="preserve">{{IF </w:t>
+      </w:r>
+      <w:proofErr w:type="spellStart"/>
+      <w:r>
+        <w:t>genomic_sensitive</w:t>
+      </w:r>
+      <w:proofErr w:type="spellEnd"/>
+      <w:r>
+        <w:t>}}</w:t>
       </w:r>
     </w:p>
     <w:p>
@@ -2668,12 +3492,20 @@
         <w:ind w:right="180"/>
         <w:jc w:val="left"/>
         <w:rPr>
-          <w:color w:val="0070C0"/>
-          <w:szCs w:val="24"/>
-        </w:rPr>
-      </w:pPr>
-      <w:r>
-        <w:t>In addition to the planned use and sharing described above, we might remove any labels from your specimens and data that might identify you (i.e., anonymize them), and use them or share them with other researchers for future studies at the NIH or other places. When we or the other researchers use your anonymized specimens and data for these projects, there will be no way to know that they came from you. We want to make sure that you understand that this is a possibility if you participate in this study. Once we do this, we would not be able to remove your specimens or data from these studies or prevent their use in future studies because we would not be able to tell which specimens or data belong to you.{{END-IF}}</w:t>
+          <w:rStyle w:val="Emphasis"/>
+          <w:i w:val="0"/>
+          <w:iCs w:val="0"/>
+          <w:color w:val="0070C0"/>
+        </w:rPr>
+      </w:pPr>
+      <w:r>
+        <w:rPr>
+          <w:color w:val="0070C0"/>
+        </w:rPr>
+        <w:t>Information about all the people (including you) in this study may be combined to create what is called summary information. The summary information may be placed in a database and will be made available to researchers only if they are granted permission. However, the summary information may still be shared in scientific publications without permissions. This information will help the researchers understand if some patterns are more common than others among everyone who was a part of this study. The risk of anyone identifying you based on this information is very low.</w:t>
+      </w:r>
+      <w:r>
+        <w:t>{{END-IF}}</w:t>
       </w:r>
     </w:p>
     <w:p>
@@ -2681,12 +3513,28 @@
         <w:ind w:right="180"/>
         <w:jc w:val="left"/>
         <w:rPr>
-          <w:color w:val="0070C0"/>
-          <w:szCs w:val="24"/>
-        </w:rPr>
-      </w:pPr>
-      <w:r>
-        <w:t>{{IF will_not_anonymize}}</w:t>
+          <w:szCs w:val="24"/>
+        </w:rPr>
+      </w:pPr>
+      <w:r>
+        <w:rPr>
+          <w:szCs w:val="24"/>
+        </w:rPr>
+        <w:t xml:space="preserve">{{IF </w:t>
+      </w:r>
+      <w:proofErr w:type="spellStart"/>
+      <w:r>
+        <w:rPr>
+          <w:szCs w:val="24"/>
+        </w:rPr>
+        <w:t>may_anonymize</w:t>
+      </w:r>
+      <w:proofErr w:type="spellEnd"/>
+      <w:r>
+        <w:rPr>
+          <w:szCs w:val="24"/>
+        </w:rPr>
+        <w:t>}}</w:t>
       </w:r>
     </w:p>
     <w:p>
@@ -2699,7 +3547,53 @@
         </w:rPr>
       </w:pPr>
       <w:r>
-        <w:t>We will not remove any labels that might identify you (anonymize) from your specimens and data and use or share them with other researchers for future studies at the NIH or other places.{{END-IF}}</w:t>
+        <w:rPr>
+          <w:color w:val="0070C0"/>
+        </w:rPr>
+        <w:t>In addition to the planned use and sharing described above, we might remove any labels from your specimens and data that might identify you (i.e., anonymize them), and use them or share them with other researchers for future studies at the NIH or other places. When we or the other researchers use your anonymized specimens and data for these projects, there will be no way to know that they came from you. We want to make sure that you understand that this is a possibility if you participate in this study. Once we do this, we would not be able to remove your specimens or data from these studies or prevent their use in future studies because we would not be able to tell which specimens or data belong to you.</w:t>
+      </w:r>
+      <w:r>
+        <w:t>{{END-IF}}</w:t>
+      </w:r>
+    </w:p>
+    <w:p>
+      <w:pPr>
+        <w:ind w:right="180"/>
+        <w:jc w:val="left"/>
+        <w:rPr>
+          <w:color w:val="0070C0"/>
+          <w:szCs w:val="24"/>
+        </w:rPr>
+      </w:pPr>
+      <w:r>
+        <w:t xml:space="preserve">{{IF </w:t>
+      </w:r>
+      <w:proofErr w:type="spellStart"/>
+      <w:r>
+        <w:t>will_not_anonymize</w:t>
+      </w:r>
+      <w:proofErr w:type="spellEnd"/>
+      <w:r>
+        <w:t>}}</w:t>
+      </w:r>
+    </w:p>
+    <w:p>
+      <w:pPr>
+        <w:ind w:right="180"/>
+        <w:jc w:val="left"/>
+        <w:rPr>
+          <w:color w:val="0070C0"/>
+          <w:szCs w:val="24"/>
+        </w:rPr>
+      </w:pPr>
+      <w:r>
+        <w:rPr>
+          <w:color w:val="0070C0"/>
+        </w:rPr>
+        <w:t>We will not remove any labels that might identify you (anonymize) from your specimens and data and use or share them with other researchers for future studies at the NIH or other places.</w:t>
+      </w:r>
+      <w:r>
+        <w:t>{{END-IF}}</w:t>
       </w:r>
     </w:p>
     <w:p>
@@ -2718,23 +3612,27 @@
         <w:jc w:val="left"/>
         <w:rPr>
           <w:b/>
-          <w:szCs w:val="24"/>
-        </w:rPr>
-      </w:pPr>
-      <w:r>
-        <w:rPr>
+          <w:color w:val="0070C0"/>
+          <w:szCs w:val="24"/>
+        </w:rPr>
+      </w:pPr>
+      <w:r>
+        <w:rPr>
+          <w:color w:val="0070C0"/>
           <w:szCs w:val="24"/>
         </w:rPr>
         <w:t xml:space="preserve">When we store your specimens and data, we take precautions to protect your information from others </w:t>
       </w:r>
       <w:r>
         <w:rPr>
+          <w:color w:val="0070C0"/>
           <w:szCs w:val="24"/>
         </w:rPr>
         <w:t>who</w:t>
       </w:r>
       <w:r>
         <w:rPr>
+          <w:color w:val="0070C0"/>
           <w:szCs w:val="24"/>
         </w:rPr>
         <w:t xml:space="preserve"> should not have access to it. When we share your specimens and data, we will do everything we can to protect your identity, for example, when appropriate, we remove information that can identify you. Even with the safeguards we put in place, we cannot guarantee that your identity will never become known, or that no one will gain unauthorized access to your information. New methods may be created in the future that could make it possible to re-identify your specimens and data.</w:t>
@@ -2756,11 +3654,13 @@
         <w:ind w:right="180"/>
         <w:jc w:val="left"/>
         <w:rPr>
-          <w:szCs w:val="24"/>
-        </w:rPr>
-      </w:pPr>
-      <w:r>
-        <w:rPr>
+          <w:color w:val="0070C0"/>
+          <w:szCs w:val="24"/>
+        </w:rPr>
+      </w:pPr>
+      <w:r>
+        <w:rPr>
+          <w:color w:val="0070C0"/>
           <w:szCs w:val="24"/>
         </w:rPr>
         <w:t xml:space="preserve">If you change your mind and do not want us to store and use your specimens and data for future studies, you should contact the study team. We will do our best to comply with your request but cannot guarantee that we will always be able to destroy your specimens and data. For example, if some research with your specimens and data is already complete, the information from that research may still be used. Also, if the specimens and data have been shared already, it might not be possible to withdraw them. </w:t>
@@ -2787,9 +3687,30 @@
       </w:pPr>
       <w:r>
         <w:rPr>
-          <w:szCs w:val="24"/>
-        </w:rPr>
-        <w:t>Your specimens and data may be stored by the NIH {{specimen_storage_duration}}.</w:t>
+          <w:color w:val="0070C0"/>
+          <w:szCs w:val="24"/>
+        </w:rPr>
+        <w:t xml:space="preserve">Your specimens and data may be stored by the NIH </w:t>
+      </w:r>
+      <w:r>
+        <w:rPr>
+          <w:szCs w:val="24"/>
+        </w:rPr>
+        <w:t>{{</w:t>
+      </w:r>
+      <w:proofErr w:type="spellStart"/>
+      <w:r>
+        <w:rPr>
+          <w:szCs w:val="24"/>
+        </w:rPr>
+        <w:t>specimen_storage_duration</w:t>
+      </w:r>
+      <w:proofErr w:type="spellEnd"/>
+      <w:r>
+        <w:rPr>
+          <w:szCs w:val="24"/>
+        </w:rPr>
+        <w:t>}}.</w:t>
       </w:r>
     </w:p>
     <w:p>
@@ -2801,7 +3722,6 @@
       </w:pPr>
       <w:bookmarkStart w:id="11" w:name="_Hlk57730381"/>
       <w:r>
-        <w:lastRenderedPageBreak/>
         <w:t>PAYMENT</w:t>
       </w:r>
     </w:p>
@@ -2849,7 +3769,21 @@
         <w:rPr>
           <w:szCs w:val="24"/>
         </w:rPr>
-        <w:t>{{IF no_payment}}</w:t>
+        <w:t xml:space="preserve">{{IF </w:t>
+      </w:r>
+      <w:proofErr w:type="spellStart"/>
+      <w:r>
+        <w:rPr>
+          <w:szCs w:val="24"/>
+        </w:rPr>
+        <w:t>no_payment</w:t>
+      </w:r>
+      <w:proofErr w:type="spellEnd"/>
+      <w:r>
+        <w:rPr>
+          <w:szCs w:val="24"/>
+        </w:rPr>
+        <w:t>}}</w:t>
       </w:r>
     </w:p>
     <w:p>
@@ -2862,7 +3796,13 @@
         </w:rPr>
       </w:pPr>
       <w:r>
-        <w:t>You will not receive any payment for taking part in this study.{{END-IF}}</w:t>
+        <w:rPr>
+          <w:color w:val="0070C0"/>
+        </w:rPr>
+        <w:t>You will not receive any payment for taking part in this study.</w:t>
+      </w:r>
+      <w:r>
+        <w:t>{{END-IF}}</w:t>
       </w:r>
     </w:p>
     <w:p>
@@ -2875,7 +3815,15 @@
         </w:rPr>
       </w:pPr>
       <w:r>
-        <w:t>{{IF has_payment}}</w:t>
+        <w:t xml:space="preserve">{{IF </w:t>
+      </w:r>
+      <w:proofErr w:type="spellStart"/>
+      <w:r>
+        <w:t>has_payment</w:t>
+      </w:r>
+      <w:proofErr w:type="spellEnd"/>
+      <w:r>
+        <w:t>}}</w:t>
       </w:r>
     </w:p>
     <w:p>
@@ -2888,7 +3836,15 @@
         </w:rPr>
       </w:pPr>
       <w:r>
-        <w:t>{{payment_details}}</w:t>
+        <w:t>{{</w:t>
+      </w:r>
+      <w:proofErr w:type="spellStart"/>
+      <w:r>
+        <w:t>payment_details</w:t>
+      </w:r>
+      <w:proofErr w:type="spellEnd"/>
+      <w:r>
+        <w:t>}}</w:t>
       </w:r>
     </w:p>
     <w:p>
@@ -2897,7 +3853,30 @@
         <w:jc w:val="left"/>
       </w:pPr>
       <w:r>
-        <w:t>If you are unable to finish the study, you will receive {{partial_payment_details}} for the parts you completed. If you have unpaid debt to the federal government, please be aware that some or all of your compensation may be automatically reduced to repay that debt on your behalf.{{END-IF}}</w:t>
+        <w:rPr>
+          <w:color w:val="0070C0"/>
+        </w:rPr>
+        <w:t xml:space="preserve">If you are unable to finish the study, you will receive </w:t>
+      </w:r>
+      <w:r>
+        <w:t>{{</w:t>
+      </w:r>
+      <w:proofErr w:type="spellStart"/>
+      <w:r>
+        <w:t>partial_payment_details</w:t>
+      </w:r>
+      <w:proofErr w:type="spellEnd"/>
+      <w:r>
+        <w:t xml:space="preserve">}} </w:t>
+      </w:r>
+      <w:r>
+        <w:rPr>
+          <w:color w:val="0070C0"/>
+        </w:rPr>
+        <w:t>for the parts you completed. If you have unpaid debt to the federal government, please be aware that some or all of your compensation may be automatically reduced to repay that debt on your behalf.</w:t>
+      </w:r>
+      <w:r>
+        <w:t>{{END-IF}}</w:t>
       </w:r>
     </w:p>
     <w:p>
@@ -2914,12 +3893,14 @@
         </w:rPr>
         <w:t xml:space="preserve">{{IF </w:t>
       </w:r>
+      <w:proofErr w:type="spellStart"/>
       <w:r>
         <w:rPr>
           <w:szCs w:val="24"/>
         </w:rPr>
         <w:t>payment_exceeds</w:t>
       </w:r>
+      <w:proofErr w:type="spellEnd"/>
       <w:r>
         <w:rPr>
           <w:szCs w:val="24"/>
@@ -2937,6 +3918,9 @@
         </w:rPr>
       </w:pPr>
       <w:r>
+        <w:rPr>
+          <w:color w:val="0070C0"/>
+        </w:rPr>
         <w:t xml:space="preserve">Study compensation may be considered taxable income that is reportable to the Internal Revenue Service (IRS).  A “Form 1099-Other Income” will be sent to you if your total payments for research participation exceeds the threshold to be reported as taxable income in the calendar year of your participation. Please contact the Clinical Research Volunteer Program at CC-PRPLRVSSupport@cc.nih.gov if you have any questions. </w:t>
       </w:r>
       <w:r>
@@ -3011,25 +3995,43 @@
       <w:r>
         <w:t xml:space="preserve">IF </w:t>
       </w:r>
+      <w:proofErr w:type="spellStart"/>
       <w:r>
         <w:t>reimbursement_</w:t>
       </w:r>
       <w:r>
         <w:t>true</w:t>
       </w:r>
+      <w:proofErr w:type="spellEnd"/>
       <w:r>
         <w:t>}}</w:t>
       </w:r>
       <w:r>
-        <w:t>{{reimbursement_info}}</w:t>
-      </w:r>
-    </w:p>
-    <w:p>
-      <w:pPr>
-        <w:jc w:val="left"/>
-      </w:pPr>
-      <w:r>
-        <w:t>{{IF reimbursement_flat_rate}}</w:t>
+        <w:t>{{</w:t>
+      </w:r>
+      <w:proofErr w:type="spellStart"/>
+      <w:r>
+        <w:t>reimbursement_info</w:t>
+      </w:r>
+      <w:proofErr w:type="spellEnd"/>
+      <w:r>
+        <w:t>}}</w:t>
+      </w:r>
+    </w:p>
+    <w:p>
+      <w:pPr>
+        <w:jc w:val="left"/>
+      </w:pPr>
+      <w:r>
+        <w:t xml:space="preserve">{{IF </w:t>
+      </w:r>
+      <w:proofErr w:type="spellStart"/>
+      <w:r>
+        <w:t>reimbursement_flat_rate</w:t>
+      </w:r>
+      <w:proofErr w:type="spellEnd"/>
+      <w:r>
+        <w:t>}}</w:t>
       </w:r>
     </w:p>
     <w:p>
@@ -3040,7 +4042,15 @@
         <w:t xml:space="preserve">Parents and participants will be reimbursed a total per diem of </w:t>
       </w:r>
       <w:r>
-        <w:t>{{per_diem_amount}}</w:t>
+        <w:t>{{</w:t>
+      </w:r>
+      <w:proofErr w:type="spellStart"/>
+      <w:r>
+        <w:t>per_diem_amount</w:t>
+      </w:r>
+      <w:proofErr w:type="spellEnd"/>
+      <w:r>
+        <w:t>}}</w:t>
       </w:r>
       <w:r>
         <w:t xml:space="preserve"> to offset the costs of meals and incidentals (for example, cab fare).</w:t>
@@ -3054,7 +4064,15 @@
         <w:jc w:val="left"/>
       </w:pPr>
       <w:r>
-        <w:t>{{IF reimbursement_travel_arranged}}</w:t>
+        <w:t xml:space="preserve">{{IF </w:t>
+      </w:r>
+      <w:proofErr w:type="spellStart"/>
+      <w:r>
+        <w:t>reimbursement_travel_arranged</w:t>
+      </w:r>
+      <w:proofErr w:type="spellEnd"/>
+      <w:r>
+        <w:t>}}</w:t>
       </w:r>
     </w:p>
     <w:p>
@@ -3073,18 +4091,29 @@
         <w:jc w:val="left"/>
       </w:pPr>
       <w:r>
-        <w:t>{{IF reimbursement_false}}</w:t>
-      </w:r>
-    </w:p>
-    <w:p>
-      <w:pPr>
-        <w:jc w:val="left"/>
-      </w:pPr>
-      <w:r>
-        <w:t>This study does not offer reimbursement for parents and participants, or payment of  hotel, travel, or meals.</w:t>
-      </w:r>
-      <w:r>
-        <w:t xml:space="preserve"> {{END-IF}}</w:t>
+        <w:t xml:space="preserve">{{IF </w:t>
+      </w:r>
+      <w:proofErr w:type="spellStart"/>
+      <w:r>
+        <w:t>reimbursement_false</w:t>
+      </w:r>
+      <w:proofErr w:type="spellEnd"/>
+      <w:r>
+        <w:t>}}</w:t>
+      </w:r>
+    </w:p>
+    <w:p>
+      <w:pPr>
+        <w:jc w:val="left"/>
+      </w:pPr>
+      <w:r>
+        <w:rPr>
+          <w:color w:val="0070C0"/>
+        </w:rPr>
+        <w:t xml:space="preserve">This study does not offer reimbursement for parents and participants, or payment of  hotel, travel, or meals. </w:t>
+      </w:r>
+      <w:r>
+        <w:t>{{END-IF}}</w:t>
       </w:r>
     </w:p>
     <w:p>
@@ -3128,11 +4157,13 @@
         <w:ind w:right="180"/>
         <w:jc w:val="left"/>
         <w:rPr>
-          <w:szCs w:val="24"/>
-        </w:rPr>
-      </w:pPr>
-      <w:r>
-        <w:rPr>
+          <w:color w:val="0070C0"/>
+          <w:szCs w:val="24"/>
+        </w:rPr>
+      </w:pPr>
+      <w:r>
+        <w:rPr>
+          <w:color w:val="0070C0"/>
           <w:szCs w:val="24"/>
         </w:rPr>
         <w:t>NIH does not bill health insurance companies or participants for any research or related clinical care that you receive at the NIH Clinical Center.</w:t>
@@ -3151,7 +4182,21 @@
         <w:rPr>
           <w:szCs w:val="24"/>
         </w:rPr>
-        <w:t>{{IF cost_additional}}</w:t>
+        <w:t xml:space="preserve">{{IF </w:t>
+      </w:r>
+      <w:proofErr w:type="spellStart"/>
+      <w:r>
+        <w:rPr>
+          <w:szCs w:val="24"/>
+        </w:rPr>
+        <w:t>cost_additional</w:t>
+      </w:r>
+      <w:proofErr w:type="spellEnd"/>
+      <w:r>
+        <w:rPr>
+          <w:szCs w:val="24"/>
+        </w:rPr>
+        <w:t>}}</w:t>
       </w:r>
     </w:p>
     <w:p>
@@ -3164,17 +4209,26 @@
         </w:rPr>
       </w:pPr>
       <w:r>
-        <w:lastRenderedPageBreak/>
-        <w:t>{{cost_additional}}{{END-IF}}</w:t>
+        <w:t>{{</w:t>
+      </w:r>
+      <w:proofErr w:type="spellStart"/>
+      <w:r>
+        <w:t>cost_additional</w:t>
+      </w:r>
+      <w:proofErr w:type="spellEnd"/>
+      <w:r>
+        <w:t>}}{{END-IF}}</w:t>
       </w:r>
     </w:p>
     <w:p>
       <w:r>
         <w:t xml:space="preserve">{{IF </w:t>
       </w:r>
+      <w:proofErr w:type="spellStart"/>
       <w:r>
         <w:t>covered_protocol</w:t>
       </w:r>
+      <w:proofErr w:type="spellEnd"/>
       <w:r>
         <w:t>}}</w:t>
       </w:r>
@@ -3198,12 +4252,14 @@
         <w:jc w:val="left"/>
         <w:rPr>
           <w:rFonts w:eastAsia="Times"/>
+          <w:color w:val="0070C0"/>
           <w:szCs w:val="24"/>
         </w:rPr>
       </w:pPr>
       <w:r>
         <w:rPr>
           <w:rFonts w:eastAsia="Times"/>
+          <w:color w:val="0070C0"/>
           <w:szCs w:val="24"/>
         </w:rPr>
         <w:t>The NIH reviews NIH staff researchers at least yearly for conflicts of interest. This process is detailed in a COI Guide. You may ask your research team for a copy of the COI Guide or for more information. Members of the research team who do not work for NIH are expected to follow these guidelines or the guidelines of their home institution, but they do not need to report their personal finances to the NIH.</w:t>
@@ -3224,7 +4280,21 @@
         <w:rPr>
           <w:szCs w:val="24"/>
         </w:rPr>
-        <w:t>{{IF coi_no_agreements}}</w:t>
+        <w:t xml:space="preserve">{{IF </w:t>
+      </w:r>
+      <w:proofErr w:type="spellStart"/>
+      <w:r>
+        <w:rPr>
+          <w:szCs w:val="24"/>
+        </w:rPr>
+        <w:t>coi_no_agreements</w:t>
+      </w:r>
+      <w:proofErr w:type="spellEnd"/>
+      <w:r>
+        <w:rPr>
+          <w:szCs w:val="24"/>
+        </w:rPr>
+        <w:t>}}</w:t>
       </w:r>
     </w:p>
     <w:p>
@@ -3239,7 +4309,13 @@
         </w:rPr>
       </w:pPr>
       <w:r>
-        <w:t>No NIH investigator involved in this study receives payments or other benefits from any company whose drug, product or device is being tested.{{END-IF}}</w:t>
+        <w:rPr>
+          <w:color w:val="0070C0"/>
+        </w:rPr>
+        <w:t>No NIH investigator involved in this study receives payments or other benefits from any company whose drug, product or device is being tested.</w:t>
+      </w:r>
+      <w:r>
+        <w:t>{{END-IF}}</w:t>
       </w:r>
     </w:p>
     <w:p>
@@ -3254,7 +4330,15 @@
         </w:rPr>
       </w:pPr>
       <w:r>
-        <w:t>{{IF coi_tech_license}}</w:t>
+        <w:t xml:space="preserve">{{IF </w:t>
+      </w:r>
+      <w:proofErr w:type="spellStart"/>
+      <w:r>
+        <w:t>coi_tech_license</w:t>
+      </w:r>
+      <w:proofErr w:type="spellEnd"/>
+      <w:r>
+        <w:t>}}</w:t>
       </w:r>
     </w:p>
     <w:p>
@@ -3269,7 +4353,38 @@
         </w:rPr>
       </w:pPr>
       <w:r>
-        <w:t>The NIH and the research team for this study have developed {{coi_product_description}} being used in this study. This means it is possible that the results of this study could lead to payments to NIH. By law, the government is required to share such payments with the employee inventors. You will not receive any money from the development of {{coi_product_name}}.{{END-IF}}</w:t>
+        <w:rPr>
+          <w:color w:val="0070C0"/>
+        </w:rPr>
+        <w:t xml:space="preserve">The NIH and the research team for this study have developed </w:t>
+      </w:r>
+      <w:r>
+        <w:t>{{</w:t>
+      </w:r>
+      <w:proofErr w:type="spellStart"/>
+      <w:r>
+        <w:t>coi_product_description</w:t>
+      </w:r>
+      <w:proofErr w:type="spellEnd"/>
+      <w:r>
+        <w:t xml:space="preserve">}} </w:t>
+      </w:r>
+      <w:r>
+        <w:rPr>
+          <w:color w:val="0070C0"/>
+        </w:rPr>
+        <w:t xml:space="preserve">being used in this study. This means it is possible that the results of this study could lead to payments to NIH. By law, the government is required to share such payments with the employee inventors. You will not receive any money from the development of </w:t>
+      </w:r>
+      <w:r>
+        <w:t>{{</w:t>
+      </w:r>
+      <w:proofErr w:type="spellStart"/>
+      <w:r>
+        <w:t>coi_product_name</w:t>
+      </w:r>
+      <w:proofErr w:type="spellEnd"/>
+      <w:r>
+        <w:t>}}.{{END-IF}}</w:t>
       </w:r>
     </w:p>
     <w:p>
@@ -3284,7 +4399,15 @@
         </w:rPr>
       </w:pPr>
       <w:r>
-        <w:t>{{IF coi_crada}}</w:t>
+        <w:t xml:space="preserve">{{IF </w:t>
+      </w:r>
+      <w:proofErr w:type="spellStart"/>
+      <w:r>
+        <w:t>coi_crada</w:t>
+      </w:r>
+      <w:proofErr w:type="spellEnd"/>
+      <w:r>
+        <w:t>}}</w:t>
       </w:r>
     </w:p>
     <w:p>
@@ -3299,7 +4422,47 @@
         </w:rPr>
       </w:pPr>
       <w:r>
-        <w:t>The NIH and the research team for this study are using {{coi_product_description}} developed by {{coi_company_name}} through a collaboration between your study team and the company. The company also provides financial support for this study.{{END-IF}}</w:t>
+        <w:rPr>
+          <w:color w:val="0070C0"/>
+        </w:rPr>
+        <w:t xml:space="preserve">The NIH and the research team for this study are using </w:t>
+      </w:r>
+      <w:r>
+        <w:t>{{</w:t>
+      </w:r>
+      <w:proofErr w:type="spellStart"/>
+      <w:r>
+        <w:t>coi_product_description</w:t>
+      </w:r>
+      <w:proofErr w:type="spellEnd"/>
+      <w:r>
+        <w:t xml:space="preserve">}} </w:t>
+      </w:r>
+      <w:r>
+        <w:rPr>
+          <w:color w:val="0070C0"/>
+        </w:rPr>
+        <w:t>developed by</w:t>
+      </w:r>
+      <w:r>
+        <w:t xml:space="preserve"> {{</w:t>
+      </w:r>
+      <w:proofErr w:type="spellStart"/>
+      <w:r>
+        <w:t>coi_company_name</w:t>
+      </w:r>
+      <w:proofErr w:type="spellEnd"/>
+      <w:r>
+        <w:t xml:space="preserve">}} </w:t>
+      </w:r>
+      <w:r>
+        <w:rPr>
+          <w:color w:val="0070C0"/>
+        </w:rPr>
+        <w:t>through a collaboration between your study team and the company. The company also provides financial support for this study.</w:t>
+      </w:r>
+      <w:r>
+        <w:t>{{END-IF}}</w:t>
       </w:r>
     </w:p>
     <w:p>
@@ -3314,7 +4477,15 @@
         </w:rPr>
       </w:pPr>
       <w:r>
-        <w:t>{{IF coi_cta}}</w:t>
+        <w:t xml:space="preserve">{{IF </w:t>
+      </w:r>
+      <w:proofErr w:type="spellStart"/>
+      <w:r>
+        <w:t>coi_cta</w:t>
+      </w:r>
+      <w:proofErr w:type="spellEnd"/>
+      <w:r>
+        <w:t>}}</w:t>
       </w:r>
     </w:p>
     <w:p>
@@ -3329,7 +4500,90 @@
         </w:rPr>
       </w:pPr>
       <w:r>
-        <w:t>{{coi_company_name}} is providing {{coi_product_provision}} for this study to NIH without charge{{= coi_through_program ? ` through the ${coi_program_name}` : `` }}. No NIH employee involved in this study receives any payment or other benefits from {{coi_company_name}}{{= coi_through_program ? ` or ${coi_program_name}` : `` }}.</w:t>
+        <w:t>{{</w:t>
+      </w:r>
+      <w:proofErr w:type="spellStart"/>
+      <w:r>
+        <w:t>coi_company_name</w:t>
+      </w:r>
+      <w:proofErr w:type="spellEnd"/>
+      <w:r>
+        <w:t xml:space="preserve">}} </w:t>
+      </w:r>
+      <w:r>
+        <w:rPr>
+          <w:color w:val="0070C0"/>
+        </w:rPr>
+        <w:t xml:space="preserve">is providing </w:t>
+      </w:r>
+      <w:r>
+        <w:t>{{</w:t>
+      </w:r>
+      <w:proofErr w:type="spellStart"/>
+      <w:r>
+        <w:t>coi_product_provision</w:t>
+      </w:r>
+      <w:proofErr w:type="spellEnd"/>
+      <w:r>
+        <w:t xml:space="preserve">}} </w:t>
+      </w:r>
+      <w:r>
+        <w:rPr>
+          <w:color w:val="0070C0"/>
+        </w:rPr>
+        <w:t>for this study to NIH without charge</w:t>
+      </w:r>
+      <w:r>
+        <w:t xml:space="preserve">{{= </w:t>
+      </w:r>
+      <w:proofErr w:type="spellStart"/>
+      <w:r>
+        <w:t>coi_through_program</w:t>
+      </w:r>
+      <w:proofErr w:type="spellEnd"/>
+      <w:r>
+        <w:t xml:space="preserve"> ? ` through the ${</w:t>
+      </w:r>
+      <w:proofErr w:type="spellStart"/>
+      <w:r>
+        <w:t>coi_program_name</w:t>
+      </w:r>
+      <w:proofErr w:type="spellEnd"/>
+      <w:r>
+        <w:t xml:space="preserve">}` : `` }}. </w:t>
+      </w:r>
+      <w:r>
+        <w:rPr>
+          <w:color w:val="0070C0"/>
+        </w:rPr>
+        <w:t xml:space="preserve">No NIH employee involved in this study receives any payment or other benefits from </w:t>
+      </w:r>
+      <w:r>
+        <w:t>{{</w:t>
+      </w:r>
+      <w:proofErr w:type="spellStart"/>
+      <w:r>
+        <w:t>coi_company_name</w:t>
+      </w:r>
+      <w:proofErr w:type="spellEnd"/>
+      <w:r>
+        <w:t xml:space="preserve">}}{{= </w:t>
+      </w:r>
+      <w:proofErr w:type="spellStart"/>
+      <w:r>
+        <w:t>coi_through_program</w:t>
+      </w:r>
+      <w:proofErr w:type="spellEnd"/>
+      <w:r>
+        <w:t xml:space="preserve"> ? ` or ${</w:t>
+      </w:r>
+      <w:proofErr w:type="spellStart"/>
+      <w:r>
+        <w:t>coi_program_name</w:t>
+      </w:r>
+      <w:proofErr w:type="spellEnd"/>
+      <w:r>
+        <w:t>}` : `` }}.</w:t>
       </w:r>
     </w:p>
     <w:p>
@@ -3395,12 +4649,14 @@
         </w:rPr>
         <w:t xml:space="preserve">{{IF </w:t>
       </w:r>
+      <w:proofErr w:type="spellStart"/>
       <w:r>
         <w:rPr>
           <w:szCs w:val="24"/>
         </w:rPr>
         <w:t>ct_gov_registration</w:t>
       </w:r>
+      <w:proofErr w:type="spellEnd"/>
       <w:r>
         <w:rPr>
           <w:szCs w:val="24"/>
@@ -3418,15 +4674,23 @@
       </w:pPr>
       <w:r>
         <w:rPr>
+          <w:color w:val="0070C0"/>
           <w:szCs w:val="24"/>
         </w:rPr>
         <w:t>A description of this clinical trial will be available on http://www.ClinicalTrials.gov, as required by U.S. Law. This Web site will not include information that can identify you. At most, the Web site will include a summary of the results. You can search this Web site at any time.</w:t>
       </w:r>
       <w:r>
         <w:rPr>
-          <w:szCs w:val="24"/>
-        </w:rPr>
-        <w:t xml:space="preserve"> {{END-IF}}</w:t>
+          <w:color w:val="0070C0"/>
+          <w:szCs w:val="24"/>
+        </w:rPr>
+        <w:t xml:space="preserve"> </w:t>
+      </w:r>
+      <w:r>
+        <w:rPr>
+          <w:szCs w:val="24"/>
+        </w:rPr>
+        <w:t>{{END-IF}}</w:t>
       </w:r>
       <w:hyperlink r:id="rId18" w:history="1"/>
     </w:p>
@@ -3446,8 +4710,13 @@
         <w:t>{{</w:t>
       </w:r>
       <w:r>
-        <w:t xml:space="preserve"> confidentiality_general</w:t>
-      </w:r>
+        <w:t xml:space="preserve"> </w:t>
+      </w:r>
+      <w:proofErr w:type="spellStart"/>
+      <w:r>
+        <w:t>confidentiality_general</w:t>
+      </w:r>
+      <w:proofErr w:type="spellEnd"/>
       <w:r>
         <w:t>}}</w:t>
       </w:r>
@@ -3460,7 +4729,6 @@
         </w:rPr>
       </w:pPr>
       <w:r>
-        <w:lastRenderedPageBreak/>
         <w:t xml:space="preserve">Will </w:t>
       </w:r>
       <w:r>
@@ -3546,14 +4814,46 @@
           <w:szCs w:val="24"/>
           <w:lang w:eastAsia="ar-SA"/>
         </w:rPr>
-        <w:t>{{IF study_sponsor}}</w:t>
-      </w:r>
+        <w:t xml:space="preserve">{{IF </w:t>
+      </w:r>
+      <w:proofErr w:type="spellStart"/>
       <w:r>
         <w:rPr>
           <w:szCs w:val="24"/>
           <w:lang w:eastAsia="ar-SA"/>
         </w:rPr>
-        <w:t>The study Sponsor, {{sponsor_name}}</w:t>
+        <w:t>study_sponsor</w:t>
+      </w:r>
+      <w:proofErr w:type="spellEnd"/>
+      <w:r>
+        <w:rPr>
+          <w:szCs w:val="24"/>
+          <w:lang w:eastAsia="ar-SA"/>
+        </w:rPr>
+        <w:t>}}</w:t>
+      </w:r>
+      <w:r>
+        <w:rPr>
+          <w:szCs w:val="24"/>
+          <w:lang w:eastAsia="ar-SA"/>
+        </w:rPr>
+        <w:t>The study Sponsor, {{</w:t>
+      </w:r>
+      <w:proofErr w:type="spellStart"/>
+      <w:r>
+        <w:rPr>
+          <w:szCs w:val="24"/>
+          <w:lang w:eastAsia="ar-SA"/>
+        </w:rPr>
+        <w:t>sponsor_name</w:t>
+      </w:r>
+      <w:proofErr w:type="spellEnd"/>
+      <w:r>
+        <w:rPr>
+          <w:szCs w:val="24"/>
+          <w:lang w:eastAsia="ar-SA"/>
+        </w:rPr>
+        <w:t>}}</w:t>
       </w:r>
     </w:p>
     <w:p>
@@ -3574,13 +4874,45 @@
           <w:szCs w:val="24"/>
           <w:lang w:eastAsia="ar-SA"/>
         </w:rPr>
-        <w:t>Qualified representatives from {{manufacturer_name}}, the pharmaceutical company that provides {{product_name}}.</w:t>
-      </w:r>
+        <w:t>Qualified representatives from {{</w:t>
+      </w:r>
+      <w:proofErr w:type="spellStart"/>
       <w:r>
         <w:rPr>
           <w:szCs w:val="24"/>
           <w:lang w:eastAsia="ar-SA"/>
         </w:rPr>
+        <w:t>manufacturer_name</w:t>
+      </w:r>
+      <w:proofErr w:type="spellEnd"/>
+      <w:r>
+        <w:rPr>
+          <w:szCs w:val="24"/>
+          <w:lang w:eastAsia="ar-SA"/>
+        </w:rPr>
+        <w:t>}}, the pharmaceutical company that provides {{</w:t>
+      </w:r>
+      <w:proofErr w:type="spellStart"/>
+      <w:r>
+        <w:rPr>
+          <w:szCs w:val="24"/>
+          <w:lang w:eastAsia="ar-SA"/>
+        </w:rPr>
+        <w:t>product_name</w:t>
+      </w:r>
+      <w:proofErr w:type="spellEnd"/>
+      <w:r>
+        <w:rPr>
+          <w:szCs w:val="24"/>
+          <w:lang w:eastAsia="ar-SA"/>
+        </w:rPr>
+        <w:t>}}.</w:t>
+      </w:r>
+      <w:r>
+        <w:rPr>
+          <w:szCs w:val="24"/>
+          <w:lang w:eastAsia="ar-SA"/>
+        </w:rPr>
         <w:t xml:space="preserve"> {{END-IF}}</w:t>
       </w:r>
     </w:p>
@@ -3588,11 +4920,13 @@
       <w:pPr>
         <w:jc w:val="left"/>
         <w:rPr>
-          <w:szCs w:val="24"/>
-        </w:rPr>
-      </w:pPr>
-      <w:r>
-        <w:rPr>
+          <w:color w:val="0070C0"/>
+          <w:szCs w:val="24"/>
+        </w:rPr>
+      </w:pPr>
+      <w:r>
+        <w:rPr>
+          <w:color w:val="0070C0"/>
           <w:szCs w:val="24"/>
         </w:rPr>
         <w:t xml:space="preserve">NIH and researchers doing this study follow special laws and policies to keep your information as private as possible. However, your identity and information about being in this study may accidentally be seen by others. </w:t>
@@ -3602,11 +4936,13 @@
       <w:pPr>
         <w:jc w:val="left"/>
         <w:rPr>
-          <w:szCs w:val="24"/>
-        </w:rPr>
-      </w:pPr>
-      <w:r>
-        <w:rPr>
+          <w:color w:val="0070C0"/>
+          <w:szCs w:val="24"/>
+        </w:rPr>
+      </w:pPr>
+      <w:r>
+        <w:rPr>
+          <w:color w:val="0070C0"/>
           <w:szCs w:val="24"/>
         </w:rPr>
         <w:t>In most cases, NIH will not share any identifiable information about you unless you say it is okay in writing.    More information about sharing your information is below.</w:t>
@@ -3619,11 +4955,13 @@
           <w:rFonts w:eastAsiaTheme="majorEastAsia"/>
           <w:b/>
           <w:caps/>
+          <w:color w:val="0070C0"/>
           <w:spacing w:val="-2"/>
         </w:rPr>
       </w:pPr>
       <w:r>
         <w:rPr>
+          <w:color w:val="0070C0"/>
           <w:lang w:eastAsia="ar-SA"/>
         </w:rPr>
         <w:t>Information gathered for this study is protected under a Certificate of Confidentiality and the Privacy Act.</w:t>
@@ -3645,11 +4983,13 @@
         <w:ind w:right="180"/>
         <w:jc w:val="left"/>
         <w:rPr>
-          <w:szCs w:val="24"/>
-        </w:rPr>
-      </w:pPr>
-      <w:r>
-        <w:rPr>
+          <w:color w:val="0070C0"/>
+          <w:szCs w:val="24"/>
+        </w:rPr>
+      </w:pPr>
+      <w:r>
+        <w:rPr>
+          <w:color w:val="0070C0"/>
           <w:szCs w:val="24"/>
         </w:rPr>
         <w:t xml:space="preserve">To help us protect your privacy, NIH has a Certificate of Confidentiality (Certificate). With this Certificate, researchers may not release or use information about you except in certain cases.  </w:t>
@@ -3659,41 +4999,48 @@
       <w:pPr>
         <w:jc w:val="left"/>
         <w:rPr>
-          <w:szCs w:val="24"/>
-        </w:rPr>
-      </w:pPr>
-      <w:r>
-        <w:rPr>
+          <w:color w:val="0070C0"/>
+          <w:szCs w:val="24"/>
+        </w:rPr>
+      </w:pPr>
+      <w:r>
+        <w:rPr>
+          <w:color w:val="0070C0"/>
           <w:szCs w:val="24"/>
         </w:rPr>
         <w:t>NIH researchers must not share information that may identify you in any legal proceedings</w:t>
       </w:r>
       <w:r>
         <w:rPr>
+          <w:color w:val="0070C0"/>
           <w:szCs w:val="24"/>
         </w:rPr>
         <w:t>,</w:t>
       </w:r>
       <w:r>
         <w:rPr>
+          <w:color w:val="0070C0"/>
           <w:szCs w:val="24"/>
         </w:rPr>
         <w:t xml:space="preserve"> </w:t>
       </w:r>
       <w:r>
         <w:rPr>
+          <w:color w:val="0070C0"/>
           <w:szCs w:val="24"/>
         </w:rPr>
         <w:t>such as</w:t>
       </w:r>
       <w:r>
         <w:rPr>
+          <w:color w:val="0070C0"/>
           <w:szCs w:val="24"/>
         </w:rPr>
         <w:t xml:space="preserve"> </w:t>
       </w:r>
       <w:r>
         <w:rPr>
+          <w:color w:val="0070C0"/>
           <w:szCs w:val="24"/>
         </w:rPr>
         <w:t xml:space="preserve">if a court requests it with a subpoena.  </w:t>
@@ -3703,11 +5050,13 @@
       <w:pPr>
         <w:jc w:val="left"/>
         <w:rPr>
-          <w:szCs w:val="24"/>
-        </w:rPr>
-      </w:pPr>
-      <w:r>
-        <w:rPr>
+          <w:color w:val="0070C0"/>
+          <w:szCs w:val="24"/>
+        </w:rPr>
+      </w:pPr>
+      <w:r>
+        <w:rPr>
+          <w:color w:val="0070C0"/>
           <w:szCs w:val="24"/>
         </w:rPr>
         <w:t xml:space="preserve">The Certificate does not protect your information when it:  </w:t>
@@ -3722,12 +5071,14 @@
         <w:contextualSpacing/>
         <w:jc w:val="left"/>
         <w:rPr>
+          <w:color w:val="0070C0"/>
           <w:szCs w:val="24"/>
           <w:shd w:val="clear" w:color="auto" w:fill="FFFFFF"/>
         </w:rPr>
       </w:pPr>
       <w:r>
         <w:rPr>
+          <w:color w:val="0070C0"/>
           <w:szCs w:val="24"/>
           <w:shd w:val="clear" w:color="auto" w:fill="FFFFFF"/>
         </w:rPr>
@@ -3743,11 +5094,13 @@
         <w:contextualSpacing/>
         <w:jc w:val="left"/>
         <w:rPr>
-          <w:szCs w:val="24"/>
-        </w:rPr>
-      </w:pPr>
-      <w:r>
-        <w:rPr>
+          <w:color w:val="0070C0"/>
+          <w:szCs w:val="24"/>
+        </w:rPr>
+      </w:pPr>
+      <w:r>
+        <w:rPr>
+          <w:color w:val="0070C0"/>
           <w:szCs w:val="24"/>
         </w:rPr>
         <w:t>is required by law to be disclosed.  For example, information may be shared with the FDA or with public health agencies.</w:t>
@@ -3762,11 +5115,13 @@
         <w:contextualSpacing/>
         <w:jc w:val="left"/>
         <w:rPr>
-          <w:szCs w:val="24"/>
-        </w:rPr>
-      </w:pPr>
-      <w:r>
-        <w:rPr>
+          <w:color w:val="0070C0"/>
+          <w:szCs w:val="24"/>
+        </w:rPr>
+      </w:pPr>
+      <w:r>
+        <w:rPr>
+          <w:color w:val="0070C0"/>
           <w:szCs w:val="24"/>
         </w:rPr>
         <w:t>is for other research if allowed by other regulations;</w:t>
@@ -3781,11 +5136,13 @@
         <w:contextualSpacing/>
         <w:jc w:val="left"/>
         <w:rPr>
-          <w:szCs w:val="24"/>
-        </w:rPr>
-      </w:pPr>
-      <w:r>
-        <w:rPr>
+          <w:color w:val="0070C0"/>
+          <w:szCs w:val="24"/>
+        </w:rPr>
+      </w:pPr>
+      <w:r>
+        <w:rPr>
+          <w:color w:val="0070C0"/>
           <w:szCs w:val="24"/>
         </w:rPr>
         <w:t xml:space="preserve">is shared with your consent. </w:t>
@@ -3796,26 +5153,30 @@
         <w:jc w:val="left"/>
         <w:rPr>
           <w:rFonts w:eastAsia="Calibri"/>
-          <w:szCs w:val="24"/>
-        </w:rPr>
-      </w:pPr>
-    </w:p>
-    <w:p>
-      <w:pPr>
-        <w:jc w:val="left"/>
-        <w:rPr>
+          <w:color w:val="0070C0"/>
+          <w:szCs w:val="24"/>
+        </w:rPr>
+      </w:pPr>
+    </w:p>
+    <w:p>
+      <w:pPr>
+        <w:jc w:val="left"/>
+        <w:rPr>
+          <w:color w:val="0070C0"/>
           <w:szCs w:val="24"/>
         </w:rPr>
       </w:pPr>
       <w:r>
         <w:rPr>
           <w:rFonts w:eastAsia="Calibri"/>
+          <w:color w:val="0070C0"/>
           <w:szCs w:val="24"/>
         </w:rPr>
         <w:t xml:space="preserve">Researchers may provide your information when you say it is okay. </w:t>
       </w:r>
       <w:r>
         <w:rPr>
+          <w:color w:val="0070C0"/>
           <w:szCs w:val="24"/>
         </w:rPr>
         <w:t xml:space="preserve">The Certificate does not keep you from sharing your own information. </w:t>
@@ -3830,11 +5191,15 @@
       </w:pPr>
       <w:r>
         <w:rPr>
+          <w:color w:val="0070C0"/>
           <w:szCs w:val="24"/>
         </w:rPr>
         <w:t>The Certificate will not prevent telling authorities about harm to yourself or others. Examples are child abuse and neglect</w:t>
       </w:r>
       <w:r>
+        <w:rPr>
+          <w:color w:val="0070C0"/>
+        </w:rPr>
         <w:t xml:space="preserve">. </w:t>
       </w:r>
     </w:p>
@@ -3852,64 +5217,90 @@
     <w:p>
       <w:pPr>
         <w:jc w:val="left"/>
-      </w:pPr>
-      <w:r>
+        <w:rPr>
+          <w:color w:val="0070C0"/>
+        </w:rPr>
+      </w:pPr>
+      <w:r>
+        <w:rPr>
+          <w:color w:val="0070C0"/>
+        </w:rPr>
         <w:t>The Privacy Act helps keep your NIH medical information confidential.  In some cases, it is different from the Certificate. </w:t>
       </w:r>
       <w:r>
-        <w:t xml:space="preserve"> Under 42 U.S.C. § 282, NIH is authorized to collect the data for </w:t>
-      </w:r>
-      <w:r>
-        <w:lastRenderedPageBreak/>
-        <w:t xml:space="preserve">this study. This data is covered by an NIH Privacy Act System of Records Notices: </w:t>
+        <w:rPr>
+          <w:color w:val="0070C0"/>
+        </w:rPr>
+        <w:t xml:space="preserve"> Under 42 U.S.C. § 282, NIH is authorized to collect the data for this study. This data is covered by an NIH Privacy Act System of Records Notices: </w:t>
       </w:r>
       <w:hyperlink r:id="rId19" w:history="1">
         <w:r>
           <w:rPr>
             <w:rStyle w:val="Hyperlink"/>
-            <w:color w:val="auto"/>
+            <w:color w:val="0070C0"/>
           </w:rPr>
           <w:t xml:space="preserve">09-25-0200, </w:t>
         </w:r>
         <w:r>
           <w:rPr>
             <w:rStyle w:val="Hyperlink"/>
-            <w:color w:val="auto"/>
+            <w:color w:val="0070C0"/>
             <w:lang w:val="en"/>
           </w:rPr>
           <w:t>Clinical, Basic and Population-based Research Studies of the National Institutes of Health</w:t>
         </w:r>
       </w:hyperlink>
       <w:r>
+        <w:rPr>
+          <w:color w:val="0070C0"/>
+        </w:rPr>
         <w:t xml:space="preserve"> and </w:t>
       </w:r>
       <w:hyperlink r:id="rId20" w:history="1">
         <w:r>
           <w:rPr>
             <w:rStyle w:val="Hyperlink"/>
-            <w:color w:val="auto"/>
+            <w:color w:val="0070C0"/>
           </w:rPr>
           <w:t>09-25-0099, Clinical Research: Patient Medical Records</w:t>
         </w:r>
       </w:hyperlink>
       <w:r>
+        <w:rPr>
+          <w:color w:val="0070C0"/>
+        </w:rPr>
         <w:t xml:space="preserve">. </w:t>
       </w:r>
       <w:r>
+        <w:rPr>
+          <w:color w:val="0070C0"/>
+        </w:rPr>
         <w:t>Sometimes the Privacy Act allows sharing your information without your permission. An example is if Congress requests it. </w:t>
       </w:r>
     </w:p>
     <w:p>
       <w:pPr>
         <w:jc w:val="left"/>
-      </w:pPr>
-      <w:r>
+        <w:rPr>
+          <w:color w:val="0070C0"/>
+        </w:rPr>
+      </w:pPr>
+      <w:r>
+        <w:rPr>
+          <w:color w:val="0070C0"/>
+        </w:rPr>
         <w:t>Information may also be shared for some research. It can be given to some federal and state agencies. It can be used for HIV partner notification, or for infectious disease, abuse, or neglect reports.  It may be shared with tumor registries, for quality and medical reviews.  It may also be shared if NIH is involved in a lawsuit</w:t>
       </w:r>
       <w:r>
+        <w:rPr>
+          <w:color w:val="0070C0"/>
+        </w:rPr>
         <w:t xml:space="preserve"> or event of a suspected or confirmed breach</w:t>
       </w:r>
       <w:r>
+        <w:rPr>
+          <w:color w:val="0070C0"/>
+        </w:rPr>
         <w:t>.  However, NIH will only release medical record information if allowed by both the Certificate and the Privacy Act.</w:t>
       </w:r>
     </w:p>
@@ -3930,8 +5321,14 @@
     <w:p>
       <w:pPr>
         <w:jc w:val="left"/>
-      </w:pPr>
-      <w:r>
+        <w:rPr>
+          <w:color w:val="0070C0"/>
+        </w:rPr>
+      </w:pPr>
+      <w:r>
+        <w:rPr>
+          <w:color w:val="0070C0"/>
+        </w:rPr>
         <w:t>The NIH Clinical Center will provide short-term medical care for any injury resulting from your participation in research here. In general, no long-term medical care or financial compensation for research-related injuries will be provided by the NIH, the NIH Clinical Center, or the Federal Government. However, you have the right to pursue legal remedy if you believe that your injury justifies such action.</w:t>
       </w:r>
     </w:p>
@@ -3952,9 +5349,81 @@
     <w:p>
       <w:pPr>
         <w:jc w:val="left"/>
-      </w:pPr>
-      <w:r>
-        <w:t>If you have any problems or questions about this study, or about your rights as a research participant, or about any research-related injury, contact the Principal Investigator, {{contact_name}}, {{contact_email}}, {{contact_phone}}.{{IF other_contact_name}} Other researchers you may call are: {{other_contact_name}}, at {{other_contact_phone}}.{{END-IF}} You may also call the NIH Clinical Center Patient Representative at 301-496-2626, or the NIH Office of IRB Operations at 301-402-3713 if you have a research-related complaint or concern.</w:t>
+        <w:rPr>
+          <w:color w:val="0070C0"/>
+        </w:rPr>
+      </w:pPr>
+      <w:r>
+        <w:rPr>
+          <w:color w:val="0070C0"/>
+        </w:rPr>
+        <w:t xml:space="preserve">If you have any problems or questions about this study, or about your rights as a research participant, or about any research-related injury, contact the Principal Investigator, </w:t>
+      </w:r>
+      <w:r>
+        <w:t>{{</w:t>
+      </w:r>
+      <w:proofErr w:type="spellStart"/>
+      <w:r>
+        <w:t>contact_name</w:t>
+      </w:r>
+      <w:proofErr w:type="spellEnd"/>
+      <w:r>
+        <w:t>}}, {{</w:t>
+      </w:r>
+      <w:proofErr w:type="spellStart"/>
+      <w:r>
+        <w:t>contact_email</w:t>
+      </w:r>
+      <w:proofErr w:type="spellEnd"/>
+      <w:r>
+        <w:t>}}, {{</w:t>
+      </w:r>
+      <w:proofErr w:type="spellStart"/>
+      <w:r>
+        <w:t>contact_phone</w:t>
+      </w:r>
+      <w:proofErr w:type="spellEnd"/>
+      <w:r>
+        <w:t xml:space="preserve">}}.{{IF </w:t>
+      </w:r>
+      <w:proofErr w:type="spellStart"/>
+      <w:r>
+        <w:t>other_contact_name</w:t>
+      </w:r>
+      <w:proofErr w:type="spellEnd"/>
+      <w:r>
+        <w:t xml:space="preserve">}} </w:t>
+      </w:r>
+      <w:r>
+        <w:rPr>
+          <w:color w:val="0070C0"/>
+        </w:rPr>
+        <w:t xml:space="preserve">Other researchers you may call are: </w:t>
+      </w:r>
+      <w:r>
+        <w:t>{{</w:t>
+      </w:r>
+      <w:proofErr w:type="spellStart"/>
+      <w:r>
+        <w:t>other_contact_name</w:t>
+      </w:r>
+      <w:proofErr w:type="spellEnd"/>
+      <w:r>
+        <w:t>}}, at {{</w:t>
+      </w:r>
+      <w:proofErr w:type="spellStart"/>
+      <w:r>
+        <w:t>other_contact_phone</w:t>
+      </w:r>
+      <w:proofErr w:type="spellEnd"/>
+      <w:r>
+        <w:t xml:space="preserve">}}.{{END-IF}} </w:t>
+      </w:r>
+      <w:r>
+        <w:rPr>
+          <w:color w:val="0070C0"/>
+        </w:rPr>
+        <w:t>You may also call the NIH Clinical Center Patient Representative at 301-496-2626, or the NIH Office of IRB Operations at 301-402-3713 if you have a research-related complaint or concern.</w:t>
       </w:r>
     </w:p>
     <w:p>
@@ -3974,8 +5443,14 @@
     <w:p>
       <w:pPr>
         <w:jc w:val="left"/>
-      </w:pPr>
-      <w:r>
+        <w:rPr>
+          <w:color w:val="0070C0"/>
+        </w:rPr>
+      </w:pPr>
+      <w:r>
+        <w:rPr>
+          <w:color w:val="0070C0"/>
+        </w:rPr>
         <w:t>Please keep a copy of this document in case you want to read it again.</w:t>
       </w:r>
     </w:p>
@@ -4043,7 +5518,6 @@
                 <w:bCs/>
                 <w:szCs w:val="24"/>
               </w:rPr>
-              <w:lastRenderedPageBreak/>
               <w:t xml:space="preserve">{{IF </w:t>
             </w:r>
             <w:r>
@@ -4051,7 +5525,39 @@
                 <w:bCs/>
                 <w:szCs w:val="24"/>
               </w:rPr>
-              <w:t>!(impaired_adults || parent_permission)}}</w:t>
+              <w:t>!(</w:t>
+            </w:r>
+            <w:proofErr w:type="spellStart"/>
+            <w:r>
+              <w:rPr>
+                <w:bCs/>
+                <w:szCs w:val="24"/>
+              </w:rPr>
+              <w:t>impaired_adults</w:t>
+            </w:r>
+            <w:proofErr w:type="spellEnd"/>
+            <w:r>
+              <w:rPr>
+                <w:bCs/>
+                <w:szCs w:val="24"/>
+              </w:rPr>
+              <w:t xml:space="preserve"> || </w:t>
+            </w:r>
+            <w:proofErr w:type="spellStart"/>
+            <w:r>
+              <w:rPr>
+                <w:bCs/>
+                <w:szCs w:val="24"/>
+              </w:rPr>
+              <w:t>parent_permission</w:t>
+            </w:r>
+            <w:proofErr w:type="spellEnd"/>
+            <w:r>
+              <w:rPr>
+                <w:bCs/>
+                <w:szCs w:val="24"/>
+              </w:rPr>
+              <w:t>)}}</w:t>
             </w:r>
           </w:p>
         </w:tc>
@@ -4325,7 +5831,23 @@
                 <w:bCs/>
                 <w:szCs w:val="24"/>
               </w:rPr>
-              <w:t>{{IF impaired_adults}}</w:t>
+              <w:t xml:space="preserve">{{IF </w:t>
+            </w:r>
+            <w:proofErr w:type="spellStart"/>
+            <w:r>
+              <w:rPr>
+                <w:bCs/>
+                <w:szCs w:val="24"/>
+              </w:rPr>
+              <w:t>impaired_adults</w:t>
+            </w:r>
+            <w:proofErr w:type="spellEnd"/>
+            <w:r>
+              <w:rPr>
+                <w:bCs/>
+                <w:szCs w:val="24"/>
+              </w:rPr>
+              <w:t>}}</w:t>
             </w:r>
           </w:p>
           <w:p>
@@ -4583,7 +6105,23 @@
                 <w:bCs/>
                 <w:szCs w:val="24"/>
               </w:rPr>
-              <w:t>{{IF parent_permission}}</w:t>
+              <w:t xml:space="preserve">{{IF </w:t>
+            </w:r>
+            <w:proofErr w:type="spellStart"/>
+            <w:r>
+              <w:rPr>
+                <w:bCs/>
+                <w:szCs w:val="24"/>
+              </w:rPr>
+              <w:t>parent_permission</w:t>
+            </w:r>
+            <w:proofErr w:type="spellEnd"/>
+            <w:r>
+              <w:rPr>
+                <w:bCs/>
+                <w:szCs w:val="24"/>
+              </w:rPr>
+              <w:t>}}</w:t>
             </w:r>
           </w:p>
         </w:tc>
@@ -9308,7 +10846,7 @@
     <w:autoRedefine/>
     <w:uiPriority w:val="9"/>
     <w:qFormat/>
-    <w:rsid w:val="001117F3"/>
+    <w:rsid w:val="009060D6"/>
     <w:pPr>
       <w:keepNext/>
       <w:keepLines/>
@@ -9320,6 +10858,7 @@
       <w:rFonts w:ascii="Times New Roman Bold" w:eastAsiaTheme="majorEastAsia" w:hAnsi="Times New Roman Bold"/>
       <w:b/>
       <w:caps/>
+      <w:color w:val="0070C0"/>
       <w:spacing w:val="-2"/>
       <w:szCs w:val="24"/>
     </w:rPr>
@@ -9895,11 +11434,12 @@
     <w:basedOn w:val="DefaultParagraphFont"/>
     <w:link w:val="Heading1"/>
     <w:uiPriority w:val="9"/>
-    <w:rsid w:val="001117F3"/>
+    <w:rsid w:val="009060D6"/>
     <w:rPr>
       <w:rFonts w:ascii="Times New Roman Bold" w:eastAsiaTheme="majorEastAsia" w:hAnsi="Times New Roman Bold" w:cs="Times New Roman"/>
       <w:b/>
       <w:caps/>
+      <w:color w:val="0070C0"/>
       <w:spacing w:val="-2"/>
       <w:sz w:val="24"/>
       <w:szCs w:val="24"/>
@@ -10415,17 +11955,22 @@
 </file>
 
 <file path=customXml/item1.xml><?xml version="1.0" encoding="utf-8"?>
+<b:Sources xmlns:b="http://schemas.openxmlformats.org/officeDocument/2006/bibliography" xmlns="http://schemas.openxmlformats.org/officeDocument/2006/bibliography" SelectedStyle="\APASixthEditionOfficeOnline.xsl" StyleName="APA" Version="6"/>
+</file>
+
+<file path=customXml/item2.xml><?xml version="1.0" encoding="utf-8"?>
 <p:properties xmlns:p="http://schemas.microsoft.com/office/2006/metadata/properties" xmlns:xsi="http://www.w3.org/2001/XMLSchema-instance" xmlns:pc="http://schemas.microsoft.com/office/infopath/2007/PartnerControls">
   <documentManagement/>
 </p:properties>
 </file>
 
-<file path=customXml/item2.xml><?xml version="1.0" encoding="utf-8"?>
-<b:Sources xmlns:b="http://schemas.openxmlformats.org/officeDocument/2006/bibliography" xmlns="http://schemas.openxmlformats.org/officeDocument/2006/bibliography" SelectedStyle="\APASixthEditionOfficeOnline.xsl" StyleName="APA" Version="6"/>
-</file>
-
 <file path=customXml/item3.xml><?xml version="1.0" encoding="utf-8"?>
-<b:Sources xmlns:b="http://schemas.openxmlformats.org/officeDocument/2006/bibliography" xmlns="http://schemas.openxmlformats.org/officeDocument/2006/bibliography" SelectedStyle="\APASixthEditionOfficeOnline.xsl" StyleName="APA" Version="6"/>
+<?mso-contentType ?>
+<FormTemplates xmlns="http://schemas.microsoft.com/sharepoint/v3/contenttype/forms">
+  <Display>DocumentLibraryForm</Display>
+  <Edit>DocumentLibraryForm</Edit>
+  <New>DocumentLibraryForm</New>
+</FormTemplates>
 </file>
 
 <file path=customXml/item4.xml><?xml version="1.0" encoding="utf-8"?>
@@ -10573,15 +12118,18 @@
 </file>
 
 <file path=customXml/item5.xml><?xml version="1.0" encoding="utf-8"?>
-<?mso-contentType ?>
-<FormTemplates xmlns="http://schemas.microsoft.com/sharepoint/v3/contenttype/forms">
-  <Display>DocumentLibraryForm</Display>
-  <Edit>DocumentLibraryForm</Edit>
-  <New>DocumentLibraryForm</New>
-</FormTemplates>
+<b:Sources xmlns:b="http://schemas.openxmlformats.org/officeDocument/2006/bibliography" xmlns="http://schemas.openxmlformats.org/officeDocument/2006/bibliography" SelectedStyle="\APASixthEditionOfficeOnline.xsl" StyleName="APA" Version="6"/>
 </file>
 
 <file path=customXml/itemProps1.xml><?xml version="1.0" encoding="utf-8"?>
+<ds:datastoreItem xmlns:ds="http://schemas.openxmlformats.org/officeDocument/2006/customXml" ds:itemID="{B1B4D5E5-C99B-4A90-9ECB-A1E77D8A9FF5}">
+  <ds:schemaRefs>
+    <ds:schemaRef ds:uri="http://schemas.openxmlformats.org/officeDocument/2006/bibliography"/>
+  </ds:schemaRefs>
+</ds:datastoreItem>
+</file>
+
+<file path=customXml/itemProps2.xml><?xml version="1.0" encoding="utf-8"?>
 <ds:datastoreItem xmlns:ds="http://schemas.openxmlformats.org/officeDocument/2006/customXml" ds:itemID="{6F5DD42D-7D19-459A-8B97-FC9CC664C713}">
   <ds:schemaRefs>
     <ds:schemaRef ds:uri="http://schemas.microsoft.com/office/2006/metadata/properties"/>
@@ -10590,18 +12138,10 @@
 </ds:datastoreItem>
 </file>
 
-<file path=customXml/itemProps2.xml><?xml version="1.0" encoding="utf-8"?>
-<ds:datastoreItem xmlns:ds="http://schemas.openxmlformats.org/officeDocument/2006/customXml" ds:itemID="{B1B4D5E5-C99B-4A90-9ECB-A1E77D8A9FF5}">
+<file path=customXml/itemProps3.xml><?xml version="1.0" encoding="utf-8"?>
+<ds:datastoreItem xmlns:ds="http://schemas.openxmlformats.org/officeDocument/2006/customXml" ds:itemID="{D85C4CB9-286F-40ED-A3CD-E8D4D7E0177A}">
   <ds:schemaRefs>
-    <ds:schemaRef ds:uri="http://schemas.openxmlformats.org/officeDocument/2006/bibliography"/>
-  </ds:schemaRefs>
-</ds:datastoreItem>
-</file>
-
-<file path=customXml/itemProps3.xml><?xml version="1.0" encoding="utf-8"?>
-<ds:datastoreItem xmlns:ds="http://schemas.openxmlformats.org/officeDocument/2006/customXml" ds:itemID="{FA5870B6-1FE5-43BB-95BF-EFDDA930C5ED}">
-  <ds:schemaRefs>
-    <ds:schemaRef ds:uri="http://schemas.openxmlformats.org/officeDocument/2006/bibliography"/>
+    <ds:schemaRef ds:uri="http://schemas.microsoft.com/sharepoint/v3/contenttype/forms"/>
   </ds:schemaRefs>
 </ds:datastoreItem>
 </file>
@@ -10625,9 +12165,9 @@
 </file>
 
 <file path=customXml/itemProps5.xml><?xml version="1.0" encoding="utf-8"?>
-<ds:datastoreItem xmlns:ds="http://schemas.openxmlformats.org/officeDocument/2006/customXml" ds:itemID="{D85C4CB9-286F-40ED-A3CD-E8D4D7E0177A}">
+<ds:datastoreItem xmlns:ds="http://schemas.openxmlformats.org/officeDocument/2006/customXml" ds:itemID="{FA5870B6-1FE5-43BB-95BF-EFDDA930C5ED}">
   <ds:schemaRefs>
-    <ds:schemaRef ds:uri="http://schemas.microsoft.com/sharepoint/v3/contenttype/forms"/>
+    <ds:schemaRef ds:uri="http://schemas.openxmlformats.org/officeDocument/2006/bibliography"/>
   </ds:schemaRefs>
 </ds:datastoreItem>
 </file>

</xml_diff>

<commit_message>
Fix LAR layout bug
</commit_message>
<xml_diff>
--- a/client/templates/nih-cc/template-v14-final.docx
+++ b/client/templates/nih-cc/template-v14-final.docx
@@ -5826,9 +5826,28 @@
               </w:rPr>
               <w:t>{{END-IF}}</w:t>
             </w:r>
-            <w:r>
+          </w:p>
+        </w:tc>
+      </w:tr>
+      <w:tr>
+        <w:tc>
+          <w:tcPr>
+            <w:tcW w:w="10790" w:type="dxa"/>
+            <w:gridSpan w:val="5"/>
+          </w:tcPr>
+          <w:p>
+            <w:pPr>
+              <w:spacing w:before="0" w:after="0"/>
+              <w:jc w:val="left"/>
               <w:rPr>
                 <w:bCs/>
+                <w:spacing w:val="-20"/>
+                <w:szCs w:val="24"/>
+              </w:rPr>
+            </w:pPr>
+            <w:r>
+              <w:rPr>
+                <w:bCs/>
                 <w:szCs w:val="24"/>
               </w:rPr>
               <w:t xml:space="preserve">{{IF </w:t>
@@ -5850,6 +5869,14 @@
               <w:t>}}</w:t>
             </w:r>
           </w:p>
+        </w:tc>
+      </w:tr>
+      <w:tr>
+        <w:tc>
+          <w:tcPr>
+            <w:tcW w:w="10790" w:type="dxa"/>
+            <w:gridSpan w:val="5"/>
+          </w:tcPr>
           <w:p>
             <w:pPr>
               <w:spacing w:before="0" w:after="0"/>
@@ -6100,6 +6127,25 @@
             <w:r>
               <w:t>{{END-IF}}</w:t>
             </w:r>
+          </w:p>
+        </w:tc>
+      </w:tr>
+      <w:tr>
+        <w:tc>
+          <w:tcPr>
+            <w:tcW w:w="10790" w:type="dxa"/>
+            <w:gridSpan w:val="5"/>
+          </w:tcPr>
+          <w:p>
+            <w:pPr>
+              <w:spacing w:before="0" w:after="0"/>
+              <w:jc w:val="left"/>
+              <w:rPr>
+                <w:bCs/>
+                <w:spacing w:val="-20"/>
+                <w:szCs w:val="24"/>
+              </w:rPr>
+            </w:pPr>
             <w:r>
               <w:rPr>
                 <w:bCs/>

</xml_diff>